<commit_message>
Se modificaron diagramas de la documentacion.Se implemento un observador en frmPerfil para actualizar la vista de permisos
</commit_message>
<xml_diff>
--- a/Documentación/Carpeta Trabajo Practico Integrador Nicolás Alcalá.docx
+++ b/Documentación/Carpeta Trabajo Practico Integrador Nicolás Alcalá.docx
@@ -537,7 +537,7 @@
           <w:r>
             <w:fldChar w:fldCharType="separate"/>
           </w:r>
-          <w:hyperlink w:anchor="_Toc231747888" w:history="1">
+          <w:hyperlink w:anchor="_Toc231946110" w:history="1">
             <w:r>
               <w:rPr>
                 <w:rStyle w:val="Hipervnculo"/>
@@ -565,7 +565,7 @@
                 <w:noProof/>
                 <w:webHidden/>
               </w:rPr>
-              <w:instrText xml:space="preserve"> PAGEREF _Toc231747888 \h </w:instrText>
+              <w:instrText xml:space="preserve"> PAGEREF _Toc231946110 \h </w:instrText>
             </w:r>
             <w:r>
               <w:rPr>
@@ -612,7 +612,7 @@
               <w14:ligatures w14:val="standardContextual"/>
             </w:rPr>
           </w:pPr>
-          <w:hyperlink w:anchor="_Toc231747889" w:history="1">
+          <w:hyperlink w:anchor="_Toc231946111" w:history="1">
             <w:r>
               <w:rPr>
                 <w:rStyle w:val="Hipervnculo"/>
@@ -639,7 +639,7 @@
                 <w:noProof/>
                 <w:webHidden/>
               </w:rPr>
-              <w:instrText xml:space="preserve"> PAGEREF _Toc231747889 \h </w:instrText>
+              <w:instrText xml:space="preserve"> PAGEREF _Toc231946111 \h </w:instrText>
             </w:r>
             <w:r>
               <w:rPr>
@@ -686,7 +686,7 @@
               <w14:ligatures w14:val="standardContextual"/>
             </w:rPr>
           </w:pPr>
-          <w:hyperlink w:anchor="_Toc231747890" w:history="1">
+          <w:hyperlink w:anchor="_Toc231946112" w:history="1">
             <w:r>
               <w:rPr>
                 <w:rStyle w:val="Hipervnculo"/>
@@ -713,7 +713,7 @@
                 <w:noProof/>
                 <w:webHidden/>
               </w:rPr>
-              <w:instrText xml:space="preserve"> PAGEREF _Toc231747890 \h </w:instrText>
+              <w:instrText xml:space="preserve"> PAGEREF _Toc231946112 \h </w:instrText>
             </w:r>
             <w:r>
               <w:rPr>
@@ -760,7 +760,7 @@
               <w14:ligatures w14:val="standardContextual"/>
             </w:rPr>
           </w:pPr>
-          <w:hyperlink w:anchor="_Toc231747891" w:history="1">
+          <w:hyperlink w:anchor="_Toc231946113" w:history="1">
             <w:r>
               <w:rPr>
                 <w:rStyle w:val="Hipervnculo"/>
@@ -788,7 +788,7 @@
                 <w:noProof/>
                 <w:webHidden/>
               </w:rPr>
-              <w:instrText xml:space="preserve"> PAGEREF _Toc231747891 \h </w:instrText>
+              <w:instrText xml:space="preserve"> PAGEREF _Toc231946113 \h </w:instrText>
             </w:r>
             <w:r>
               <w:rPr>
@@ -835,7 +835,7 @@
               <w14:ligatures w14:val="standardContextual"/>
             </w:rPr>
           </w:pPr>
-          <w:hyperlink w:anchor="_Toc231747892" w:history="1">
+          <w:hyperlink w:anchor="_Toc231946114" w:history="1">
             <w:r>
               <w:rPr>
                 <w:rStyle w:val="Hipervnculo"/>
@@ -863,7 +863,7 @@
                 <w:noProof/>
                 <w:webHidden/>
               </w:rPr>
-              <w:instrText xml:space="preserve"> PAGEREF _Toc231747892 \h </w:instrText>
+              <w:instrText xml:space="preserve"> PAGEREF _Toc231946114 \h </w:instrText>
             </w:r>
             <w:r>
               <w:rPr>
@@ -910,7 +910,7 @@
               <w14:ligatures w14:val="standardContextual"/>
             </w:rPr>
           </w:pPr>
-          <w:hyperlink w:anchor="_Toc231747893" w:history="1">
+          <w:hyperlink w:anchor="_Toc231946115" w:history="1">
             <w:r>
               <w:rPr>
                 <w:rStyle w:val="Hipervnculo"/>
@@ -938,7 +938,7 @@
                 <w:noProof/>
                 <w:webHidden/>
               </w:rPr>
-              <w:instrText xml:space="preserve"> PAGEREF _Toc231747893 \h </w:instrText>
+              <w:instrText xml:space="preserve"> PAGEREF _Toc231946115 \h </w:instrText>
             </w:r>
             <w:r>
               <w:rPr>
@@ -985,7 +985,7 @@
               <w14:ligatures w14:val="standardContextual"/>
             </w:rPr>
           </w:pPr>
-          <w:hyperlink w:anchor="_Toc231747894" w:history="1">
+          <w:hyperlink w:anchor="_Toc231946116" w:history="1">
             <w:r>
               <w:rPr>
                 <w:rStyle w:val="Hipervnculo"/>
@@ -1012,7 +1012,7 @@
                 <w:noProof/>
                 <w:webHidden/>
               </w:rPr>
-              <w:instrText xml:space="preserve"> PAGEREF _Toc231747894 \h </w:instrText>
+              <w:instrText xml:space="preserve"> PAGEREF _Toc231946116 \h </w:instrText>
             </w:r>
             <w:r>
               <w:rPr>
@@ -1059,7 +1059,7 @@
               <w14:ligatures w14:val="standardContextual"/>
             </w:rPr>
           </w:pPr>
-          <w:hyperlink w:anchor="_Toc231747895" w:history="1">
+          <w:hyperlink w:anchor="_Toc231946117" w:history="1">
             <w:r>
               <w:rPr>
                 <w:rStyle w:val="Hipervnculo"/>
@@ -1087,7 +1087,7 @@
                 <w:noProof/>
                 <w:webHidden/>
               </w:rPr>
-              <w:instrText xml:space="preserve"> PAGEREF _Toc231747895 \h </w:instrText>
+              <w:instrText xml:space="preserve"> PAGEREF _Toc231946117 \h </w:instrText>
             </w:r>
             <w:r>
               <w:rPr>
@@ -1134,7 +1134,7 @@
               <w14:ligatures w14:val="standardContextual"/>
             </w:rPr>
           </w:pPr>
-          <w:hyperlink w:anchor="_Toc231747896" w:history="1">
+          <w:hyperlink w:anchor="_Toc231946118" w:history="1">
             <w:r>
               <w:rPr>
                 <w:rStyle w:val="Hipervnculo"/>
@@ -1161,7 +1161,7 @@
                 <w:noProof/>
                 <w:webHidden/>
               </w:rPr>
-              <w:instrText xml:space="preserve"> PAGEREF _Toc231747896 \h </w:instrText>
+              <w:instrText xml:space="preserve"> PAGEREF _Toc231946118 \h </w:instrText>
             </w:r>
             <w:r>
               <w:rPr>
@@ -1208,7 +1208,7 @@
               <w14:ligatures w14:val="standardContextual"/>
             </w:rPr>
           </w:pPr>
-          <w:hyperlink w:anchor="_Toc231747897" w:history="1">
+          <w:hyperlink w:anchor="_Toc231946119" w:history="1">
             <w:r>
               <w:rPr>
                 <w:rStyle w:val="Hipervnculo"/>
@@ -1236,7 +1236,7 @@
                 <w:noProof/>
                 <w:webHidden/>
               </w:rPr>
-              <w:instrText xml:space="preserve"> PAGEREF _Toc231747897 \h </w:instrText>
+              <w:instrText xml:space="preserve"> PAGEREF _Toc231946119 \h </w:instrText>
             </w:r>
             <w:r>
               <w:rPr>
@@ -1283,7 +1283,7 @@
               <w14:ligatures w14:val="standardContextual"/>
             </w:rPr>
           </w:pPr>
-          <w:hyperlink w:anchor="_Toc231747898" w:history="1">
+          <w:hyperlink w:anchor="_Toc231946120" w:history="1">
             <w:r>
               <w:rPr>
                 <w:rStyle w:val="Hipervnculo"/>
@@ -1311,7 +1311,7 @@
                 <w:noProof/>
                 <w:webHidden/>
               </w:rPr>
-              <w:instrText xml:space="preserve"> PAGEREF _Toc231747898 \h </w:instrText>
+              <w:instrText xml:space="preserve"> PAGEREF _Toc231946120 \h </w:instrText>
             </w:r>
             <w:r>
               <w:rPr>
@@ -1358,7 +1358,7 @@
               <w14:ligatures w14:val="standardContextual"/>
             </w:rPr>
           </w:pPr>
-          <w:hyperlink w:anchor="_Toc231747899" w:history="1">
+          <w:hyperlink w:anchor="_Toc231946121" w:history="1">
             <w:r>
               <w:rPr>
                 <w:rStyle w:val="Hipervnculo"/>
@@ -1386,7 +1386,7 @@
                 <w:noProof/>
                 <w:webHidden/>
               </w:rPr>
-              <w:instrText xml:space="preserve"> PAGEREF _Toc231747899 \h </w:instrText>
+              <w:instrText xml:space="preserve"> PAGEREF _Toc231946121 \h </w:instrText>
             </w:r>
             <w:r>
               <w:rPr>
@@ -1433,7 +1433,7 @@
               <w14:ligatures w14:val="standardContextual"/>
             </w:rPr>
           </w:pPr>
-          <w:hyperlink w:anchor="_Toc231747900" w:history="1">
+          <w:hyperlink w:anchor="_Toc231946122" w:history="1">
             <w:r>
               <w:rPr>
                 <w:rStyle w:val="Hipervnculo"/>
@@ -1461,7 +1461,7 @@
                 <w:noProof/>
                 <w:webHidden/>
               </w:rPr>
-              <w:instrText xml:space="preserve"> PAGEREF _Toc231747900 \h </w:instrText>
+              <w:instrText xml:space="preserve"> PAGEREF _Toc231946122 \h </w:instrText>
             </w:r>
             <w:r>
               <w:rPr>
@@ -1508,7 +1508,7 @@
               <w14:ligatures w14:val="standardContextual"/>
             </w:rPr>
           </w:pPr>
-          <w:hyperlink w:anchor="_Toc231747901" w:history="1">
+          <w:hyperlink w:anchor="_Toc231946123" w:history="1">
             <w:r>
               <w:rPr>
                 <w:rStyle w:val="Hipervnculo"/>
@@ -1535,7 +1535,7 @@
                 <w:noProof/>
                 <w:webHidden/>
               </w:rPr>
-              <w:instrText xml:space="preserve"> PAGEREF _Toc231747901 \h </w:instrText>
+              <w:instrText xml:space="preserve"> PAGEREF _Toc231946123 \h </w:instrText>
             </w:r>
             <w:r>
               <w:rPr>
@@ -1582,7 +1582,7 @@
               <w14:ligatures w14:val="standardContextual"/>
             </w:rPr>
           </w:pPr>
-          <w:hyperlink w:anchor="_Toc231747902" w:history="1">
+          <w:hyperlink w:anchor="_Toc231946124" w:history="1">
             <w:r>
               <w:rPr>
                 <w:rStyle w:val="Hipervnculo"/>
@@ -1610,7 +1610,7 @@
                 <w:noProof/>
                 <w:webHidden/>
               </w:rPr>
-              <w:instrText xml:space="preserve"> PAGEREF _Toc231747902 \h </w:instrText>
+              <w:instrText xml:space="preserve"> PAGEREF _Toc231946124 \h </w:instrText>
             </w:r>
             <w:r>
               <w:rPr>
@@ -1657,7 +1657,7 @@
               <w14:ligatures w14:val="standardContextual"/>
             </w:rPr>
           </w:pPr>
-          <w:hyperlink w:anchor="_Toc231747903" w:history="1">
+          <w:hyperlink w:anchor="_Toc231946125" w:history="1">
             <w:r>
               <w:rPr>
                 <w:rStyle w:val="Hipervnculo"/>
@@ -1685,7 +1685,7 @@
                 <w:noProof/>
                 <w:webHidden/>
               </w:rPr>
-              <w:instrText xml:space="preserve"> PAGEREF _Toc231747903 \h </w:instrText>
+              <w:instrText xml:space="preserve"> PAGEREF _Toc231946125 \h </w:instrText>
             </w:r>
             <w:r>
               <w:rPr>
@@ -1732,7 +1732,7 @@
               <w14:ligatures w14:val="standardContextual"/>
             </w:rPr>
           </w:pPr>
-          <w:hyperlink w:anchor="_Toc231747904" w:history="1">
+          <w:hyperlink w:anchor="_Toc231946126" w:history="1">
             <w:r>
               <w:rPr>
                 <w:rStyle w:val="Hipervnculo"/>
@@ -1759,7 +1759,7 @@
                 <w:noProof/>
                 <w:webHidden/>
               </w:rPr>
-              <w:instrText xml:space="preserve"> PAGEREF _Toc231747904 \h </w:instrText>
+              <w:instrText xml:space="preserve"> PAGEREF _Toc231946126 \h </w:instrText>
             </w:r>
             <w:r>
               <w:rPr>
@@ -1806,7 +1806,7 @@
               <w14:ligatures w14:val="standardContextual"/>
             </w:rPr>
           </w:pPr>
-          <w:hyperlink w:anchor="_Toc231747905" w:history="1">
+          <w:hyperlink w:anchor="_Toc231946127" w:history="1">
             <w:r>
               <w:rPr>
                 <w:rStyle w:val="Hipervnculo"/>
@@ -1833,7 +1833,7 @@
                 <w:noProof/>
                 <w:webHidden/>
               </w:rPr>
-              <w:instrText xml:space="preserve"> PAGEREF _Toc231747905 \h </w:instrText>
+              <w:instrText xml:space="preserve"> PAGEREF _Toc231946127 \h </w:instrText>
             </w:r>
             <w:r>
               <w:rPr>
@@ -1880,7 +1880,7 @@
               <w14:ligatures w14:val="standardContextual"/>
             </w:rPr>
           </w:pPr>
-          <w:hyperlink w:anchor="_Toc231747906" w:history="1">
+          <w:hyperlink w:anchor="_Toc231946128" w:history="1">
             <w:r>
               <w:rPr>
                 <w:rStyle w:val="Hipervnculo"/>
@@ -1908,7 +1908,7 @@
                 <w:noProof/>
                 <w:webHidden/>
               </w:rPr>
-              <w:instrText xml:space="preserve"> PAGEREF _Toc231747906 \h </w:instrText>
+              <w:instrText xml:space="preserve"> PAGEREF _Toc231946128 \h </w:instrText>
             </w:r>
             <w:r>
               <w:rPr>
@@ -1955,7 +1955,7 @@
               <w14:ligatures w14:val="standardContextual"/>
             </w:rPr>
           </w:pPr>
-          <w:hyperlink w:anchor="_Toc231747907" w:history="1">
+          <w:hyperlink w:anchor="_Toc231946129" w:history="1">
             <w:r>
               <w:rPr>
                 <w:rStyle w:val="Hipervnculo"/>
@@ -1983,7 +1983,7 @@
                 <w:noProof/>
                 <w:webHidden/>
               </w:rPr>
-              <w:instrText xml:space="preserve"> PAGEREF _Toc231747907 \h </w:instrText>
+              <w:instrText xml:space="preserve"> PAGEREF _Toc231946129 \h </w:instrText>
             </w:r>
             <w:r>
               <w:rPr>
@@ -2030,7 +2030,7 @@
               <w14:ligatures w14:val="standardContextual"/>
             </w:rPr>
           </w:pPr>
-          <w:hyperlink w:anchor="_Toc231747908" w:history="1">
+          <w:hyperlink w:anchor="_Toc231946130" w:history="1">
             <w:r>
               <w:rPr>
                 <w:rStyle w:val="Hipervnculo"/>
@@ -2058,7 +2058,7 @@
                 <w:noProof/>
                 <w:webHidden/>
               </w:rPr>
-              <w:instrText xml:space="preserve"> PAGEREF _Toc231747908 \h </w:instrText>
+              <w:instrText xml:space="preserve"> PAGEREF _Toc231946130 \h </w:instrText>
             </w:r>
             <w:r>
               <w:rPr>
@@ -2105,7 +2105,7 @@
               <w14:ligatures w14:val="standardContextual"/>
             </w:rPr>
           </w:pPr>
-          <w:hyperlink w:anchor="_Toc231747909" w:history="1">
+          <w:hyperlink w:anchor="_Toc231946131" w:history="1">
             <w:r>
               <w:rPr>
                 <w:rStyle w:val="Hipervnculo"/>
@@ -2132,7 +2132,7 @@
                 <w:noProof/>
                 <w:webHidden/>
               </w:rPr>
-              <w:instrText xml:space="preserve"> PAGEREF _Toc231747909 \h </w:instrText>
+              <w:instrText xml:space="preserve"> PAGEREF _Toc231946131 \h </w:instrText>
             </w:r>
             <w:r>
               <w:rPr>
@@ -2179,7 +2179,7 @@
               <w14:ligatures w14:val="standardContextual"/>
             </w:rPr>
           </w:pPr>
-          <w:hyperlink w:anchor="_Toc231747910" w:history="1">
+          <w:hyperlink w:anchor="_Toc231946132" w:history="1">
             <w:r>
               <w:rPr>
                 <w:rStyle w:val="Hipervnculo"/>
@@ -2206,7 +2206,7 @@
                 <w:noProof/>
                 <w:webHidden/>
               </w:rPr>
-              <w:instrText xml:space="preserve"> PAGEREF _Toc231747910 \h </w:instrText>
+              <w:instrText xml:space="preserve"> PAGEREF _Toc231946132 \h </w:instrText>
             </w:r>
             <w:r>
               <w:rPr>
@@ -2253,7 +2253,7 @@
               <w14:ligatures w14:val="standardContextual"/>
             </w:rPr>
           </w:pPr>
-          <w:hyperlink w:anchor="_Toc231747911" w:history="1">
+          <w:hyperlink w:anchor="_Toc231946133" w:history="1">
             <w:r>
               <w:rPr>
                 <w:rStyle w:val="Hipervnculo"/>
@@ -2280,7 +2280,7 @@
                 <w:noProof/>
                 <w:webHidden/>
               </w:rPr>
-              <w:instrText xml:space="preserve"> PAGEREF _Toc231747911 \h </w:instrText>
+              <w:instrText xml:space="preserve"> PAGEREF _Toc231946133 \h </w:instrText>
             </w:r>
             <w:r>
               <w:rPr>
@@ -2300,7 +2300,7 @@
                 <w:noProof/>
                 <w:webHidden/>
               </w:rPr>
-              <w:t>41</w:t>
+              <w:t>40</w:t>
             </w:r>
             <w:r>
               <w:rPr>
@@ -2327,7 +2327,7 @@
               <w14:ligatures w14:val="standardContextual"/>
             </w:rPr>
           </w:pPr>
-          <w:hyperlink w:anchor="_Toc231747912" w:history="1">
+          <w:hyperlink w:anchor="_Toc231946134" w:history="1">
             <w:r>
               <w:rPr>
                 <w:rStyle w:val="Hipervnculo"/>
@@ -2355,7 +2355,7 @@
                 <w:noProof/>
                 <w:webHidden/>
               </w:rPr>
-              <w:instrText xml:space="preserve"> PAGEREF _Toc231747912 \h </w:instrText>
+              <w:instrText xml:space="preserve"> PAGEREF _Toc231946134 \h </w:instrText>
             </w:r>
             <w:r>
               <w:rPr>
@@ -2375,7 +2375,7 @@
                 <w:noProof/>
                 <w:webHidden/>
               </w:rPr>
-              <w:t>41</w:t>
+              <w:t>40</w:t>
             </w:r>
             <w:r>
               <w:rPr>
@@ -2402,7 +2402,7 @@
               <w14:ligatures w14:val="standardContextual"/>
             </w:rPr>
           </w:pPr>
-          <w:hyperlink w:anchor="_Toc231747913" w:history="1">
+          <w:hyperlink w:anchor="_Toc231946135" w:history="1">
             <w:r>
               <w:rPr>
                 <w:rStyle w:val="Hipervnculo"/>
@@ -2430,7 +2430,7 @@
                 <w:noProof/>
                 <w:webHidden/>
               </w:rPr>
-              <w:instrText xml:space="preserve"> PAGEREF _Toc231747913 \h </w:instrText>
+              <w:instrText xml:space="preserve"> PAGEREF _Toc231946135 \h </w:instrText>
             </w:r>
             <w:r>
               <w:rPr>
@@ -2450,7 +2450,7 @@
                 <w:noProof/>
                 <w:webHidden/>
               </w:rPr>
-              <w:t>41</w:t>
+              <w:t>40</w:t>
             </w:r>
             <w:r>
               <w:rPr>
@@ -2477,7 +2477,7 @@
               <w14:ligatures w14:val="standardContextual"/>
             </w:rPr>
           </w:pPr>
-          <w:hyperlink w:anchor="_Toc231747914" w:history="1">
+          <w:hyperlink w:anchor="_Toc231946136" w:history="1">
             <w:r>
               <w:rPr>
                 <w:rStyle w:val="Hipervnculo"/>
@@ -2505,7 +2505,7 @@
                 <w:noProof/>
                 <w:webHidden/>
               </w:rPr>
-              <w:instrText xml:space="preserve"> PAGEREF _Toc231747914 \h </w:instrText>
+              <w:instrText xml:space="preserve"> PAGEREF _Toc231946136 \h </w:instrText>
             </w:r>
             <w:r>
               <w:rPr>
@@ -2552,7 +2552,7 @@
               <w14:ligatures w14:val="standardContextual"/>
             </w:rPr>
           </w:pPr>
-          <w:hyperlink w:anchor="_Toc231747915" w:history="1">
+          <w:hyperlink w:anchor="_Toc231946137" w:history="1">
             <w:r>
               <w:rPr>
                 <w:rStyle w:val="Hipervnculo"/>
@@ -2579,7 +2579,7 @@
                 <w:noProof/>
                 <w:webHidden/>
               </w:rPr>
-              <w:instrText xml:space="preserve"> PAGEREF _Toc231747915 \h </w:instrText>
+              <w:instrText xml:space="preserve"> PAGEREF _Toc231946137 \h </w:instrText>
             </w:r>
             <w:r>
               <w:rPr>
@@ -2626,7 +2626,7 @@
               <w14:ligatures w14:val="standardContextual"/>
             </w:rPr>
           </w:pPr>
-          <w:hyperlink w:anchor="_Toc231747916" w:history="1">
+          <w:hyperlink w:anchor="_Toc231946138" w:history="1">
             <w:r>
               <w:rPr>
                 <w:rStyle w:val="Hipervnculo"/>
@@ -2653,7 +2653,7 @@
                 <w:noProof/>
                 <w:webHidden/>
               </w:rPr>
-              <w:instrText xml:space="preserve"> PAGEREF _Toc231747916 \h </w:instrText>
+              <w:instrText xml:space="preserve"> PAGEREF _Toc231946138 \h </w:instrText>
             </w:r>
             <w:r>
               <w:rPr>
@@ -2700,7 +2700,7 @@
               <w14:ligatures w14:val="standardContextual"/>
             </w:rPr>
           </w:pPr>
-          <w:hyperlink w:anchor="_Toc231747917" w:history="1">
+          <w:hyperlink w:anchor="_Toc231946139" w:history="1">
             <w:r>
               <w:rPr>
                 <w:rStyle w:val="Hipervnculo"/>
@@ -2727,7 +2727,7 @@
                 <w:noProof/>
                 <w:webHidden/>
               </w:rPr>
-              <w:instrText xml:space="preserve"> PAGEREF _Toc231747917 \h </w:instrText>
+              <w:instrText xml:space="preserve"> PAGEREF _Toc231946139 \h </w:instrText>
             </w:r>
             <w:r>
               <w:rPr>
@@ -2774,7 +2774,7 @@
               <w14:ligatures w14:val="standardContextual"/>
             </w:rPr>
           </w:pPr>
-          <w:hyperlink w:anchor="_Toc231747918" w:history="1">
+          <w:hyperlink w:anchor="_Toc231946140" w:history="1">
             <w:r>
               <w:rPr>
                 <w:rStyle w:val="Hipervnculo"/>
@@ -2801,7 +2801,7 @@
                 <w:noProof/>
                 <w:webHidden/>
               </w:rPr>
-              <w:instrText xml:space="preserve"> PAGEREF _Toc231747918 \h </w:instrText>
+              <w:instrText xml:space="preserve"> PAGEREF _Toc231946140 \h </w:instrText>
             </w:r>
             <w:r>
               <w:rPr>
@@ -2848,7 +2848,7 @@
               <w14:ligatures w14:val="standardContextual"/>
             </w:rPr>
           </w:pPr>
-          <w:hyperlink w:anchor="_Toc231747919" w:history="1">
+          <w:hyperlink w:anchor="_Toc231946141" w:history="1">
             <w:r>
               <w:rPr>
                 <w:rStyle w:val="Hipervnculo"/>
@@ -2876,7 +2876,7 @@
                 <w:noProof/>
                 <w:webHidden/>
               </w:rPr>
-              <w:instrText xml:space="preserve"> PAGEREF _Toc231747919 \h </w:instrText>
+              <w:instrText xml:space="preserve"> PAGEREF _Toc231946141 \h </w:instrText>
             </w:r>
             <w:r>
               <w:rPr>
@@ -2923,7 +2923,7 @@
               <w14:ligatures w14:val="standardContextual"/>
             </w:rPr>
           </w:pPr>
-          <w:hyperlink w:anchor="_Toc231747920" w:history="1">
+          <w:hyperlink w:anchor="_Toc231946142" w:history="1">
             <w:r>
               <w:rPr>
                 <w:rStyle w:val="Hipervnculo"/>
@@ -2950,7 +2950,7 @@
                 <w:noProof/>
                 <w:webHidden/>
               </w:rPr>
-              <w:instrText xml:space="preserve"> PAGEREF _Toc231747920 \h </w:instrText>
+              <w:instrText xml:space="preserve"> PAGEREF _Toc231946142 \h </w:instrText>
             </w:r>
             <w:r>
               <w:rPr>
@@ -2997,7 +2997,7 @@
               <w14:ligatures w14:val="standardContextual"/>
             </w:rPr>
           </w:pPr>
-          <w:hyperlink w:anchor="_Toc231747921" w:history="1">
+          <w:hyperlink w:anchor="_Toc231946143" w:history="1">
             <w:r>
               <w:rPr>
                 <w:rStyle w:val="Hipervnculo"/>
@@ -3024,7 +3024,7 @@
                 <w:noProof/>
                 <w:webHidden/>
               </w:rPr>
-              <w:instrText xml:space="preserve"> PAGEREF _Toc231747921 \h </w:instrText>
+              <w:instrText xml:space="preserve"> PAGEREF _Toc231946143 \h </w:instrText>
             </w:r>
             <w:r>
               <w:rPr>
@@ -3045,6 +3045,154 @@
                 <w:webHidden/>
               </w:rPr>
               <w:t>53</w:t>
+            </w:r>
+            <w:r>
+              <w:rPr>
+                <w:noProof/>
+                <w:webHidden/>
+              </w:rPr>
+              <w:fldChar w:fldCharType="end"/>
+            </w:r>
+          </w:hyperlink>
+        </w:p>
+        <w:p>
+          <w:pPr>
+            <w:pStyle w:val="TDC3"/>
+            <w:tabs>
+              <w:tab w:val="right" w:leader="dot" w:pos="9061"/>
+            </w:tabs>
+            <w:rPr>
+              <w:rFonts w:eastAsiaTheme="minorEastAsia"/>
+              <w:noProof/>
+              <w:kern w:val="2"/>
+              <w:sz w:val="24"/>
+              <w:szCs w:val="24"/>
+              <w:lang w:eastAsia="es-AR"/>
+              <w14:ligatures w14:val="standardContextual"/>
+            </w:rPr>
+          </w:pPr>
+          <w:hyperlink w:anchor="_Toc231946144" w:history="1">
+            <w:r>
+              <w:rPr>
+                <w:rStyle w:val="Hipervnculo"/>
+                <w:noProof/>
+              </w:rPr>
+              <w:t>Diagrama Entidad Relación del sistema</w:t>
+            </w:r>
+            <w:r>
+              <w:rPr>
+                <w:noProof/>
+                <w:webHidden/>
+              </w:rPr>
+              <w:tab/>
+            </w:r>
+            <w:r>
+              <w:rPr>
+                <w:noProof/>
+                <w:webHidden/>
+              </w:rPr>
+              <w:fldChar w:fldCharType="begin"/>
+            </w:r>
+            <w:r>
+              <w:rPr>
+                <w:noProof/>
+                <w:webHidden/>
+              </w:rPr>
+              <w:instrText xml:space="preserve"> PAGEREF _Toc231946144 \h </w:instrText>
+            </w:r>
+            <w:r>
+              <w:rPr>
+                <w:noProof/>
+                <w:webHidden/>
+              </w:rPr>
+            </w:r>
+            <w:r>
+              <w:rPr>
+                <w:noProof/>
+                <w:webHidden/>
+              </w:rPr>
+              <w:fldChar w:fldCharType="separate"/>
+            </w:r>
+            <w:r>
+              <w:rPr>
+                <w:noProof/>
+                <w:webHidden/>
+              </w:rPr>
+              <w:t>54</w:t>
+            </w:r>
+            <w:r>
+              <w:rPr>
+                <w:noProof/>
+                <w:webHidden/>
+              </w:rPr>
+              <w:fldChar w:fldCharType="end"/>
+            </w:r>
+          </w:hyperlink>
+        </w:p>
+        <w:p>
+          <w:pPr>
+            <w:pStyle w:val="TDC3"/>
+            <w:tabs>
+              <w:tab w:val="right" w:leader="dot" w:pos="9061"/>
+            </w:tabs>
+            <w:rPr>
+              <w:rFonts w:eastAsiaTheme="minorEastAsia"/>
+              <w:noProof/>
+              <w:kern w:val="2"/>
+              <w:sz w:val="24"/>
+              <w:szCs w:val="24"/>
+              <w:lang w:eastAsia="es-AR"/>
+              <w14:ligatures w14:val="standardContextual"/>
+            </w:rPr>
+          </w:pPr>
+          <w:hyperlink w:anchor="_Toc231946145" w:history="1">
+            <w:r>
+              <w:rPr>
+                <w:rStyle w:val="Hipervnculo"/>
+                <w:noProof/>
+              </w:rPr>
+              <w:t>Modelo Relacional del sistema</w:t>
+            </w:r>
+            <w:r>
+              <w:rPr>
+                <w:noProof/>
+                <w:webHidden/>
+              </w:rPr>
+              <w:tab/>
+            </w:r>
+            <w:r>
+              <w:rPr>
+                <w:noProof/>
+                <w:webHidden/>
+              </w:rPr>
+              <w:fldChar w:fldCharType="begin"/>
+            </w:r>
+            <w:r>
+              <w:rPr>
+                <w:noProof/>
+                <w:webHidden/>
+              </w:rPr>
+              <w:instrText xml:space="preserve"> PAGEREF _Toc231946145 \h </w:instrText>
+            </w:r>
+            <w:r>
+              <w:rPr>
+                <w:noProof/>
+                <w:webHidden/>
+              </w:rPr>
+            </w:r>
+            <w:r>
+              <w:rPr>
+                <w:noProof/>
+                <w:webHidden/>
+              </w:rPr>
+              <w:fldChar w:fldCharType="separate"/>
+            </w:r>
+            <w:r>
+              <w:rPr>
+                <w:noProof/>
+                <w:webHidden/>
+              </w:rPr>
+              <w:t>55</w:t>
             </w:r>
             <w:r>
               <w:rPr>
@@ -3082,7 +3230,7 @@
           <w:lang w:val="es-ES"/>
         </w:rPr>
       </w:pPr>
-      <w:bookmarkStart w:id="0" w:name="_Toc231747888"/>
+      <w:bookmarkStart w:id="0" w:name="_Toc231946110"/>
       <w:r>
         <w:rPr>
           <w:lang w:val="es-ES"/>
@@ -3964,28 +4112,7 @@
                 <w:sz w:val="20"/>
                 <w:szCs w:val="20"/>
               </w:rPr>
-              <w:t xml:space="preserve">Se agrego la </w:t>
-            </w:r>
-            <w:r>
-              <w:rPr>
-                <w:sz w:val="20"/>
-                <w:szCs w:val="20"/>
-              </w:rPr>
-              <w:t>bitácora</w:t>
-            </w:r>
-            <w:r>
-              <w:rPr>
-                <w:sz w:val="20"/>
-                <w:szCs w:val="20"/>
-              </w:rPr>
-              <w:t xml:space="preserve">. En formulario y con </w:t>
-            </w:r>
-            <w:r>
-              <w:rPr>
-                <w:sz w:val="20"/>
-                <w:szCs w:val="20"/>
-              </w:rPr>
-              <w:t>traducción</w:t>
+              <w:t>Se agrego la bitácora. En formulario y con traducción</w:t>
             </w:r>
           </w:p>
         </w:tc>
@@ -4173,14 +4300,7 @@
                 <w:sz w:val="20"/>
                 <w:szCs w:val="20"/>
               </w:rPr>
-              <w:t>El</w:t>
-            </w:r>
-            <w:r>
-              <w:rPr>
-                <w:sz w:val="20"/>
-                <w:szCs w:val="20"/>
-              </w:rPr>
-              <w:t xml:space="preserve"> </w:t>
+              <w:t xml:space="preserve">El </w:t>
             </w:r>
             <w:proofErr w:type="spellStart"/>
             <w:r>
@@ -4196,21 +4316,7 @@
                 <w:sz w:val="20"/>
                 <w:szCs w:val="20"/>
               </w:rPr>
-              <w:t xml:space="preserve"> </w:t>
-            </w:r>
-            <w:r>
-              <w:rPr>
-                <w:sz w:val="20"/>
-                <w:szCs w:val="20"/>
-              </w:rPr>
-              <w:t>ahora es</w:t>
-            </w:r>
-            <w:r>
-              <w:rPr>
-                <w:sz w:val="20"/>
-                <w:szCs w:val="20"/>
-              </w:rPr>
-              <w:t xml:space="preserve"> MDI. Se agrego </w:t>
+              <w:t xml:space="preserve"> ahora es MDI. Se agrego </w:t>
             </w:r>
             <w:proofErr w:type="spellStart"/>
             <w:r>
@@ -4226,35 +4332,7 @@
                 <w:sz w:val="20"/>
                 <w:szCs w:val="20"/>
               </w:rPr>
-              <w:t xml:space="preserve"> de tags. A</w:t>
-            </w:r>
-            <w:r>
-              <w:rPr>
-                <w:sz w:val="20"/>
-                <w:szCs w:val="20"/>
-              </w:rPr>
-              <w:t xml:space="preserve"> </w:t>
-            </w:r>
-            <w:r>
-              <w:rPr>
-                <w:sz w:val="20"/>
-                <w:szCs w:val="20"/>
-              </w:rPr>
-              <w:t xml:space="preserve">los idiomas se les </w:t>
-            </w:r>
-            <w:r>
-              <w:rPr>
-                <w:sz w:val="20"/>
-                <w:szCs w:val="20"/>
-              </w:rPr>
-              <w:t xml:space="preserve">auto </w:t>
-            </w:r>
-            <w:r>
-              <w:rPr>
-                <w:sz w:val="20"/>
-                <w:szCs w:val="20"/>
-              </w:rPr>
-              <w:t xml:space="preserve">asigna </w:t>
+              <w:t xml:space="preserve"> de tags. A los idiomas se les auto asigna </w:t>
             </w:r>
             <w:proofErr w:type="gramStart"/>
             <w:r>
@@ -4466,45 +4544,38 @@
                 <w:sz w:val="18"/>
                 <w:szCs w:val="18"/>
               </w:rPr>
-              <w:t>P</w:t>
-            </w:r>
-            <w:r>
+              <w:t>Permisos compuestos formados por permisos compuestos</w:t>
+            </w:r>
+          </w:p>
+          <w:p>
+            <w:pPr>
+              <w:spacing w:line="276" w:lineRule="auto"/>
               <w:rPr>
                 <w:sz w:val="18"/>
                 <w:szCs w:val="18"/>
               </w:rPr>
-              <w:t>ermisos compuestos formados por permisos compuestos</w:t>
+            </w:pPr>
+            <w:r>
+              <w:rPr>
+                <w:sz w:val="18"/>
+                <w:szCs w:val="18"/>
+              </w:rPr>
+              <w:t>Asignar Permisos simples a usuarios</w:t>
             </w:r>
           </w:p>
           <w:p>
             <w:pPr>
               <w:spacing w:line="276" w:lineRule="auto"/>
               <w:rPr>
+                <w:sz w:val="20"/>
+                <w:szCs w:val="20"/>
+              </w:rPr>
+            </w:pPr>
+            <w:r>
+              <w:rPr>
                 <w:sz w:val="18"/>
                 <w:szCs w:val="18"/>
               </w:rPr>
-            </w:pPr>
-            <w:r>
-              <w:rPr>
-                <w:sz w:val="18"/>
-                <w:szCs w:val="18"/>
-              </w:rPr>
-              <w:t>Asignar Permisos simples a usuarios</w:t>
-            </w:r>
-          </w:p>
-          <w:p>
-            <w:pPr>
-              <w:spacing w:line="276" w:lineRule="auto"/>
-              <w:rPr>
-                <w:sz w:val="20"/>
-                <w:szCs w:val="20"/>
-              </w:rPr>
-            </w:pPr>
-            <w:r>
-              <w:rPr>
-                <w:sz w:val="18"/>
-                <w:szCs w:val="18"/>
-              </w:rPr>
               <w:t>Carpeta Documentación</w:t>
             </w:r>
           </w:p>
@@ -4515,7 +4586,7 @@
       <w:pPr>
         <w:pStyle w:val="Ttulo1"/>
       </w:pPr>
-      <w:bookmarkStart w:id="1" w:name="_Toc231747889"/>
+      <w:bookmarkStart w:id="1" w:name="_Toc231946111"/>
       <w:r>
         <w:lastRenderedPageBreak/>
         <w:t>T00. Documentos de aspectos técnicos que provee el sistema de información.</w:t>
@@ -4529,7 +4600,7 @@
       <w:pPr>
         <w:pStyle w:val="Ttulo2"/>
       </w:pPr>
-      <w:bookmarkStart w:id="2" w:name="_Toc231747890"/>
+      <w:bookmarkStart w:id="2" w:name="_Toc231946112"/>
       <w:r>
         <w:t>T01. Arquitectura Base</w:t>
       </w:r>
@@ -4539,7 +4610,7 @@
       <w:pPr>
         <w:pStyle w:val="Ttulo3"/>
       </w:pPr>
-      <w:bookmarkStart w:id="3" w:name="_Toc231747891"/>
+      <w:bookmarkStart w:id="3" w:name="_Toc231946113"/>
       <w:r>
         <w:rPr>
           <w:rFonts w:eastAsia="Arial"/>
@@ -4569,7 +4640,7 @@
       <w:pPr>
         <w:pStyle w:val="Ttulo3"/>
       </w:pPr>
-      <w:bookmarkStart w:id="4" w:name="_Toc231747892"/>
+      <w:bookmarkStart w:id="4" w:name="_Toc231946114"/>
       <w:r>
         <w:rPr>
           <w:rFonts w:eastAsia="Arial"/>
@@ -4986,7 +5057,7 @@
       <w:pPr>
         <w:pStyle w:val="Ttulo3"/>
       </w:pPr>
-      <w:bookmarkStart w:id="5" w:name="_Toc231747893"/>
+      <w:bookmarkStart w:id="5" w:name="_Toc231946115"/>
       <w:r>
         <w:rPr>
           <w:rFonts w:eastAsia="Arial"/>
@@ -5302,7 +5373,7 @@
       <w:pPr>
         <w:pStyle w:val="Ttulo3"/>
       </w:pPr>
-      <w:bookmarkStart w:id="6" w:name="_Toc231747894"/>
+      <w:bookmarkStart w:id="6" w:name="_Toc231946116"/>
       <w:r>
         <w:lastRenderedPageBreak/>
         <w:t>Gráficos</w:t>
@@ -5851,7 +5922,7 @@
       <w:pPr>
         <w:pStyle w:val="Ttulo3"/>
       </w:pPr>
-      <w:bookmarkStart w:id="7" w:name="_Toc231747895"/>
+      <w:bookmarkStart w:id="7" w:name="_Toc231946117"/>
       <w:r>
         <w:rPr>
           <w:rFonts w:eastAsia="Arial"/>
@@ -10425,7 +10496,7 @@
       <w:pPr>
         <w:pStyle w:val="Ttulo2"/>
       </w:pPr>
-      <w:bookmarkStart w:id="8" w:name="_Toc231747896"/>
+      <w:bookmarkStart w:id="8" w:name="_Toc231946118"/>
       <w:r>
         <w:lastRenderedPageBreak/>
         <w:t xml:space="preserve">T02. Gestión de Log In / Log </w:t>
@@ -10444,7 +10515,7 @@
       <w:pPr>
         <w:pStyle w:val="Ttulo3"/>
       </w:pPr>
-      <w:bookmarkStart w:id="9" w:name="_Toc231747897"/>
+      <w:bookmarkStart w:id="9" w:name="_Toc231946119"/>
       <w:r>
         <w:rPr>
           <w:rFonts w:eastAsia="Arial"/>
@@ -10493,7 +10564,7 @@
       <w:pPr>
         <w:pStyle w:val="Ttulo3"/>
       </w:pPr>
-      <w:bookmarkStart w:id="10" w:name="_Toc231747898"/>
+      <w:bookmarkStart w:id="10" w:name="_Toc231946120"/>
       <w:r>
         <w:rPr>
           <w:rFonts w:eastAsia="Arial"/>
@@ -10766,7 +10837,7 @@
       <w:pPr>
         <w:pStyle w:val="Ttulo3"/>
       </w:pPr>
-      <w:bookmarkStart w:id="11" w:name="_Toc231747899"/>
+      <w:bookmarkStart w:id="11" w:name="_Toc231946121"/>
       <w:r>
         <w:rPr>
           <w:rFonts w:eastAsia="Arial"/>
@@ -10905,7 +10976,7 @@
       <w:pPr>
         <w:pStyle w:val="Ttulo3"/>
       </w:pPr>
-      <w:bookmarkStart w:id="12" w:name="_Toc231747900"/>
+      <w:bookmarkStart w:id="12" w:name="_Toc231946122"/>
       <w:r>
         <w:rPr>
           <w:rFonts w:eastAsia="Arial"/>
@@ -11702,7 +11773,7 @@
       <w:pPr>
         <w:pStyle w:val="Ttulo2"/>
       </w:pPr>
-      <w:bookmarkStart w:id="13" w:name="_Toc231747901"/>
+      <w:bookmarkStart w:id="13" w:name="_Toc231946123"/>
       <w:r>
         <w:t>T03. Gestión de encriptado</w:t>
       </w:r>
@@ -11712,7 +11783,7 @@
       <w:pPr>
         <w:pStyle w:val="Ttulo3"/>
       </w:pPr>
-      <w:bookmarkStart w:id="14" w:name="_Toc231747902"/>
+      <w:bookmarkStart w:id="14" w:name="_Toc231946124"/>
       <w:r>
         <w:rPr>
           <w:rFonts w:eastAsia="Arial"/>
@@ -11739,7 +11810,7 @@
       <w:pPr>
         <w:pStyle w:val="Ttulo3"/>
       </w:pPr>
-      <w:bookmarkStart w:id="15" w:name="_Toc231747903"/>
+      <w:bookmarkStart w:id="15" w:name="_Toc231946125"/>
       <w:r>
         <w:rPr>
           <w:rFonts w:eastAsia="Arial"/>
@@ -11875,7 +11946,7 @@
       <w:pPr>
         <w:pStyle w:val="Ttulo3"/>
       </w:pPr>
-      <w:bookmarkStart w:id="16" w:name="_Toc231747904"/>
+      <w:bookmarkStart w:id="16" w:name="_Toc231946126"/>
       <w:r>
         <w:lastRenderedPageBreak/>
         <w:t>Gráficos</w:t>
@@ -12014,7 +12085,7 @@
       <w:pPr>
         <w:pStyle w:val="Ttulo2"/>
       </w:pPr>
-      <w:bookmarkStart w:id="17" w:name="_Toc231747905"/>
+      <w:bookmarkStart w:id="17" w:name="_Toc231946127"/>
       <w:r>
         <w:t xml:space="preserve">T04. </w:t>
       </w:r>
@@ -12030,7 +12101,7 @@
       <w:pPr>
         <w:pStyle w:val="Ttulo3"/>
       </w:pPr>
-      <w:bookmarkStart w:id="18" w:name="_Toc231747906"/>
+      <w:bookmarkStart w:id="18" w:name="_Toc231946128"/>
       <w:r>
         <w:rPr>
           <w:rFonts w:eastAsia="Arial"/>
@@ -12057,7 +12128,7 @@
       <w:pPr>
         <w:pStyle w:val="Ttulo3"/>
       </w:pPr>
-      <w:bookmarkStart w:id="19" w:name="_Toc231747907"/>
+      <w:bookmarkStart w:id="19" w:name="_Toc231946129"/>
       <w:r>
         <w:rPr>
           <w:rFonts w:eastAsia="Arial"/>
@@ -12307,7 +12378,7 @@
           <w:rFonts w:eastAsia="Arial"/>
         </w:rPr>
       </w:pPr>
-      <w:bookmarkStart w:id="20" w:name="_Toc231747908"/>
+      <w:bookmarkStart w:id="20" w:name="_Toc231946130"/>
       <w:r>
         <w:rPr>
           <w:rFonts w:eastAsia="Arial"/>
@@ -13411,7 +13482,7 @@
       <w:pPr>
         <w:pStyle w:val="Ttulo3"/>
       </w:pPr>
-      <w:bookmarkStart w:id="21" w:name="_Toc231747909"/>
+      <w:bookmarkStart w:id="21" w:name="_Toc231946131"/>
       <w:r>
         <w:lastRenderedPageBreak/>
         <w:t>Gráficos</w:t>
@@ -13432,10 +13503,10 @@
           <w:noProof/>
         </w:rPr>
         <w:drawing>
-          <wp:inline distT="0" distB="0" distL="0" distR="0" wp14:anchorId="1B991013" wp14:editId="0D4724FA">
-            <wp:extent cx="4467225" cy="6434579"/>
-            <wp:effectExtent l="0" t="0" r="0" b="4445"/>
-            <wp:docPr id="1015209083" name="Imagen 10"/>
+          <wp:inline distT="0" distB="0" distL="0" distR="0" wp14:anchorId="07922E94" wp14:editId="6C7DBFDC">
+            <wp:extent cx="3785616" cy="7011213"/>
+            <wp:effectExtent l="0" t="0" r="5715" b="0"/>
+            <wp:docPr id="404266006" name="Imagen 6"/>
             <wp:cNvGraphicFramePr>
               <a:graphicFrameLocks xmlns:a="http://schemas.openxmlformats.org/drawingml/2006/main" noChangeAspect="1"/>
             </wp:cNvGraphicFramePr>
@@ -13443,7 +13514,7 @@
               <a:graphicData uri="http://schemas.openxmlformats.org/drawingml/2006/picture">
                 <pic:pic xmlns:pic="http://schemas.openxmlformats.org/drawingml/2006/picture">
                   <pic:nvPicPr>
-                    <pic:cNvPr id="0" name="Picture 3"/>
+                    <pic:cNvPr id="0" name="Picture 5"/>
                     <pic:cNvPicPr>
                       <a:picLocks noChangeAspect="1" noChangeArrowheads="1"/>
                     </pic:cNvPicPr>
@@ -13464,7 +13535,7 @@
                   <pic:spPr bwMode="auto">
                     <a:xfrm>
                       <a:off x="0" y="0"/>
-                      <a:ext cx="4469133" cy="6437327"/>
+                      <a:ext cx="3796955" cy="7032214"/>
                     </a:xfrm>
                     <a:prstGeom prst="rect">
                       <a:avLst/>
@@ -13481,8 +13552,6 @@
         </w:drawing>
       </w:r>
     </w:p>
-    <w:p/>
-    <w:p/>
     <w:p>
       <w:pPr>
         <w:pStyle w:val="Ttulo4"/>
@@ -13617,7 +13686,7 @@
       <w:pPr>
         <w:pStyle w:val="Ttulo3"/>
       </w:pPr>
-      <w:bookmarkStart w:id="22" w:name="_Toc231747910"/>
+      <w:bookmarkStart w:id="22" w:name="_Toc231946132"/>
       <w:r>
         <w:lastRenderedPageBreak/>
         <w:t>Casos de Uso: Permisos</w:t>
@@ -14393,10 +14462,10 @@
         </w:rPr>
         <w:lastRenderedPageBreak/>
         <w:drawing>
-          <wp:inline distT="0" distB="0" distL="0" distR="0" wp14:anchorId="71B6E72B" wp14:editId="562ABA63">
-            <wp:extent cx="5746115" cy="5400040"/>
-            <wp:effectExtent l="0" t="0" r="6985" b="0"/>
-            <wp:docPr id="1416114296" name="Imagen 6"/>
+          <wp:inline distT="0" distB="0" distL="0" distR="0" wp14:anchorId="51F0712B" wp14:editId="2FA729D8">
+            <wp:extent cx="6071616" cy="4756983"/>
+            <wp:effectExtent l="0" t="0" r="5715" b="5715"/>
+            <wp:docPr id="1864705675" name="Imagen 5"/>
             <wp:cNvGraphicFramePr>
               <a:graphicFrameLocks xmlns:a="http://schemas.openxmlformats.org/drawingml/2006/main" noChangeAspect="1"/>
             </wp:cNvGraphicFramePr>
@@ -14404,7 +14473,7 @@
               <a:graphicData uri="http://schemas.openxmlformats.org/drawingml/2006/picture">
                 <pic:pic xmlns:pic="http://schemas.openxmlformats.org/drawingml/2006/picture">
                   <pic:nvPicPr>
-                    <pic:cNvPr id="0" name="Picture 2"/>
+                    <pic:cNvPr id="0" name="Picture 4"/>
                     <pic:cNvPicPr>
                       <a:picLocks noChangeAspect="1" noChangeArrowheads="1"/>
                     </pic:cNvPicPr>
@@ -14425,7 +14494,7 @@
                   <pic:spPr bwMode="auto">
                     <a:xfrm>
                       <a:off x="0" y="0"/>
-                      <a:ext cx="5746115" cy="5400040"/>
+                      <a:ext cx="6108786" cy="4786105"/>
                     </a:xfrm>
                     <a:prstGeom prst="rect">
                       <a:avLst/>
@@ -14450,41 +14519,10 @@
     </w:p>
     <w:p>
       <w:pPr>
-        <w:spacing w:after="60" w:line="240" w:lineRule="auto"/>
-        <w:jc w:val="both"/>
-      </w:pPr>
-    </w:p>
-    <w:p>
-      <w:pPr>
-        <w:spacing w:after="60" w:line="240" w:lineRule="auto"/>
-        <w:jc w:val="both"/>
-      </w:pPr>
-    </w:p>
-    <w:p>
-      <w:pPr>
-        <w:spacing w:after="60" w:line="240" w:lineRule="auto"/>
-        <w:jc w:val="both"/>
-      </w:pPr>
-    </w:p>
-    <w:p>
-      <w:pPr>
-        <w:spacing w:after="60" w:line="240" w:lineRule="auto"/>
-        <w:jc w:val="both"/>
-      </w:pPr>
-    </w:p>
-    <w:p>
-      <w:pPr>
-        <w:spacing w:after="60" w:line="240" w:lineRule="auto"/>
-        <w:jc w:val="both"/>
-      </w:pPr>
-    </w:p>
-    <w:p>
-      <w:pPr>
         <w:pStyle w:val="Ttulo2"/>
       </w:pPr>
-      <w:bookmarkStart w:id="23" w:name="_Toc231747911"/>
-      <w:r>
-        <w:lastRenderedPageBreak/>
+      <w:bookmarkStart w:id="23" w:name="_Toc231946133"/>
+      <w:r>
         <w:t>T05. Gestión de Múltiples Idiomas</w:t>
       </w:r>
       <w:bookmarkEnd w:id="23"/>
@@ -14493,7 +14531,7 @@
       <w:pPr>
         <w:pStyle w:val="Ttulo3"/>
       </w:pPr>
-      <w:bookmarkStart w:id="24" w:name="_Toc231747912"/>
+      <w:bookmarkStart w:id="24" w:name="_Toc231946134"/>
       <w:r>
         <w:rPr>
           <w:rFonts w:eastAsia="Arial"/>
@@ -14520,7 +14558,7 @@
       <w:pPr>
         <w:pStyle w:val="Ttulo3"/>
       </w:pPr>
-      <w:bookmarkStart w:id="25" w:name="_Toc231747913"/>
+      <w:bookmarkStart w:id="25" w:name="_Toc231946135"/>
       <w:r>
         <w:rPr>
           <w:rFonts w:eastAsia="Arial"/>
@@ -14630,7 +14668,16 @@
           <w:sz w:val="24"/>
           <w:szCs w:val="24"/>
         </w:rPr>
-        <w:t xml:space="preserve">. Los formularios implementan la interfaz </w:t>
+        <w:t xml:space="preserve">. Los formularios </w:t>
+      </w:r>
+      <w:r>
+        <w:rPr>
+          <w:rFonts w:ascii="Arial" w:eastAsia="Arial" w:hAnsi="Arial" w:cs="Arial"/>
+          <w:sz w:val="24"/>
+          <w:szCs w:val="24"/>
+        </w:rPr>
+        <w:lastRenderedPageBreak/>
+        <w:t xml:space="preserve">implementan la interfaz </w:t>
       </w:r>
       <w:proofErr w:type="spellStart"/>
       <w:r>
@@ -14779,7 +14826,7 @@
           <w:rFonts w:eastAsia="Arial"/>
         </w:rPr>
       </w:pPr>
-      <w:bookmarkStart w:id="26" w:name="_Toc231747914"/>
+      <w:bookmarkStart w:id="26" w:name="_Toc231946136"/>
       <w:r>
         <w:rPr>
           <w:rFonts w:eastAsia="Arial"/>
@@ -14985,7 +15032,7 @@
       <w:pPr>
         <w:pStyle w:val="Ttulo3"/>
       </w:pPr>
-      <w:bookmarkStart w:id="27" w:name="_Toc231747915"/>
+      <w:bookmarkStart w:id="27" w:name="_Toc231946137"/>
       <w:r>
         <w:t>Casos de Uso: Idiomas</w:t>
       </w:r>
@@ -16052,7 +16099,7 @@
       <w:pPr>
         <w:pStyle w:val="Ttulo2"/>
       </w:pPr>
-      <w:bookmarkStart w:id="28" w:name="_Toc231747916"/>
+      <w:bookmarkStart w:id="28" w:name="_Toc231946138"/>
       <w:r>
         <w:lastRenderedPageBreak/>
         <w:t>T06. Gestión de Bitácora y Control de Cambios</w:t>
@@ -16063,7 +16110,7 @@
       <w:pPr>
         <w:pStyle w:val="Ttulo3"/>
       </w:pPr>
-      <w:bookmarkStart w:id="29" w:name="_Toc231747917"/>
+      <w:bookmarkStart w:id="29" w:name="_Toc231946139"/>
       <w:r>
         <w:t>T06a. Gestión de Bitácora</w:t>
       </w:r>
@@ -16297,7 +16344,7 @@
       <w:pPr>
         <w:pStyle w:val="Ttulo3"/>
       </w:pPr>
-      <w:bookmarkStart w:id="30" w:name="_Toc231747918"/>
+      <w:bookmarkStart w:id="30" w:name="_Toc231946140"/>
       <w:r>
         <w:t>T06b. Control de Cambios</w:t>
       </w:r>
@@ -16414,7 +16461,7 @@
           <w:rFonts w:eastAsia="Arial"/>
         </w:rPr>
       </w:pPr>
-      <w:bookmarkStart w:id="31" w:name="_Toc231747919"/>
+      <w:bookmarkStart w:id="31" w:name="_Toc231946141"/>
       <w:r>
         <w:rPr>
           <w:rFonts w:eastAsia="Arial"/>
@@ -16423,7 +16470,6 @@
       </w:r>
       <w:bookmarkEnd w:id="31"/>
     </w:p>
-    <w:p/>
     <w:p>
       <w:pPr>
         <w:pStyle w:val="Ttulo4"/>
@@ -16620,7 +16666,7 @@
       <w:pPr>
         <w:pStyle w:val="Ttulo3"/>
       </w:pPr>
-      <w:bookmarkStart w:id="32" w:name="_Toc231747920"/>
+      <w:bookmarkStart w:id="32" w:name="_Toc231946142"/>
       <w:r>
         <w:t>Casos de Uso: Bitácora</w:t>
       </w:r>
@@ -16925,17 +16971,17 @@
     <w:p>
       <w:pPr>
         <w:spacing w:after="60" w:line="240" w:lineRule="auto"/>
-        <w:jc w:val="both"/>
+        <w:jc w:val="center"/>
       </w:pPr>
       <w:r>
         <w:rPr>
           <w:noProof/>
         </w:rPr>
         <w:drawing>
-          <wp:inline distT="0" distB="0" distL="0" distR="0" wp14:anchorId="77638EA4" wp14:editId="5CD10854">
-            <wp:extent cx="6276538" cy="3175687"/>
-            <wp:effectExtent l="0" t="0" r="0" b="5715"/>
-            <wp:docPr id="2076319814" name="Imagen 9"/>
+          <wp:inline distT="0" distB="0" distL="0" distR="0" wp14:anchorId="48861ED2" wp14:editId="109ED567">
+            <wp:extent cx="5996964" cy="3352800"/>
+            <wp:effectExtent l="0" t="0" r="3810" b="0"/>
+            <wp:docPr id="1688743319" name="Imagen 7"/>
             <wp:cNvGraphicFramePr>
               <a:graphicFrameLocks xmlns:a="http://schemas.openxmlformats.org/drawingml/2006/main" noChangeAspect="1"/>
             </wp:cNvGraphicFramePr>
@@ -16943,7 +16989,7 @@
               <a:graphicData uri="http://schemas.openxmlformats.org/drawingml/2006/picture">
                 <pic:pic xmlns:pic="http://schemas.openxmlformats.org/drawingml/2006/picture">
                   <pic:nvPicPr>
-                    <pic:cNvPr id="0" name="Picture 5"/>
+                    <pic:cNvPr id="0" name="Picture 6"/>
                     <pic:cNvPicPr>
                       <a:picLocks noChangeAspect="1" noChangeArrowheads="1"/>
                     </pic:cNvPicPr>
@@ -16964,7 +17010,7 @@
                   <pic:spPr bwMode="auto">
                     <a:xfrm>
                       <a:off x="0" y="0"/>
-                      <a:ext cx="6285295" cy="3180118"/>
+                      <a:ext cx="5997932" cy="3353341"/>
                     </a:xfrm>
                     <a:prstGeom prst="rect">
                       <a:avLst/>
@@ -17237,15 +17283,18 @@
       </w:r>
     </w:p>
     <w:p>
+      <w:pPr>
+        <w:jc w:val="center"/>
+      </w:pPr>
       <w:r>
         <w:rPr>
           <w:noProof/>
         </w:rPr>
         <w:drawing>
-          <wp:inline distT="0" distB="0" distL="0" distR="0" wp14:anchorId="5F9C4E45" wp14:editId="5DF00A89">
-            <wp:extent cx="6184557" cy="3879516"/>
-            <wp:effectExtent l="0" t="0" r="6985" b="6985"/>
-            <wp:docPr id="476690400" name="Imagen 10"/>
+          <wp:inline distT="0" distB="0" distL="0" distR="0" wp14:anchorId="5303D3F1" wp14:editId="20770245">
+            <wp:extent cx="5527040" cy="5155966"/>
+            <wp:effectExtent l="0" t="0" r="0" b="6985"/>
+            <wp:docPr id="390486882" name="Imagen 8"/>
             <wp:cNvGraphicFramePr>
               <a:graphicFrameLocks xmlns:a="http://schemas.openxmlformats.org/drawingml/2006/main" noChangeAspect="1"/>
             </wp:cNvGraphicFramePr>
@@ -17253,13 +17302,13 @@
               <a:graphicData uri="http://schemas.openxmlformats.org/drawingml/2006/picture">
                 <pic:pic xmlns:pic="http://schemas.openxmlformats.org/drawingml/2006/picture">
                   <pic:nvPicPr>
-                    <pic:cNvPr id="0" name="Picture 6"/>
+                    <pic:cNvPr id="0" name="Picture 7"/>
                     <pic:cNvPicPr>
                       <a:picLocks noChangeAspect="1" noChangeArrowheads="1"/>
                     </pic:cNvPicPr>
                   </pic:nvPicPr>
                   <pic:blipFill>
-                    <a:blip r:embed="rId47">
+                    <a:blip r:embed="rId47" cstate="print">
                       <a:extLst>
                         <a:ext uri="{28A0092B-C50C-407E-A947-70E740481C1C}">
                           <a14:useLocalDpi xmlns:a14="http://schemas.microsoft.com/office/drawing/2010/main" val="0"/>
@@ -17274,7 +17323,7 @@
                   <pic:spPr bwMode="auto">
                     <a:xfrm>
                       <a:off x="0" y="0"/>
-                      <a:ext cx="6189601" cy="3882680"/>
+                      <a:ext cx="5539991" cy="5168048"/>
                     </a:xfrm>
                     <a:prstGeom prst="rect">
                       <a:avLst/>
@@ -17291,10 +17340,6 @@
         </w:drawing>
       </w:r>
     </w:p>
-    <w:p/>
-    <w:p/>
-    <w:p/>
-    <w:p/>
     <w:p>
       <w:pPr>
         <w:pStyle w:val="Ttulo4"/>
@@ -17606,7 +17651,7 @@
       <w:pPr>
         <w:pStyle w:val="Ttulo3"/>
       </w:pPr>
-      <w:bookmarkStart w:id="33" w:name="_Toc231747921"/>
+      <w:bookmarkStart w:id="33" w:name="_Toc231946143"/>
       <w:r>
         <w:lastRenderedPageBreak/>
         <w:t>Diagrama de Casos de Uso</w:t>
@@ -17617,15 +17662,18 @@
       <w:bookmarkEnd w:id="33"/>
     </w:p>
     <w:p>
+      <w:pPr>
+        <w:jc w:val="center"/>
+      </w:pPr>
       <w:r>
         <w:rPr>
           <w:noProof/>
         </w:rPr>
         <w:drawing>
-          <wp:inline distT="0" distB="0" distL="0" distR="0" wp14:anchorId="0036053A" wp14:editId="3F7EF816">
-            <wp:extent cx="5758180" cy="6276975"/>
-            <wp:effectExtent l="0" t="0" r="0" b="9525"/>
-            <wp:docPr id="1630385927" name="Imagen 12"/>
+          <wp:inline distT="0" distB="0" distL="0" distR="0" wp14:anchorId="50A48302" wp14:editId="700F4317">
+            <wp:extent cx="4917523" cy="7406640"/>
+            <wp:effectExtent l="0" t="0" r="0" b="3810"/>
+            <wp:docPr id="1471400419" name="Imagen 9"/>
             <wp:cNvGraphicFramePr>
               <a:graphicFrameLocks xmlns:a="http://schemas.openxmlformats.org/drawingml/2006/main" noChangeAspect="1"/>
             </wp:cNvGraphicFramePr>
@@ -17633,13 +17681,13 @@
               <a:graphicData uri="http://schemas.openxmlformats.org/drawingml/2006/picture">
                 <pic:pic xmlns:pic="http://schemas.openxmlformats.org/drawingml/2006/picture">
                   <pic:nvPicPr>
-                    <pic:cNvPr id="0" name="Picture 9"/>
+                    <pic:cNvPr id="0" name="Picture 8"/>
                     <pic:cNvPicPr>
                       <a:picLocks noChangeAspect="1" noChangeArrowheads="1"/>
                     </pic:cNvPicPr>
                   </pic:nvPicPr>
                   <pic:blipFill>
-                    <a:blip r:embed="rId48" cstate="print">
+                    <a:blip r:embed="rId48">
                       <a:extLst>
                         <a:ext uri="{28A0092B-C50C-407E-A947-70E740481C1C}">
                           <a14:useLocalDpi xmlns:a14="http://schemas.microsoft.com/office/drawing/2010/main" val="0"/>
@@ -17654,7 +17702,7 @@
                   <pic:spPr bwMode="auto">
                     <a:xfrm>
                       <a:off x="0" y="0"/>
-                      <a:ext cx="5758180" cy="6276975"/>
+                      <a:ext cx="4929833" cy="7425181"/>
                     </a:xfrm>
                     <a:prstGeom prst="rect">
                       <a:avLst/>
@@ -17671,11 +17719,202 @@
         </w:drawing>
       </w:r>
     </w:p>
+    <w:p>
+      <w:pPr>
+        <w:pStyle w:val="Ttulo3"/>
+      </w:pPr>
+      <w:bookmarkStart w:id="34" w:name="_Toc231946144"/>
+      <w:r>
+        <w:lastRenderedPageBreak/>
+        <w:t>Diagrama Entidad Relación del sistema</w:t>
+      </w:r>
+      <w:bookmarkEnd w:id="34"/>
+    </w:p>
+    <w:p>
+      <w:r>
+        <w:rPr>
+          <w:noProof/>
+        </w:rPr>
+        <w:drawing>
+          <wp:inline distT="0" distB="0" distL="0" distR="0" wp14:anchorId="3672F9EA" wp14:editId="669A677F">
+            <wp:extent cx="4980018" cy="6940296"/>
+            <wp:effectExtent l="0" t="0" r="0" b="0"/>
+            <wp:docPr id="1745708613" name="Imagen 4"/>
+            <wp:cNvGraphicFramePr>
+              <a:graphicFrameLocks xmlns:a="http://schemas.openxmlformats.org/drawingml/2006/main" noChangeAspect="1"/>
+            </wp:cNvGraphicFramePr>
+            <a:graphic xmlns:a="http://schemas.openxmlformats.org/drawingml/2006/main">
+              <a:graphicData uri="http://schemas.openxmlformats.org/drawingml/2006/picture">
+                <pic:pic xmlns:pic="http://schemas.openxmlformats.org/drawingml/2006/picture">
+                  <pic:nvPicPr>
+                    <pic:cNvPr id="0" name="Picture 3"/>
+                    <pic:cNvPicPr>
+                      <a:picLocks noChangeAspect="1" noChangeArrowheads="1"/>
+                    </pic:cNvPicPr>
+                  </pic:nvPicPr>
+                  <pic:blipFill>
+                    <a:blip r:embed="rId49">
+                      <a:extLst>
+                        <a:ext uri="{28A0092B-C50C-407E-A947-70E740481C1C}">
+                          <a14:useLocalDpi xmlns:a14="http://schemas.microsoft.com/office/drawing/2010/main" val="0"/>
+                        </a:ext>
+                      </a:extLst>
+                    </a:blip>
+                    <a:srcRect/>
+                    <a:stretch>
+                      <a:fillRect/>
+                    </a:stretch>
+                  </pic:blipFill>
+                  <pic:spPr bwMode="auto">
+                    <a:xfrm>
+                      <a:off x="0" y="0"/>
+                      <a:ext cx="4981913" cy="6942937"/>
+                    </a:xfrm>
+                    <a:prstGeom prst="rect">
+                      <a:avLst/>
+                    </a:prstGeom>
+                    <a:noFill/>
+                    <a:ln>
+                      <a:noFill/>
+                    </a:ln>
+                  </pic:spPr>
+                </pic:pic>
+              </a:graphicData>
+            </a:graphic>
+          </wp:inline>
+        </w:drawing>
+      </w:r>
+    </w:p>
+    <w:p>
+      <w:pPr>
+        <w:pStyle w:val="Ttulo3"/>
+      </w:pPr>
+      <w:bookmarkStart w:id="35" w:name="_Toc231946145"/>
+      <w:r>
+        <w:lastRenderedPageBreak/>
+        <w:t>Modelo Relacional del sistema</w:t>
+      </w:r>
+      <w:bookmarkEnd w:id="35"/>
+    </w:p>
+    <w:p>
+      <w:r>
+        <w:rPr>
+          <w:noProof/>
+        </w:rPr>
+        <w:drawing>
+          <wp:inline distT="0" distB="0" distL="0" distR="0" wp14:anchorId="61F266E9" wp14:editId="7282E848">
+            <wp:extent cx="4255477" cy="6537960"/>
+            <wp:effectExtent l="0" t="0" r="0" b="0"/>
+            <wp:docPr id="796326517" name="Imagen 2"/>
+            <wp:cNvGraphicFramePr>
+              <a:graphicFrameLocks xmlns:a="http://schemas.openxmlformats.org/drawingml/2006/main" noChangeAspect="1"/>
+            </wp:cNvGraphicFramePr>
+            <a:graphic xmlns:a="http://schemas.openxmlformats.org/drawingml/2006/main">
+              <a:graphicData uri="http://schemas.openxmlformats.org/drawingml/2006/picture">
+                <pic:pic xmlns:pic="http://schemas.openxmlformats.org/drawingml/2006/picture">
+                  <pic:nvPicPr>
+                    <pic:cNvPr id="0" name="Picture 1"/>
+                    <pic:cNvPicPr>
+                      <a:picLocks noChangeAspect="1" noChangeArrowheads="1"/>
+                    </pic:cNvPicPr>
+                  </pic:nvPicPr>
+                  <pic:blipFill>
+                    <a:blip r:embed="rId50">
+                      <a:extLst>
+                        <a:ext uri="{28A0092B-C50C-407E-A947-70E740481C1C}">
+                          <a14:useLocalDpi xmlns:a14="http://schemas.microsoft.com/office/drawing/2010/main" val="0"/>
+                        </a:ext>
+                      </a:extLst>
+                    </a:blip>
+                    <a:srcRect/>
+                    <a:stretch>
+                      <a:fillRect/>
+                    </a:stretch>
+                  </pic:blipFill>
+                  <pic:spPr bwMode="auto">
+                    <a:xfrm>
+                      <a:off x="0" y="0"/>
+                      <a:ext cx="4257547" cy="6541141"/>
+                    </a:xfrm>
+                    <a:prstGeom prst="rect">
+                      <a:avLst/>
+                    </a:prstGeom>
+                    <a:noFill/>
+                    <a:ln>
+                      <a:noFill/>
+                    </a:ln>
+                  </pic:spPr>
+                </pic:pic>
+              </a:graphicData>
+            </a:graphic>
+          </wp:inline>
+        </w:drawing>
+      </w:r>
+    </w:p>
+    <w:p>
+      <w:r>
+        <w:lastRenderedPageBreak/>
+        <w:t xml:space="preserve"> </w:t>
+      </w:r>
+      <w:r>
+        <w:rPr>
+          <w:noProof/>
+        </w:rPr>
+        <w:drawing>
+          <wp:inline distT="0" distB="0" distL="0" distR="0" wp14:anchorId="277E1508" wp14:editId="2E1D2E1F">
+            <wp:extent cx="4041775" cy="8248015"/>
+            <wp:effectExtent l="0" t="0" r="0" b="635"/>
+            <wp:docPr id="1268958044" name="Imagen 3"/>
+            <wp:cNvGraphicFramePr>
+              <a:graphicFrameLocks xmlns:a="http://schemas.openxmlformats.org/drawingml/2006/main" noChangeAspect="1"/>
+            </wp:cNvGraphicFramePr>
+            <a:graphic xmlns:a="http://schemas.openxmlformats.org/drawingml/2006/main">
+              <a:graphicData uri="http://schemas.openxmlformats.org/drawingml/2006/picture">
+                <pic:pic xmlns:pic="http://schemas.openxmlformats.org/drawingml/2006/picture">
+                  <pic:nvPicPr>
+                    <pic:cNvPr id="0" name="Picture 2"/>
+                    <pic:cNvPicPr>
+                      <a:picLocks noChangeAspect="1" noChangeArrowheads="1"/>
+                    </pic:cNvPicPr>
+                  </pic:nvPicPr>
+                  <pic:blipFill>
+                    <a:blip r:embed="rId51">
+                      <a:extLst>
+                        <a:ext uri="{28A0092B-C50C-407E-A947-70E740481C1C}">
+                          <a14:useLocalDpi xmlns:a14="http://schemas.microsoft.com/office/drawing/2010/main" val="0"/>
+                        </a:ext>
+                      </a:extLst>
+                    </a:blip>
+                    <a:srcRect/>
+                    <a:stretch>
+                      <a:fillRect/>
+                    </a:stretch>
+                  </pic:blipFill>
+                  <pic:spPr bwMode="auto">
+                    <a:xfrm>
+                      <a:off x="0" y="0"/>
+                      <a:ext cx="4041775" cy="8248015"/>
+                    </a:xfrm>
+                    <a:prstGeom prst="rect">
+                      <a:avLst/>
+                    </a:prstGeom>
+                    <a:noFill/>
+                    <a:ln>
+                      <a:noFill/>
+                    </a:ln>
+                  </pic:spPr>
+                </pic:pic>
+              </a:graphicData>
+            </a:graphic>
+          </wp:inline>
+        </w:drawing>
+      </w:r>
+    </w:p>
     <w:sectPr>
-      <w:headerReference w:type="default" r:id="rId49"/>
-      <w:footerReference w:type="default" r:id="rId50"/>
-      <w:headerReference w:type="first" r:id="rId51"/>
-      <w:footerReference w:type="first" r:id="rId52"/>
+      <w:headerReference w:type="default" r:id="rId52"/>
+      <w:footerReference w:type="default" r:id="rId53"/>
+      <w:headerReference w:type="first" r:id="rId54"/>
+      <w:footerReference w:type="first" r:id="rId55"/>
       <w:pgSz w:w="11906" w:h="16838"/>
       <w:pgMar w:top="2268" w:right="1134" w:bottom="851" w:left="1701" w:header="709" w:footer="709" w:gutter="0"/>
       <w:pgNumType w:start="1"/>

</xml_diff>

<commit_message>
Se corrigio la abstract class Composite. Diagrama de claes T04 corregido
</commit_message>
<xml_diff>
--- a/Documentación/Carpeta Trabajo Practico Integrador Nicolás Alcalá.docx
+++ b/Documentación/Carpeta Trabajo Practico Integrador Nicolás Alcalá.docx
@@ -1,6 +1,6 @@
 
 <file path=word/document.xml><?xml version="1.0" encoding="utf-8"?>
-<w:document xmlns:wpc="http://schemas.microsoft.com/office/word/2010/wordprocessingCanvas" xmlns:cx="http://schemas.microsoft.com/office/drawing/2014/chartex" xmlns:cx1="http://schemas.microsoft.com/office/drawing/2015/9/8/chartex" xmlns:cx2="http://schemas.microsoft.com/office/drawing/2015/10/21/chartex" xmlns:cx3="http://schemas.microsoft.com/office/drawing/2016/5/9/chartex" xmlns:cx4="http://schemas.microsoft.com/office/drawing/2016/5/10/chartex" xmlns:cx5="http://schemas.microsoft.com/office/drawing/2016/5/11/chartex" xmlns:cx6="http://schemas.microsoft.com/office/drawing/2016/5/12/chartex" xmlns:cx7="http://schemas.microsoft.com/office/drawing/2016/5/13/chartex" xmlns:cx8="http://schemas.microsoft.com/office/drawing/2016/5/14/chartex" xmlns:mc="http://schemas.openxmlformats.org/markup-compatibility/2006" xmlns:aink="http://schemas.microsoft.com/office/drawing/2016/ink" xmlns:am3d="http://schemas.microsoft.com/office/drawing/2017/model3d" xmlns:o="urn:schemas-microsoft-com:office:office" xmlns:oel="http://schemas.microsoft.com/office/2019/extlst" xmlns:r="http://schemas.openxmlformats.org/officeDocument/2006/relationships" xmlns:m="http://schemas.openxmlformats.org/officeDocument/2006/math" xmlns:v="urn:schemas-microsoft-com:vml" xmlns:wp14="http://schemas.microsoft.com/office/word/2010/wordprocessingDrawing" xmlns:wp="http://schemas.openxmlformats.org/drawingml/2006/wordprocessingDrawing" xmlns:w10="urn:schemas-microsoft-com:office:word" xmlns:w="http://schemas.openxmlformats.org/wordprocessingml/2006/main" xmlns:w14="http://schemas.microsoft.com/office/word/2010/wordml" xmlns:w15="http://schemas.microsoft.com/office/word/2012/wordml" xmlns:w16cex="http://schemas.microsoft.com/office/word/2018/wordml/cex" xmlns:w16cid="http://schemas.microsoft.com/office/word/2016/wordml/cid" xmlns:w16="http://schemas.microsoft.com/office/word/2018/wordml" xmlns:w16du="http://schemas.microsoft.com/office/word/2023/wordml/word16du" xmlns:w16sdtdh="http://schemas.microsoft.com/office/word/2020/wordml/sdtdatahash" xmlns:w16sdtfl="http://schemas.microsoft.com/office/word/2024/wordml/sdtformatlock" xmlns:w16se="http://schemas.microsoft.com/office/word/2015/wordml/symex" xmlns:wpg="http://schemas.microsoft.com/office/word/2010/wordprocessingGroup" xmlns:wpi="http://schemas.microsoft.com/office/word/2010/wordprocessingInk" xmlns:wne="http://schemas.microsoft.com/office/word/2006/wordml" xmlns:wps="http://schemas.microsoft.com/office/word/2010/wordprocessingShape" mc:Ignorable="w14 w15 w16se w16cid w16 w16cex w16sdtdh w16sdtfl w16du wp14">
+<w:document xmlns:wpc="http://schemas.microsoft.com/office/word/2010/wordprocessingCanvas" xmlns:cx="http://schemas.microsoft.com/office/drawing/2014/chartex" xmlns:cx1="http://schemas.microsoft.com/office/drawing/2015/9/8/chartex" xmlns:cx2="http://schemas.microsoft.com/office/drawing/2015/10/21/chartex" xmlns:cx3="http://schemas.microsoft.com/office/drawing/2016/5/9/chartex" xmlns:cx4="http://schemas.microsoft.com/office/drawing/2016/5/10/chartex" xmlns:cx5="http://schemas.microsoft.com/office/drawing/2016/5/11/chartex" xmlns:cx6="http://schemas.microsoft.com/office/drawing/2016/5/12/chartex" xmlns:cx7="http://schemas.microsoft.com/office/drawing/2016/5/13/chartex" xmlns:cx8="http://schemas.microsoft.com/office/drawing/2016/5/14/chartex" xmlns:mc="http://schemas.openxmlformats.org/markup-compatibility/2006" xmlns:aink="http://schemas.microsoft.com/office/drawing/2016/ink" xmlns:am3d="http://schemas.microsoft.com/office/drawing/2017/model3d" xmlns:o="urn:schemas-microsoft-com:office:office" xmlns:r="http://schemas.openxmlformats.org/officeDocument/2006/relationships" xmlns:m="http://schemas.openxmlformats.org/officeDocument/2006/math" xmlns:v="urn:schemas-microsoft-com:vml" xmlns:wp14="http://schemas.microsoft.com/office/word/2010/wordprocessingDrawing" xmlns:wp="http://schemas.openxmlformats.org/drawingml/2006/wordprocessingDrawing" xmlns:w10="urn:schemas-microsoft-com:office:word" xmlns:w="http://schemas.openxmlformats.org/wordprocessingml/2006/main" xmlns:w14="http://schemas.microsoft.com/office/word/2010/wordml" xmlns:w15="http://schemas.microsoft.com/office/word/2012/wordml" xmlns:w16cex="http://schemas.microsoft.com/office/word/2018/wordml/cex" xmlns:w16cid="http://schemas.microsoft.com/office/word/2016/wordml/cid" xmlns:w16="http://schemas.microsoft.com/office/word/2018/wordml" xmlns:w16sdtdh="http://schemas.microsoft.com/office/word/2020/wordml/sdtdatahash" xmlns:w16se="http://schemas.microsoft.com/office/word/2015/wordml/symex" xmlns:wpg="http://schemas.microsoft.com/office/word/2010/wordprocessingGroup" xmlns:wpi="http://schemas.microsoft.com/office/word/2010/wordprocessingInk" xmlns:wne="http://schemas.microsoft.com/office/word/2006/wordml" xmlns:wps="http://schemas.microsoft.com/office/word/2010/wordprocessingShape" mc:Ignorable="w14 w15 w16se w16cid w16 w16cex w16sdtdh wp14">
   <w:body>
     <w:p>
       <w:pPr>
@@ -3666,8 +3666,17 @@
                 <w:sz w:val="20"/>
                 <w:szCs w:val="20"/>
               </w:rPr>
-              <w:t xml:space="preserve"> y el Login</w:t>
-            </w:r>
+              <w:t xml:space="preserve"> y el </w:t>
+            </w:r>
+            <w:proofErr w:type="spellStart"/>
+            <w:r>
+              <w:rPr>
+                <w:sz w:val="20"/>
+                <w:szCs w:val="20"/>
+              </w:rPr>
+              <w:t>Login</w:t>
+            </w:r>
+            <w:proofErr w:type="spellEnd"/>
           </w:p>
         </w:tc>
       </w:tr>
@@ -5184,7 +5193,25 @@
           <w:sz w:val="24"/>
           <w:szCs w:val="24"/>
         </w:rPr>
-        <w:t xml:space="preserve"> SHA-256 como método estático reutilizable. Cualquier módulo futuro que requiera encriptación puede invocarla sin duplicar código. De igual manera, el patrón Singleton aplicado a </w:t>
+        <w:t xml:space="preserve"> SHA-256 como método estático reutilizable. Cualquier módulo futuro que requiera encriptación puede invocarla sin duplicar código. De igual manera, el patrón </w:t>
+      </w:r>
+      <w:proofErr w:type="spellStart"/>
+      <w:r>
+        <w:rPr>
+          <w:rFonts w:ascii="Arial" w:eastAsia="Arial" w:hAnsi="Arial" w:cs="Arial"/>
+          <w:sz w:val="24"/>
+          <w:szCs w:val="24"/>
+        </w:rPr>
+        <w:t>Singleton</w:t>
+      </w:r>
+      <w:proofErr w:type="spellEnd"/>
+      <w:r>
+        <w:rPr>
+          <w:rFonts w:ascii="Arial" w:eastAsia="Arial" w:hAnsi="Arial" w:cs="Arial"/>
+          <w:sz w:val="24"/>
+          <w:szCs w:val="24"/>
+        </w:rPr>
+        <w:t xml:space="preserve"> aplicado a </w:t>
       </w:r>
       <w:proofErr w:type="spellStart"/>
       <w:r>
@@ -5722,7 +5749,15 @@
       </w:r>
       <w:proofErr w:type="spellEnd"/>
       <w:r>
-        <w:t>/Delete)</w:t>
+        <w:t>/</w:t>
+      </w:r>
+      <w:proofErr w:type="spellStart"/>
+      <w:r>
+        <w:t>Delete</w:t>
+      </w:r>
+      <w:proofErr w:type="spellEnd"/>
+      <w:r>
+        <w:t>)</w:t>
       </w:r>
     </w:p>
     <w:p>
@@ -5795,7 +5830,15 @@
       </w:r>
       <w:proofErr w:type="spellEnd"/>
       <w:r>
-        <w:t>/Login)</w:t>
+        <w:t>/</w:t>
+      </w:r>
+      <w:proofErr w:type="spellStart"/>
+      <w:r>
+        <w:t>Login</w:t>
+      </w:r>
+      <w:proofErr w:type="spellEnd"/>
+      <w:r>
+        <w:t>)</w:t>
       </w:r>
     </w:p>
     <w:p>
@@ -10498,7 +10541,6 @@
       </w:pPr>
       <w:bookmarkStart w:id="8" w:name="_Toc231946118"/>
       <w:r>
-        <w:lastRenderedPageBreak/>
         <w:t xml:space="preserve">T02. Gestión de Log In / Log </w:t>
       </w:r>
       <w:proofErr w:type="spellStart"/>
@@ -10603,25 +10645,7 @@
           <w:sz w:val="24"/>
           <w:szCs w:val="24"/>
         </w:rPr>
-        <w:t xml:space="preserve">El usuario selecciona la opción </w:t>
-      </w:r>
-      <w:proofErr w:type="gramStart"/>
-      <w:r>
-        <w:rPr>
-          <w:rFonts w:ascii="Arial" w:eastAsia="Arial" w:hAnsi="Arial" w:cs="Arial"/>
-          <w:sz w:val="24"/>
-          <w:szCs w:val="24"/>
-        </w:rPr>
-        <w:t>Salir desde el</w:t>
-      </w:r>
-      <w:proofErr w:type="gramEnd"/>
-      <w:r>
-        <w:rPr>
-          <w:rFonts w:ascii="Arial" w:eastAsia="Arial" w:hAnsi="Arial" w:cs="Arial"/>
-          <w:sz w:val="24"/>
-          <w:szCs w:val="24"/>
-        </w:rPr>
-        <w:t xml:space="preserve"> menú de </w:t>
+        <w:t xml:space="preserve">El usuario selecciona la opción Salir desde el menú de </w:t>
       </w:r>
       <w:proofErr w:type="spellStart"/>
       <w:r>
@@ -11024,7 +11048,16 @@
           <w:sz w:val="24"/>
           <w:szCs w:val="24"/>
         </w:rPr>
-        <w:t>Las contraseñas nunca se almacenan ni transmiten en texto plano. El sistema aplica SHA-256 sobre la contraseña ingresada antes de cualquier operación de comparación o persistencia. La función de hash es unidireccional: no es posible recuperar la contraseña original a partir del hash almacenado. Esto garantiza que incluso ante un acceso no autorizado a la base de datos, las credenciales de los usuarios permanezcan protegidas.</w:t>
+        <w:t xml:space="preserve">Las contraseñas nunca se almacenan ni transmiten en texto plano. El sistema aplica SHA-256 sobre la contraseña ingresada antes de cualquier operación de comparación o persistencia. La función de hash es unidireccional: no es posible recuperar la contraseña original a partir del hash almacenado. Esto garantiza que incluso ante un </w:t>
+      </w:r>
+      <w:r>
+        <w:rPr>
+          <w:rFonts w:ascii="Arial" w:eastAsia="Arial" w:hAnsi="Arial" w:cs="Arial"/>
+          <w:sz w:val="24"/>
+          <w:szCs w:val="24"/>
+        </w:rPr>
+        <w:lastRenderedPageBreak/>
+        <w:t>acceso no autorizado a la base de datos, las credenciales de los usuarios permanezcan protegidas.</w:t>
       </w:r>
     </w:p>
     <w:p>
@@ -11035,7 +11068,6 @@
         <w:rPr>
           <w:rFonts w:eastAsia="Arial"/>
         </w:rPr>
-        <w:lastRenderedPageBreak/>
         <w:t>Control de sesión</w:t>
       </w:r>
     </w:p>
@@ -11067,7 +11099,25 @@
           <w:sz w:val="24"/>
           <w:szCs w:val="24"/>
         </w:rPr>
-        <w:t xml:space="preserve"> del Singleton actúa como el único mecanismo de control de acceso del sistema. Mientras esta propiedad sea </w:t>
+        <w:t xml:space="preserve"> del </w:t>
+      </w:r>
+      <w:proofErr w:type="spellStart"/>
+      <w:r>
+        <w:rPr>
+          <w:rFonts w:ascii="Arial" w:eastAsia="Arial" w:hAnsi="Arial" w:cs="Arial"/>
+          <w:sz w:val="24"/>
+          <w:szCs w:val="24"/>
+        </w:rPr>
+        <w:t>Singleton</w:t>
+      </w:r>
+      <w:proofErr w:type="spellEnd"/>
+      <w:r>
+        <w:rPr>
+          <w:rFonts w:ascii="Arial" w:eastAsia="Arial" w:hAnsi="Arial" w:cs="Arial"/>
+          <w:sz w:val="24"/>
+          <w:szCs w:val="24"/>
+        </w:rPr>
+        <w:t xml:space="preserve"> actúa como el único mecanismo de control de acceso del sistema. Mientras esta propiedad sea </w:t>
       </w:r>
       <w:proofErr w:type="spellStart"/>
       <w:r>
@@ -11215,7 +11265,7 @@
           <w:sz w:val="24"/>
           <w:szCs w:val="24"/>
         </w:rPr>
-        <w:t xml:space="preserve">), cualquier operación de Add, </w:t>
+        <w:t xml:space="preserve">), cualquier operación de </w:t>
       </w:r>
       <w:proofErr w:type="spellStart"/>
       <w:r>
@@ -11224,6 +11274,24 @@
           <w:sz w:val="24"/>
           <w:szCs w:val="24"/>
         </w:rPr>
+        <w:t>Add</w:t>
+      </w:r>
+      <w:proofErr w:type="spellEnd"/>
+      <w:r>
+        <w:rPr>
+          <w:rFonts w:ascii="Arial" w:eastAsia="Arial" w:hAnsi="Arial" w:cs="Arial"/>
+          <w:sz w:val="24"/>
+          <w:szCs w:val="24"/>
+        </w:rPr>
+        <w:t xml:space="preserve">, </w:t>
+      </w:r>
+      <w:proofErr w:type="spellStart"/>
+      <w:r>
+        <w:rPr>
+          <w:rFonts w:ascii="Arial" w:eastAsia="Arial" w:hAnsi="Arial" w:cs="Arial"/>
+          <w:sz w:val="24"/>
+          <w:szCs w:val="24"/>
+        </w:rPr>
         <w:t>Modify</w:t>
       </w:r>
       <w:proofErr w:type="spellEnd"/>
@@ -11233,7 +11301,43 @@
           <w:sz w:val="24"/>
           <w:szCs w:val="24"/>
         </w:rPr>
-        <w:t>, Delete o Login puede ser interceptada e instrumentada con un registro de bitácora sin modificar la UI ni la DAL. Este mecanismo está contemplado para ser desarrollado en T06 (Gestión de Bitácora y Control de Cambios).</w:t>
+        <w:t xml:space="preserve">, </w:t>
+      </w:r>
+      <w:proofErr w:type="spellStart"/>
+      <w:r>
+        <w:rPr>
+          <w:rFonts w:ascii="Arial" w:eastAsia="Arial" w:hAnsi="Arial" w:cs="Arial"/>
+          <w:sz w:val="24"/>
+          <w:szCs w:val="24"/>
+        </w:rPr>
+        <w:t>Delete</w:t>
+      </w:r>
+      <w:proofErr w:type="spellEnd"/>
+      <w:r>
+        <w:rPr>
+          <w:rFonts w:ascii="Arial" w:eastAsia="Arial" w:hAnsi="Arial" w:cs="Arial"/>
+          <w:sz w:val="24"/>
+          <w:szCs w:val="24"/>
+        </w:rPr>
+        <w:t xml:space="preserve"> o </w:t>
+      </w:r>
+      <w:proofErr w:type="spellStart"/>
+      <w:r>
+        <w:rPr>
+          <w:rFonts w:ascii="Arial" w:eastAsia="Arial" w:hAnsi="Arial" w:cs="Arial"/>
+          <w:sz w:val="24"/>
+          <w:szCs w:val="24"/>
+        </w:rPr>
+        <w:t>Login</w:t>
+      </w:r>
+      <w:proofErr w:type="spellEnd"/>
+      <w:r>
+        <w:rPr>
+          <w:rFonts w:ascii="Arial" w:eastAsia="Arial" w:hAnsi="Arial" w:cs="Arial"/>
+          <w:sz w:val="24"/>
+          <w:szCs w:val="24"/>
+        </w:rPr>
+        <w:t xml:space="preserve"> puede ser interceptada e instrumentada con un registro de bitácora sin modificar la UI ni la DAL. Este mecanismo está contemplado para ser desarrollado en T06 (Gestión de Bitácora y Control de Cambios).</w:t>
       </w:r>
     </w:p>
     <w:p>
@@ -11292,7 +11396,6 @@
         <w:pStyle w:val="Ttulo4"/>
       </w:pPr>
       <w:r>
-        <w:lastRenderedPageBreak/>
         <w:t>Política completa de sesión</w:t>
       </w:r>
     </w:p>
@@ -11367,7 +11470,6 @@
         <w:pStyle w:val="Ttulo4"/>
       </w:pPr>
       <w:r>
-        <w:lastRenderedPageBreak/>
         <w:t>Arranque del sistema</w:t>
       </w:r>
     </w:p>
@@ -11433,7 +11535,6 @@
         <w:rPr>
           <w:noProof/>
         </w:rPr>
-        <w:lastRenderedPageBreak/>
         <w:t>Proceso de Login</w:t>
       </w:r>
     </w:p>
@@ -11517,7 +11618,6 @@
         <w:rPr>
           <w:noProof/>
         </w:rPr>
-        <w:lastRenderedPageBreak/>
         <w:t>Flujo de registro de nuevo usuario</w:t>
       </w:r>
     </w:p>
@@ -11601,7 +11701,7 @@
                 <v:stroke joinstyle="miter"/>
                 <v:path gradientshapeok="t" o:connecttype="rect"/>
               </v:shapetype>
-              <v:shape id="Cuadro de texto 1" o:spid="_x0000_s1026" type="#_x0000_t202" style="position:absolute;left:0;text-align:left;margin-left:403.95pt;margin-top:.55pt;width:88.15pt;height:54.15pt;z-index:251673600;visibility:visible;mso-wrap-style:square;mso-height-percent:0;mso-wrap-distance-left:9pt;mso-wrap-distance-top:0;mso-wrap-distance-right:9pt;mso-wrap-distance-bottom:0;mso-position-horizontal:absolute;mso-position-horizontal-relative:text;mso-position-vertical:absolute;mso-position-vertical-relative:text;mso-height-percent:0;mso-height-relative:margin;v-text-anchor:top" o:gfxdata="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" filled="f" stroked="f" strokeweight=".5pt">
+              <v:shape id="Cuadro de texto 1" o:spid="_x0000_s1026" type="#_x0000_t202" style="position:absolute;left:0;text-align:left;margin-left:403.95pt;margin-top:.55pt;width:88.15pt;height:54.15pt;z-index:251673600;visibility:visible;mso-wrap-style:square;mso-height-percent:0;mso-wrap-distance-left:9pt;mso-wrap-distance-top:0;mso-wrap-distance-right:9pt;mso-wrap-distance-bottom:0;mso-position-horizontal:absolute;mso-position-horizontal-relative:text;mso-position-vertical:absolute;mso-position-vertical-relative:text;mso-height-percent:0;mso-height-relative:margin;v-text-anchor:top" o:gfxdata="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" filled="f" stroked="f" strokeweight=".5pt">
                 <v:textbox>
                   <w:txbxContent>
                     <w:p>
@@ -11698,7 +11798,6 @@
         <w:pStyle w:val="Ttulo4"/>
       </w:pPr>
       <w:r>
-        <w:lastRenderedPageBreak/>
         <w:t xml:space="preserve">Proceso de </w:t>
       </w:r>
       <w:proofErr w:type="spellStart"/>
@@ -12148,7 +12247,15 @@
           <w:sz w:val="24"/>
           <w:szCs w:val="24"/>
         </w:rPr>
-        <w:t xml:space="preserve">La gestión implementa el patrón Composite. La interfaz </w:t>
+        <w:t xml:space="preserve">La gestión implementa el patrón Composite. La </w:t>
+      </w:r>
+      <w:r>
+        <w:rPr>
+          <w:rFonts w:ascii="Arial" w:eastAsia="Arial" w:hAnsi="Arial" w:cs="Arial"/>
+          <w:sz w:val="24"/>
+          <w:szCs w:val="24"/>
+        </w:rPr>
+        <w:t xml:space="preserve">clase abstracta </w:t>
       </w:r>
       <w:proofErr w:type="spellStart"/>
       <w:r>
@@ -12157,7 +12264,7 @@
           <w:sz w:val="24"/>
           <w:szCs w:val="24"/>
         </w:rPr>
-        <w:t>IPermiso</w:t>
+        <w:t>PermisoBase</w:t>
       </w:r>
       <w:proofErr w:type="spellEnd"/>
       <w:r>
@@ -12166,7 +12273,39 @@
           <w:sz w:val="24"/>
           <w:szCs w:val="24"/>
         </w:rPr>
-        <w:t xml:space="preserve"> define el contrato común (Código, Nombre y el método </w:t>
+        <w:t xml:space="preserve"> define el contrato común (Código, Nombre y </w:t>
+      </w:r>
+      <w:r>
+        <w:rPr>
+          <w:rFonts w:ascii="Arial" w:eastAsia="Arial" w:hAnsi="Arial" w:cs="Arial"/>
+          <w:sz w:val="24"/>
+          <w:szCs w:val="24"/>
+        </w:rPr>
+        <w:t>los</w:t>
+      </w:r>
+      <w:r>
+        <w:rPr>
+          <w:rFonts w:ascii="Arial" w:eastAsia="Arial" w:hAnsi="Arial" w:cs="Arial"/>
+          <w:sz w:val="24"/>
+          <w:szCs w:val="24"/>
+        </w:rPr>
+        <w:t xml:space="preserve"> método</w:t>
+      </w:r>
+      <w:r>
+        <w:rPr>
+          <w:rFonts w:ascii="Arial" w:eastAsia="Arial" w:hAnsi="Arial" w:cs="Arial"/>
+          <w:sz w:val="24"/>
+          <w:szCs w:val="24"/>
+        </w:rPr>
+        <w:t>s</w:t>
+      </w:r>
+      <w:r>
+        <w:rPr>
+          <w:rFonts w:ascii="Arial" w:eastAsia="Arial" w:hAnsi="Arial" w:cs="Arial"/>
+          <w:sz w:val="24"/>
+          <w:szCs w:val="24"/>
+        </w:rPr>
+        <w:t xml:space="preserve"> </w:t>
       </w:r>
       <w:proofErr w:type="spellStart"/>
       <w:r>
@@ -12184,6 +12323,14 @@
           <w:sz w:val="24"/>
           <w:szCs w:val="24"/>
         </w:rPr>
+        <w:t>, Agregar y Quitar</w:t>
+      </w:r>
+      <w:r>
+        <w:rPr>
+          <w:rFonts w:ascii="Arial" w:eastAsia="Arial" w:hAnsi="Arial" w:cs="Arial"/>
+          <w:sz w:val="24"/>
+          <w:szCs w:val="24"/>
+        </w:rPr>
         <w:t xml:space="preserve">). </w:t>
       </w:r>
       <w:proofErr w:type="spellStart"/>
@@ -12229,6 +12376,7 @@
           <w:sz w:val="24"/>
           <w:szCs w:val="24"/>
         </w:rPr>
+        <w:lastRenderedPageBreak/>
         <w:t>TienePermiso</w:t>
       </w:r>
       <w:proofErr w:type="spellEnd"/>
@@ -12238,16 +12386,7 @@
           <w:sz w:val="24"/>
           <w:szCs w:val="24"/>
         </w:rPr>
-        <w:t xml:space="preserve"> de forma </w:t>
-      </w:r>
-      <w:r>
-        <w:rPr>
-          <w:rFonts w:ascii="Arial" w:eastAsia="Arial" w:hAnsi="Arial" w:cs="Arial"/>
-          <w:sz w:val="24"/>
-          <w:szCs w:val="24"/>
-        </w:rPr>
-        <w:lastRenderedPageBreak/>
-        <w:t>recursiva, recorriendo todo su subárbol. Gracias a esta recursión, un conjunto puede contener otros conjuntos sin límite de profundidad.</w:t>
+        <w:t xml:space="preserve"> de forma recursiva, recorriendo todo su subárbol. Gracias a esta recursión, un conjunto puede contener otros conjuntos sin límite de profundidad.</w:t>
       </w:r>
     </w:p>
     <w:p>
@@ -13503,10 +13642,10 @@
           <w:noProof/>
         </w:rPr>
         <w:drawing>
-          <wp:inline distT="0" distB="0" distL="0" distR="0" wp14:anchorId="07922E94" wp14:editId="6C7DBFDC">
-            <wp:extent cx="3785616" cy="7011213"/>
-            <wp:effectExtent l="0" t="0" r="5715" b="0"/>
-            <wp:docPr id="404266006" name="Imagen 6"/>
+          <wp:inline distT="0" distB="0" distL="0" distR="0" wp14:anchorId="16361278" wp14:editId="6FF64F5B">
+            <wp:extent cx="4029075" cy="7060548"/>
+            <wp:effectExtent l="0" t="0" r="0" b="7620"/>
+            <wp:docPr id="1" name="Imagen 1"/>
             <wp:cNvGraphicFramePr>
               <a:graphicFrameLocks xmlns:a="http://schemas.openxmlformats.org/drawingml/2006/main" noChangeAspect="1"/>
             </wp:cNvGraphicFramePr>
@@ -13514,7 +13653,7 @@
               <a:graphicData uri="http://schemas.openxmlformats.org/drawingml/2006/picture">
                 <pic:pic xmlns:pic="http://schemas.openxmlformats.org/drawingml/2006/picture">
                   <pic:nvPicPr>
-                    <pic:cNvPr id="0" name="Picture 5"/>
+                    <pic:cNvPr id="0" name="Picture 1"/>
                     <pic:cNvPicPr>
                       <a:picLocks noChangeAspect="1" noChangeArrowheads="1"/>
                     </pic:cNvPicPr>
@@ -13535,7 +13674,7 @@
                   <pic:spPr bwMode="auto">
                     <a:xfrm>
                       <a:off x="0" y="0"/>
-                      <a:ext cx="3796955" cy="7032214"/>
+                      <a:ext cx="4042134" cy="7083432"/>
                     </a:xfrm>
                     <a:prstGeom prst="rect">
                       <a:avLst/>
@@ -16181,7 +16320,25 @@
           <w:sz w:val="24"/>
           <w:szCs w:val="24"/>
         </w:rPr>
-        <w:t>, implementada como Singleton para garantizar un punto único de registro. Las distintas capas de negocio invocan sus métodos (</w:t>
+        <w:t xml:space="preserve">, implementada como </w:t>
+      </w:r>
+      <w:proofErr w:type="spellStart"/>
+      <w:r>
+        <w:rPr>
+          <w:rFonts w:ascii="Arial" w:eastAsia="Arial" w:hAnsi="Arial" w:cs="Arial"/>
+          <w:sz w:val="24"/>
+          <w:szCs w:val="24"/>
+        </w:rPr>
+        <w:t>Singleton</w:t>
+      </w:r>
+      <w:proofErr w:type="spellEnd"/>
+      <w:r>
+        <w:rPr>
+          <w:rFonts w:ascii="Arial" w:eastAsia="Arial" w:hAnsi="Arial" w:cs="Arial"/>
+          <w:sz w:val="24"/>
+          <w:szCs w:val="24"/>
+        </w:rPr>
+        <w:t xml:space="preserve"> para garantizar un punto único de registro. Las distintas capas de negocio invocan sus métodos (</w:t>
       </w:r>
       <w:proofErr w:type="spellStart"/>
       <w:r>
@@ -17926,7 +18083,7 @@
 </file>
 
 <file path=word/endnotes.xml><?xml version="1.0" encoding="utf-8"?>
-<w:endnotes xmlns:wpc="http://schemas.microsoft.com/office/word/2010/wordprocessingCanvas" xmlns:cx="http://schemas.microsoft.com/office/drawing/2014/chartex" xmlns:cx1="http://schemas.microsoft.com/office/drawing/2015/9/8/chartex" xmlns:cx2="http://schemas.microsoft.com/office/drawing/2015/10/21/chartex" xmlns:cx3="http://schemas.microsoft.com/office/drawing/2016/5/9/chartex" xmlns:cx4="http://schemas.microsoft.com/office/drawing/2016/5/10/chartex" xmlns:cx5="http://schemas.microsoft.com/office/drawing/2016/5/11/chartex" xmlns:cx6="http://schemas.microsoft.com/office/drawing/2016/5/12/chartex" xmlns:cx7="http://schemas.microsoft.com/office/drawing/2016/5/13/chartex" xmlns:cx8="http://schemas.microsoft.com/office/drawing/2016/5/14/chartex" xmlns:mc="http://schemas.openxmlformats.org/markup-compatibility/2006" xmlns:aink="http://schemas.microsoft.com/office/drawing/2016/ink" xmlns:am3d="http://schemas.microsoft.com/office/drawing/2017/model3d" xmlns:o="urn:schemas-microsoft-com:office:office" xmlns:oel="http://schemas.microsoft.com/office/2019/extlst" xmlns:r="http://schemas.openxmlformats.org/officeDocument/2006/relationships" xmlns:m="http://schemas.openxmlformats.org/officeDocument/2006/math" xmlns:v="urn:schemas-microsoft-com:vml" xmlns:wp14="http://schemas.microsoft.com/office/word/2010/wordprocessingDrawing" xmlns:wp="http://schemas.openxmlformats.org/drawingml/2006/wordprocessingDrawing" xmlns:w10="urn:schemas-microsoft-com:office:word" xmlns:w="http://schemas.openxmlformats.org/wordprocessingml/2006/main" xmlns:w14="http://schemas.microsoft.com/office/word/2010/wordml" xmlns:w15="http://schemas.microsoft.com/office/word/2012/wordml" xmlns:w16cex="http://schemas.microsoft.com/office/word/2018/wordml/cex" xmlns:w16cid="http://schemas.microsoft.com/office/word/2016/wordml/cid" xmlns:w16="http://schemas.microsoft.com/office/word/2018/wordml" xmlns:w16du="http://schemas.microsoft.com/office/word/2023/wordml/word16du" xmlns:w16sdtdh="http://schemas.microsoft.com/office/word/2020/wordml/sdtdatahash" xmlns:w16sdtfl="http://schemas.microsoft.com/office/word/2024/wordml/sdtformatlock" xmlns:w16se="http://schemas.microsoft.com/office/word/2015/wordml/symex" xmlns:wpg="http://schemas.microsoft.com/office/word/2010/wordprocessingGroup" xmlns:wpi="http://schemas.microsoft.com/office/word/2010/wordprocessingInk" xmlns:wne="http://schemas.microsoft.com/office/word/2006/wordml" xmlns:wps="http://schemas.microsoft.com/office/word/2010/wordprocessingShape" mc:Ignorable="w14 w15 w16se w16cid w16 w16cex w16sdtdh w16sdtfl w16du wp14">
+<w:endnotes xmlns:wpc="http://schemas.microsoft.com/office/word/2010/wordprocessingCanvas" xmlns:cx="http://schemas.microsoft.com/office/drawing/2014/chartex" xmlns:cx1="http://schemas.microsoft.com/office/drawing/2015/9/8/chartex" xmlns:cx2="http://schemas.microsoft.com/office/drawing/2015/10/21/chartex" xmlns:cx3="http://schemas.microsoft.com/office/drawing/2016/5/9/chartex" xmlns:cx4="http://schemas.microsoft.com/office/drawing/2016/5/10/chartex" xmlns:cx5="http://schemas.microsoft.com/office/drawing/2016/5/11/chartex" xmlns:cx6="http://schemas.microsoft.com/office/drawing/2016/5/12/chartex" xmlns:cx7="http://schemas.microsoft.com/office/drawing/2016/5/13/chartex" xmlns:cx8="http://schemas.microsoft.com/office/drawing/2016/5/14/chartex" xmlns:mc="http://schemas.openxmlformats.org/markup-compatibility/2006" xmlns:aink="http://schemas.microsoft.com/office/drawing/2016/ink" xmlns:am3d="http://schemas.microsoft.com/office/drawing/2017/model3d" xmlns:o="urn:schemas-microsoft-com:office:office" xmlns:r="http://schemas.openxmlformats.org/officeDocument/2006/relationships" xmlns:m="http://schemas.openxmlformats.org/officeDocument/2006/math" xmlns:v="urn:schemas-microsoft-com:vml" xmlns:wp14="http://schemas.microsoft.com/office/word/2010/wordprocessingDrawing" xmlns:wp="http://schemas.openxmlformats.org/drawingml/2006/wordprocessingDrawing" xmlns:w10="urn:schemas-microsoft-com:office:word" xmlns:w="http://schemas.openxmlformats.org/wordprocessingml/2006/main" xmlns:w14="http://schemas.microsoft.com/office/word/2010/wordml" xmlns:w15="http://schemas.microsoft.com/office/word/2012/wordml" xmlns:w16cex="http://schemas.microsoft.com/office/word/2018/wordml/cex" xmlns:w16cid="http://schemas.microsoft.com/office/word/2016/wordml/cid" xmlns:w16="http://schemas.microsoft.com/office/word/2018/wordml" xmlns:w16sdtdh="http://schemas.microsoft.com/office/word/2020/wordml/sdtdatahash" xmlns:w16se="http://schemas.microsoft.com/office/word/2015/wordml/symex" xmlns:wpg="http://schemas.microsoft.com/office/word/2010/wordprocessingGroup" xmlns:wpi="http://schemas.microsoft.com/office/word/2010/wordprocessingInk" xmlns:wne="http://schemas.microsoft.com/office/word/2006/wordml" xmlns:wps="http://schemas.microsoft.com/office/word/2010/wordprocessingShape" mc:Ignorable="w14 w15 w16se w16cid w16 w16cex w16sdtdh wp14">
   <w:endnote w:type="separator" w:id="-1">
     <w:p>
       <w:pPr>
@@ -17951,7 +18108,7 @@
 </file>
 
 <file path=word/footer1.xml><?xml version="1.0" encoding="utf-8"?>
-<w:ftr xmlns:wpc="http://schemas.microsoft.com/office/word/2010/wordprocessingCanvas" xmlns:cx="http://schemas.microsoft.com/office/drawing/2014/chartex" xmlns:cx1="http://schemas.microsoft.com/office/drawing/2015/9/8/chartex" xmlns:cx2="http://schemas.microsoft.com/office/drawing/2015/10/21/chartex" xmlns:cx3="http://schemas.microsoft.com/office/drawing/2016/5/9/chartex" xmlns:cx4="http://schemas.microsoft.com/office/drawing/2016/5/10/chartex" xmlns:cx5="http://schemas.microsoft.com/office/drawing/2016/5/11/chartex" xmlns:cx6="http://schemas.microsoft.com/office/drawing/2016/5/12/chartex" xmlns:cx7="http://schemas.microsoft.com/office/drawing/2016/5/13/chartex" xmlns:cx8="http://schemas.microsoft.com/office/drawing/2016/5/14/chartex" xmlns:mc="http://schemas.openxmlformats.org/markup-compatibility/2006" xmlns:aink="http://schemas.microsoft.com/office/drawing/2016/ink" xmlns:am3d="http://schemas.microsoft.com/office/drawing/2017/model3d" xmlns:o="urn:schemas-microsoft-com:office:office" xmlns:oel="http://schemas.microsoft.com/office/2019/extlst" xmlns:r="http://schemas.openxmlformats.org/officeDocument/2006/relationships" xmlns:m="http://schemas.openxmlformats.org/officeDocument/2006/math" xmlns:v="urn:schemas-microsoft-com:vml" xmlns:wp14="http://schemas.microsoft.com/office/word/2010/wordprocessingDrawing" xmlns:wp="http://schemas.openxmlformats.org/drawingml/2006/wordprocessingDrawing" xmlns:w10="urn:schemas-microsoft-com:office:word" xmlns:w="http://schemas.openxmlformats.org/wordprocessingml/2006/main" xmlns:w14="http://schemas.microsoft.com/office/word/2010/wordml" xmlns:w15="http://schemas.microsoft.com/office/word/2012/wordml" xmlns:w16cex="http://schemas.microsoft.com/office/word/2018/wordml/cex" xmlns:w16cid="http://schemas.microsoft.com/office/word/2016/wordml/cid" xmlns:w16="http://schemas.microsoft.com/office/word/2018/wordml" xmlns:w16du="http://schemas.microsoft.com/office/word/2023/wordml/word16du" xmlns:w16sdtdh="http://schemas.microsoft.com/office/word/2020/wordml/sdtdatahash" xmlns:w16sdtfl="http://schemas.microsoft.com/office/word/2024/wordml/sdtformatlock" xmlns:w16se="http://schemas.microsoft.com/office/word/2015/wordml/symex" xmlns:wpg="http://schemas.microsoft.com/office/word/2010/wordprocessingGroup" xmlns:wpi="http://schemas.microsoft.com/office/word/2010/wordprocessingInk" xmlns:wne="http://schemas.microsoft.com/office/word/2006/wordml" xmlns:wps="http://schemas.microsoft.com/office/word/2010/wordprocessingShape" mc:Ignorable="w14 w15 w16se w16cid w16 w16cex w16sdtdh w16sdtfl w16du wp14">
+<w:ftr xmlns:wpc="http://schemas.microsoft.com/office/word/2010/wordprocessingCanvas" xmlns:cx="http://schemas.microsoft.com/office/drawing/2014/chartex" xmlns:cx1="http://schemas.microsoft.com/office/drawing/2015/9/8/chartex" xmlns:cx2="http://schemas.microsoft.com/office/drawing/2015/10/21/chartex" xmlns:cx3="http://schemas.microsoft.com/office/drawing/2016/5/9/chartex" xmlns:cx4="http://schemas.microsoft.com/office/drawing/2016/5/10/chartex" xmlns:cx5="http://schemas.microsoft.com/office/drawing/2016/5/11/chartex" xmlns:cx6="http://schemas.microsoft.com/office/drawing/2016/5/12/chartex" xmlns:cx7="http://schemas.microsoft.com/office/drawing/2016/5/13/chartex" xmlns:cx8="http://schemas.microsoft.com/office/drawing/2016/5/14/chartex" xmlns:mc="http://schemas.openxmlformats.org/markup-compatibility/2006" xmlns:aink="http://schemas.microsoft.com/office/drawing/2016/ink" xmlns:am3d="http://schemas.microsoft.com/office/drawing/2017/model3d" xmlns:o="urn:schemas-microsoft-com:office:office" xmlns:r="http://schemas.openxmlformats.org/officeDocument/2006/relationships" xmlns:m="http://schemas.openxmlformats.org/officeDocument/2006/math" xmlns:v="urn:schemas-microsoft-com:vml" xmlns:wp14="http://schemas.microsoft.com/office/word/2010/wordprocessingDrawing" xmlns:wp="http://schemas.openxmlformats.org/drawingml/2006/wordprocessingDrawing" xmlns:w10="urn:schemas-microsoft-com:office:word" xmlns:w="http://schemas.openxmlformats.org/wordprocessingml/2006/main" xmlns:w14="http://schemas.microsoft.com/office/word/2010/wordml" xmlns:w15="http://schemas.microsoft.com/office/word/2012/wordml" xmlns:w16cex="http://schemas.microsoft.com/office/word/2018/wordml/cex" xmlns:w16cid="http://schemas.microsoft.com/office/word/2016/wordml/cid" xmlns:w16="http://schemas.microsoft.com/office/word/2018/wordml" xmlns:w16sdtdh="http://schemas.microsoft.com/office/word/2020/wordml/sdtdatahash" xmlns:w16se="http://schemas.microsoft.com/office/word/2015/wordml/symex" xmlns:wpg="http://schemas.microsoft.com/office/word/2010/wordprocessingGroup" xmlns:wpi="http://schemas.microsoft.com/office/word/2010/wordprocessingInk" xmlns:wne="http://schemas.microsoft.com/office/word/2006/wordml" xmlns:wps="http://schemas.microsoft.com/office/word/2010/wordprocessingShape" mc:Ignorable="w14 w15 w16se w16cid w16 w16cex w16sdtdh wp14">
   <w:sdt>
     <w:sdtPr>
       <w:id w:val="-851719450"/>
@@ -17960,6 +18117,7 @@
         <w:docPartUnique/>
       </w:docPartObj>
     </w:sdtPr>
+    <w:sdtEndPr/>
     <w:sdtContent>
       <w:p>
         <w:pPr>
@@ -17996,7 +18154,7 @@
 </file>
 
 <file path=word/footer2.xml><?xml version="1.0" encoding="utf-8"?>
-<w:ftr xmlns:wpc="http://schemas.microsoft.com/office/word/2010/wordprocessingCanvas" xmlns:cx="http://schemas.microsoft.com/office/drawing/2014/chartex" xmlns:cx1="http://schemas.microsoft.com/office/drawing/2015/9/8/chartex" xmlns:cx2="http://schemas.microsoft.com/office/drawing/2015/10/21/chartex" xmlns:cx3="http://schemas.microsoft.com/office/drawing/2016/5/9/chartex" xmlns:cx4="http://schemas.microsoft.com/office/drawing/2016/5/10/chartex" xmlns:cx5="http://schemas.microsoft.com/office/drawing/2016/5/11/chartex" xmlns:cx6="http://schemas.microsoft.com/office/drawing/2016/5/12/chartex" xmlns:cx7="http://schemas.microsoft.com/office/drawing/2016/5/13/chartex" xmlns:cx8="http://schemas.microsoft.com/office/drawing/2016/5/14/chartex" xmlns:mc="http://schemas.openxmlformats.org/markup-compatibility/2006" xmlns:aink="http://schemas.microsoft.com/office/drawing/2016/ink" xmlns:am3d="http://schemas.microsoft.com/office/drawing/2017/model3d" xmlns:o="urn:schemas-microsoft-com:office:office" xmlns:oel="http://schemas.microsoft.com/office/2019/extlst" xmlns:r="http://schemas.openxmlformats.org/officeDocument/2006/relationships" xmlns:m="http://schemas.openxmlformats.org/officeDocument/2006/math" xmlns:v="urn:schemas-microsoft-com:vml" xmlns:wp14="http://schemas.microsoft.com/office/word/2010/wordprocessingDrawing" xmlns:wp="http://schemas.openxmlformats.org/drawingml/2006/wordprocessingDrawing" xmlns:w10="urn:schemas-microsoft-com:office:word" xmlns:w="http://schemas.openxmlformats.org/wordprocessingml/2006/main" xmlns:w14="http://schemas.microsoft.com/office/word/2010/wordml" xmlns:w15="http://schemas.microsoft.com/office/word/2012/wordml" xmlns:w16cex="http://schemas.microsoft.com/office/word/2018/wordml/cex" xmlns:w16cid="http://schemas.microsoft.com/office/word/2016/wordml/cid" xmlns:w16="http://schemas.microsoft.com/office/word/2018/wordml" xmlns:w16du="http://schemas.microsoft.com/office/word/2023/wordml/word16du" xmlns:w16sdtdh="http://schemas.microsoft.com/office/word/2020/wordml/sdtdatahash" xmlns:w16sdtfl="http://schemas.microsoft.com/office/word/2024/wordml/sdtformatlock" xmlns:w16se="http://schemas.microsoft.com/office/word/2015/wordml/symex" xmlns:wpg="http://schemas.microsoft.com/office/word/2010/wordprocessingGroup" xmlns:wpi="http://schemas.microsoft.com/office/word/2010/wordprocessingInk" xmlns:wne="http://schemas.microsoft.com/office/word/2006/wordml" xmlns:wps="http://schemas.microsoft.com/office/word/2010/wordprocessingShape" mc:Ignorable="w14 w15 w16se w16cid w16 w16cex w16sdtdh w16sdtfl w16du wp14">
+<w:ftr xmlns:wpc="http://schemas.microsoft.com/office/word/2010/wordprocessingCanvas" xmlns:cx="http://schemas.microsoft.com/office/drawing/2014/chartex" xmlns:cx1="http://schemas.microsoft.com/office/drawing/2015/9/8/chartex" xmlns:cx2="http://schemas.microsoft.com/office/drawing/2015/10/21/chartex" xmlns:cx3="http://schemas.microsoft.com/office/drawing/2016/5/9/chartex" xmlns:cx4="http://schemas.microsoft.com/office/drawing/2016/5/10/chartex" xmlns:cx5="http://schemas.microsoft.com/office/drawing/2016/5/11/chartex" xmlns:cx6="http://schemas.microsoft.com/office/drawing/2016/5/12/chartex" xmlns:cx7="http://schemas.microsoft.com/office/drawing/2016/5/13/chartex" xmlns:cx8="http://schemas.microsoft.com/office/drawing/2016/5/14/chartex" xmlns:mc="http://schemas.openxmlformats.org/markup-compatibility/2006" xmlns:aink="http://schemas.microsoft.com/office/drawing/2016/ink" xmlns:am3d="http://schemas.microsoft.com/office/drawing/2017/model3d" xmlns:o="urn:schemas-microsoft-com:office:office" xmlns:r="http://schemas.openxmlformats.org/officeDocument/2006/relationships" xmlns:m="http://schemas.openxmlformats.org/officeDocument/2006/math" xmlns:v="urn:schemas-microsoft-com:vml" xmlns:wp14="http://schemas.microsoft.com/office/word/2010/wordprocessingDrawing" xmlns:wp="http://schemas.openxmlformats.org/drawingml/2006/wordprocessingDrawing" xmlns:w10="urn:schemas-microsoft-com:office:word" xmlns:w="http://schemas.openxmlformats.org/wordprocessingml/2006/main" xmlns:w14="http://schemas.microsoft.com/office/word/2010/wordml" xmlns:w15="http://schemas.microsoft.com/office/word/2012/wordml" xmlns:w16cex="http://schemas.microsoft.com/office/word/2018/wordml/cex" xmlns:w16cid="http://schemas.microsoft.com/office/word/2016/wordml/cid" xmlns:w16="http://schemas.microsoft.com/office/word/2018/wordml" xmlns:w16sdtdh="http://schemas.microsoft.com/office/word/2020/wordml/sdtdatahash" xmlns:w16se="http://schemas.microsoft.com/office/word/2015/wordml/symex" xmlns:wpg="http://schemas.microsoft.com/office/word/2010/wordprocessingGroup" xmlns:wpi="http://schemas.microsoft.com/office/word/2010/wordprocessingInk" xmlns:wne="http://schemas.microsoft.com/office/word/2006/wordml" xmlns:wps="http://schemas.microsoft.com/office/word/2010/wordprocessingShape" mc:Ignorable="w14 w15 w16se w16cid w16 w16cex w16sdtdh wp14">
   <w:sdt>
     <w:sdtPr>
       <w:id w:val="101928360"/>
@@ -18005,6 +18163,7 @@
         <w:docPartUnique/>
       </w:docPartObj>
     </w:sdtPr>
+    <w:sdtEndPr/>
     <w:sdtContent>
       <w:p>
         <w:pPr>
@@ -18041,7 +18200,7 @@
 </file>
 
 <file path=word/footnotes.xml><?xml version="1.0" encoding="utf-8"?>
-<w:footnotes xmlns:wpc="http://schemas.microsoft.com/office/word/2010/wordprocessingCanvas" xmlns:cx="http://schemas.microsoft.com/office/drawing/2014/chartex" xmlns:cx1="http://schemas.microsoft.com/office/drawing/2015/9/8/chartex" xmlns:cx2="http://schemas.microsoft.com/office/drawing/2015/10/21/chartex" xmlns:cx3="http://schemas.microsoft.com/office/drawing/2016/5/9/chartex" xmlns:cx4="http://schemas.microsoft.com/office/drawing/2016/5/10/chartex" xmlns:cx5="http://schemas.microsoft.com/office/drawing/2016/5/11/chartex" xmlns:cx6="http://schemas.microsoft.com/office/drawing/2016/5/12/chartex" xmlns:cx7="http://schemas.microsoft.com/office/drawing/2016/5/13/chartex" xmlns:cx8="http://schemas.microsoft.com/office/drawing/2016/5/14/chartex" xmlns:mc="http://schemas.openxmlformats.org/markup-compatibility/2006" xmlns:aink="http://schemas.microsoft.com/office/drawing/2016/ink" xmlns:am3d="http://schemas.microsoft.com/office/drawing/2017/model3d" xmlns:o="urn:schemas-microsoft-com:office:office" xmlns:oel="http://schemas.microsoft.com/office/2019/extlst" xmlns:r="http://schemas.openxmlformats.org/officeDocument/2006/relationships" xmlns:m="http://schemas.openxmlformats.org/officeDocument/2006/math" xmlns:v="urn:schemas-microsoft-com:vml" xmlns:wp14="http://schemas.microsoft.com/office/word/2010/wordprocessingDrawing" xmlns:wp="http://schemas.openxmlformats.org/drawingml/2006/wordprocessingDrawing" xmlns:w10="urn:schemas-microsoft-com:office:word" xmlns:w="http://schemas.openxmlformats.org/wordprocessingml/2006/main" xmlns:w14="http://schemas.microsoft.com/office/word/2010/wordml" xmlns:w15="http://schemas.microsoft.com/office/word/2012/wordml" xmlns:w16cex="http://schemas.microsoft.com/office/word/2018/wordml/cex" xmlns:w16cid="http://schemas.microsoft.com/office/word/2016/wordml/cid" xmlns:w16="http://schemas.microsoft.com/office/word/2018/wordml" xmlns:w16du="http://schemas.microsoft.com/office/word/2023/wordml/word16du" xmlns:w16sdtdh="http://schemas.microsoft.com/office/word/2020/wordml/sdtdatahash" xmlns:w16sdtfl="http://schemas.microsoft.com/office/word/2024/wordml/sdtformatlock" xmlns:w16se="http://schemas.microsoft.com/office/word/2015/wordml/symex" xmlns:wpg="http://schemas.microsoft.com/office/word/2010/wordprocessingGroup" xmlns:wpi="http://schemas.microsoft.com/office/word/2010/wordprocessingInk" xmlns:wne="http://schemas.microsoft.com/office/word/2006/wordml" xmlns:wps="http://schemas.microsoft.com/office/word/2010/wordprocessingShape" mc:Ignorable="w14 w15 w16se w16cid w16 w16cex w16sdtdh w16sdtfl w16du wp14">
+<w:footnotes xmlns:wpc="http://schemas.microsoft.com/office/word/2010/wordprocessingCanvas" xmlns:cx="http://schemas.microsoft.com/office/drawing/2014/chartex" xmlns:cx1="http://schemas.microsoft.com/office/drawing/2015/9/8/chartex" xmlns:cx2="http://schemas.microsoft.com/office/drawing/2015/10/21/chartex" xmlns:cx3="http://schemas.microsoft.com/office/drawing/2016/5/9/chartex" xmlns:cx4="http://schemas.microsoft.com/office/drawing/2016/5/10/chartex" xmlns:cx5="http://schemas.microsoft.com/office/drawing/2016/5/11/chartex" xmlns:cx6="http://schemas.microsoft.com/office/drawing/2016/5/12/chartex" xmlns:cx7="http://schemas.microsoft.com/office/drawing/2016/5/13/chartex" xmlns:cx8="http://schemas.microsoft.com/office/drawing/2016/5/14/chartex" xmlns:mc="http://schemas.openxmlformats.org/markup-compatibility/2006" xmlns:aink="http://schemas.microsoft.com/office/drawing/2016/ink" xmlns:am3d="http://schemas.microsoft.com/office/drawing/2017/model3d" xmlns:o="urn:schemas-microsoft-com:office:office" xmlns:r="http://schemas.openxmlformats.org/officeDocument/2006/relationships" xmlns:m="http://schemas.openxmlformats.org/officeDocument/2006/math" xmlns:v="urn:schemas-microsoft-com:vml" xmlns:wp14="http://schemas.microsoft.com/office/word/2010/wordprocessingDrawing" xmlns:wp="http://schemas.openxmlformats.org/drawingml/2006/wordprocessingDrawing" xmlns:w10="urn:schemas-microsoft-com:office:word" xmlns:w="http://schemas.openxmlformats.org/wordprocessingml/2006/main" xmlns:w14="http://schemas.microsoft.com/office/word/2010/wordml" xmlns:w15="http://schemas.microsoft.com/office/word/2012/wordml" xmlns:w16cex="http://schemas.microsoft.com/office/word/2018/wordml/cex" xmlns:w16cid="http://schemas.microsoft.com/office/word/2016/wordml/cid" xmlns:w16="http://schemas.microsoft.com/office/word/2018/wordml" xmlns:w16sdtdh="http://schemas.microsoft.com/office/word/2020/wordml/sdtdatahash" xmlns:w16se="http://schemas.microsoft.com/office/word/2015/wordml/symex" xmlns:wpg="http://schemas.microsoft.com/office/word/2010/wordprocessingGroup" xmlns:wpi="http://schemas.microsoft.com/office/word/2010/wordprocessingInk" xmlns:wne="http://schemas.microsoft.com/office/word/2006/wordml" xmlns:wps="http://schemas.microsoft.com/office/word/2010/wordprocessingShape" mc:Ignorable="w14 w15 w16se w16cid w16 w16cex w16sdtdh wp14">
   <w:footnote w:type="separator" w:id="-1">
     <w:p>
       <w:pPr>
@@ -18066,7 +18225,7 @@
 </file>
 
 <file path=word/header1.xml><?xml version="1.0" encoding="utf-8"?>
-<w:hdr xmlns:wpc="http://schemas.microsoft.com/office/word/2010/wordprocessingCanvas" xmlns:cx="http://schemas.microsoft.com/office/drawing/2014/chartex" xmlns:cx1="http://schemas.microsoft.com/office/drawing/2015/9/8/chartex" xmlns:cx2="http://schemas.microsoft.com/office/drawing/2015/10/21/chartex" xmlns:cx3="http://schemas.microsoft.com/office/drawing/2016/5/9/chartex" xmlns:cx4="http://schemas.microsoft.com/office/drawing/2016/5/10/chartex" xmlns:cx5="http://schemas.microsoft.com/office/drawing/2016/5/11/chartex" xmlns:cx6="http://schemas.microsoft.com/office/drawing/2016/5/12/chartex" xmlns:cx7="http://schemas.microsoft.com/office/drawing/2016/5/13/chartex" xmlns:cx8="http://schemas.microsoft.com/office/drawing/2016/5/14/chartex" xmlns:mc="http://schemas.openxmlformats.org/markup-compatibility/2006" xmlns:aink="http://schemas.microsoft.com/office/drawing/2016/ink" xmlns:am3d="http://schemas.microsoft.com/office/drawing/2017/model3d" xmlns:o="urn:schemas-microsoft-com:office:office" xmlns:oel="http://schemas.microsoft.com/office/2019/extlst" xmlns:r="http://schemas.openxmlformats.org/officeDocument/2006/relationships" xmlns:m="http://schemas.openxmlformats.org/officeDocument/2006/math" xmlns:v="urn:schemas-microsoft-com:vml" xmlns:wp14="http://schemas.microsoft.com/office/word/2010/wordprocessingDrawing" xmlns:wp="http://schemas.openxmlformats.org/drawingml/2006/wordprocessingDrawing" xmlns:w10="urn:schemas-microsoft-com:office:word" xmlns:w="http://schemas.openxmlformats.org/wordprocessingml/2006/main" xmlns:w14="http://schemas.microsoft.com/office/word/2010/wordml" xmlns:w15="http://schemas.microsoft.com/office/word/2012/wordml" xmlns:w16cex="http://schemas.microsoft.com/office/word/2018/wordml/cex" xmlns:w16cid="http://schemas.microsoft.com/office/word/2016/wordml/cid" xmlns:w16="http://schemas.microsoft.com/office/word/2018/wordml" xmlns:w16du="http://schemas.microsoft.com/office/word/2023/wordml/word16du" xmlns:w16sdtdh="http://schemas.microsoft.com/office/word/2020/wordml/sdtdatahash" xmlns:w16sdtfl="http://schemas.microsoft.com/office/word/2024/wordml/sdtformatlock" xmlns:w16se="http://schemas.microsoft.com/office/word/2015/wordml/symex" xmlns:wpg="http://schemas.microsoft.com/office/word/2010/wordprocessingGroup" xmlns:wpi="http://schemas.microsoft.com/office/word/2010/wordprocessingInk" xmlns:wne="http://schemas.microsoft.com/office/word/2006/wordml" xmlns:wps="http://schemas.microsoft.com/office/word/2010/wordprocessingShape" mc:Ignorable="w14 w15 w16se w16cid w16 w16cex w16sdtdh w16sdtfl w16du wp14">
+<w:hdr xmlns:wpc="http://schemas.microsoft.com/office/word/2010/wordprocessingCanvas" xmlns:cx="http://schemas.microsoft.com/office/drawing/2014/chartex" xmlns:cx1="http://schemas.microsoft.com/office/drawing/2015/9/8/chartex" xmlns:cx2="http://schemas.microsoft.com/office/drawing/2015/10/21/chartex" xmlns:cx3="http://schemas.microsoft.com/office/drawing/2016/5/9/chartex" xmlns:cx4="http://schemas.microsoft.com/office/drawing/2016/5/10/chartex" xmlns:cx5="http://schemas.microsoft.com/office/drawing/2016/5/11/chartex" xmlns:cx6="http://schemas.microsoft.com/office/drawing/2016/5/12/chartex" xmlns:cx7="http://schemas.microsoft.com/office/drawing/2016/5/13/chartex" xmlns:cx8="http://schemas.microsoft.com/office/drawing/2016/5/14/chartex" xmlns:mc="http://schemas.openxmlformats.org/markup-compatibility/2006" xmlns:aink="http://schemas.microsoft.com/office/drawing/2016/ink" xmlns:am3d="http://schemas.microsoft.com/office/drawing/2017/model3d" xmlns:o="urn:schemas-microsoft-com:office:office" xmlns:r="http://schemas.openxmlformats.org/officeDocument/2006/relationships" xmlns:m="http://schemas.openxmlformats.org/officeDocument/2006/math" xmlns:v="urn:schemas-microsoft-com:vml" xmlns:wp14="http://schemas.microsoft.com/office/word/2010/wordprocessingDrawing" xmlns:wp="http://schemas.openxmlformats.org/drawingml/2006/wordprocessingDrawing" xmlns:w10="urn:schemas-microsoft-com:office:word" xmlns:w="http://schemas.openxmlformats.org/wordprocessingml/2006/main" xmlns:w14="http://schemas.microsoft.com/office/word/2010/wordml" xmlns:w15="http://schemas.microsoft.com/office/word/2012/wordml" xmlns:w16cex="http://schemas.microsoft.com/office/word/2018/wordml/cex" xmlns:w16cid="http://schemas.microsoft.com/office/word/2016/wordml/cid" xmlns:w16="http://schemas.microsoft.com/office/word/2018/wordml" xmlns:w16sdtdh="http://schemas.microsoft.com/office/word/2020/wordml/sdtdatahash" xmlns:w16se="http://schemas.microsoft.com/office/word/2015/wordml/symex" xmlns:wpg="http://schemas.microsoft.com/office/word/2010/wordprocessingGroup" xmlns:wpi="http://schemas.microsoft.com/office/word/2010/wordprocessingInk" xmlns:wne="http://schemas.microsoft.com/office/word/2006/wordml" xmlns:wps="http://schemas.microsoft.com/office/word/2010/wordprocessingShape" mc:Ignorable="w14 w15 w16se w16cid w16 w16cex w16sdtdh wp14">
   <w:tbl>
     <w:tblPr>
       <w:tblStyle w:val="Tablaconcuadrcula"/>
@@ -18075,11 +18234,11 @@
     </w:tblPr>
     <w:tblGrid>
       <w:gridCol w:w="1679"/>
-      <w:gridCol w:w="1679"/>
-      <w:gridCol w:w="1615"/>
-      <w:gridCol w:w="1526"/>
-      <w:gridCol w:w="1559"/>
-      <w:gridCol w:w="1566"/>
+      <w:gridCol w:w="1676"/>
+      <w:gridCol w:w="1614"/>
+      <w:gridCol w:w="1527"/>
+      <w:gridCol w:w="1561"/>
+      <w:gridCol w:w="1567"/>
     </w:tblGrid>
     <w:tr>
       <w:trPr>
@@ -18610,7 +18769,7 @@
 </file>
 
 <file path=word/header2.xml><?xml version="1.0" encoding="utf-8"?>
-<w:hdr xmlns:wpc="http://schemas.microsoft.com/office/word/2010/wordprocessingCanvas" xmlns:cx="http://schemas.microsoft.com/office/drawing/2014/chartex" xmlns:cx1="http://schemas.microsoft.com/office/drawing/2015/9/8/chartex" xmlns:cx2="http://schemas.microsoft.com/office/drawing/2015/10/21/chartex" xmlns:cx3="http://schemas.microsoft.com/office/drawing/2016/5/9/chartex" xmlns:cx4="http://schemas.microsoft.com/office/drawing/2016/5/10/chartex" xmlns:cx5="http://schemas.microsoft.com/office/drawing/2016/5/11/chartex" xmlns:cx6="http://schemas.microsoft.com/office/drawing/2016/5/12/chartex" xmlns:cx7="http://schemas.microsoft.com/office/drawing/2016/5/13/chartex" xmlns:cx8="http://schemas.microsoft.com/office/drawing/2016/5/14/chartex" xmlns:mc="http://schemas.openxmlformats.org/markup-compatibility/2006" xmlns:aink="http://schemas.microsoft.com/office/drawing/2016/ink" xmlns:am3d="http://schemas.microsoft.com/office/drawing/2017/model3d" xmlns:o="urn:schemas-microsoft-com:office:office" xmlns:oel="http://schemas.microsoft.com/office/2019/extlst" xmlns:r="http://schemas.openxmlformats.org/officeDocument/2006/relationships" xmlns:m="http://schemas.openxmlformats.org/officeDocument/2006/math" xmlns:v="urn:schemas-microsoft-com:vml" xmlns:wp14="http://schemas.microsoft.com/office/word/2010/wordprocessingDrawing" xmlns:wp="http://schemas.openxmlformats.org/drawingml/2006/wordprocessingDrawing" xmlns:w10="urn:schemas-microsoft-com:office:word" xmlns:w="http://schemas.openxmlformats.org/wordprocessingml/2006/main" xmlns:w14="http://schemas.microsoft.com/office/word/2010/wordml" xmlns:w15="http://schemas.microsoft.com/office/word/2012/wordml" xmlns:w16cex="http://schemas.microsoft.com/office/word/2018/wordml/cex" xmlns:w16cid="http://schemas.microsoft.com/office/word/2016/wordml/cid" xmlns:w16="http://schemas.microsoft.com/office/word/2018/wordml" xmlns:w16du="http://schemas.microsoft.com/office/word/2023/wordml/word16du" xmlns:w16sdtdh="http://schemas.microsoft.com/office/word/2020/wordml/sdtdatahash" xmlns:w16sdtfl="http://schemas.microsoft.com/office/word/2024/wordml/sdtformatlock" xmlns:w16se="http://schemas.microsoft.com/office/word/2015/wordml/symex" xmlns:wpg="http://schemas.microsoft.com/office/word/2010/wordprocessingGroup" xmlns:wpi="http://schemas.microsoft.com/office/word/2010/wordprocessingInk" xmlns:wne="http://schemas.microsoft.com/office/word/2006/wordml" xmlns:wps="http://schemas.microsoft.com/office/word/2010/wordprocessingShape" mc:Ignorable="w14 w15 w16se w16cid w16 w16cex w16sdtdh w16sdtfl w16du wp14">
+<w:hdr xmlns:wpc="http://schemas.microsoft.com/office/word/2010/wordprocessingCanvas" xmlns:cx="http://schemas.microsoft.com/office/drawing/2014/chartex" xmlns:cx1="http://schemas.microsoft.com/office/drawing/2015/9/8/chartex" xmlns:cx2="http://schemas.microsoft.com/office/drawing/2015/10/21/chartex" xmlns:cx3="http://schemas.microsoft.com/office/drawing/2016/5/9/chartex" xmlns:cx4="http://schemas.microsoft.com/office/drawing/2016/5/10/chartex" xmlns:cx5="http://schemas.microsoft.com/office/drawing/2016/5/11/chartex" xmlns:cx6="http://schemas.microsoft.com/office/drawing/2016/5/12/chartex" xmlns:cx7="http://schemas.microsoft.com/office/drawing/2016/5/13/chartex" xmlns:cx8="http://schemas.microsoft.com/office/drawing/2016/5/14/chartex" xmlns:mc="http://schemas.openxmlformats.org/markup-compatibility/2006" xmlns:aink="http://schemas.microsoft.com/office/drawing/2016/ink" xmlns:am3d="http://schemas.microsoft.com/office/drawing/2017/model3d" xmlns:o="urn:schemas-microsoft-com:office:office" xmlns:r="http://schemas.openxmlformats.org/officeDocument/2006/relationships" xmlns:m="http://schemas.openxmlformats.org/officeDocument/2006/math" xmlns:v="urn:schemas-microsoft-com:vml" xmlns:wp14="http://schemas.microsoft.com/office/word/2010/wordprocessingDrawing" xmlns:wp="http://schemas.openxmlformats.org/drawingml/2006/wordprocessingDrawing" xmlns:w10="urn:schemas-microsoft-com:office:word" xmlns:w="http://schemas.openxmlformats.org/wordprocessingml/2006/main" xmlns:w14="http://schemas.microsoft.com/office/word/2010/wordml" xmlns:w15="http://schemas.microsoft.com/office/word/2012/wordml" xmlns:w16cex="http://schemas.microsoft.com/office/word/2018/wordml/cex" xmlns:w16cid="http://schemas.microsoft.com/office/word/2016/wordml/cid" xmlns:w16="http://schemas.microsoft.com/office/word/2018/wordml" xmlns:w16sdtdh="http://schemas.microsoft.com/office/word/2020/wordml/sdtdatahash" xmlns:w16se="http://schemas.microsoft.com/office/word/2015/wordml/symex" xmlns:wpg="http://schemas.microsoft.com/office/word/2010/wordprocessingGroup" xmlns:wpi="http://schemas.microsoft.com/office/word/2010/wordprocessingInk" xmlns:wne="http://schemas.microsoft.com/office/word/2006/wordml" xmlns:wps="http://schemas.microsoft.com/office/word/2010/wordprocessingShape" mc:Ignorable="w14 w15 w16se w16cid w16 w16cex w16sdtdh wp14">
   <w:tbl>
     <w:tblPr>
       <w:tblStyle w:val="Tablaconcuadrcula"/>
@@ -18619,11 +18778,11 @@
     </w:tblPr>
     <w:tblGrid>
       <w:gridCol w:w="1679"/>
-      <w:gridCol w:w="1679"/>
-      <w:gridCol w:w="1615"/>
-      <w:gridCol w:w="1526"/>
-      <w:gridCol w:w="1559"/>
-      <w:gridCol w:w="1566"/>
+      <w:gridCol w:w="1676"/>
+      <w:gridCol w:w="1614"/>
+      <w:gridCol w:w="1527"/>
+      <w:gridCol w:w="1561"/>
+      <w:gridCol w:w="1567"/>
     </w:tblGrid>
     <w:tr>
       <w:trPr>
@@ -19125,7 +19284,7 @@
 </file>
 
 <file path=word/numbering.xml><?xml version="1.0" encoding="utf-8"?>
-<w:numbering xmlns:wpc="http://schemas.microsoft.com/office/word/2010/wordprocessingCanvas" xmlns:cx="http://schemas.microsoft.com/office/drawing/2014/chartex" xmlns:cx1="http://schemas.microsoft.com/office/drawing/2015/9/8/chartex" xmlns:cx2="http://schemas.microsoft.com/office/drawing/2015/10/21/chartex" xmlns:cx3="http://schemas.microsoft.com/office/drawing/2016/5/9/chartex" xmlns:cx4="http://schemas.microsoft.com/office/drawing/2016/5/10/chartex" xmlns:cx5="http://schemas.microsoft.com/office/drawing/2016/5/11/chartex" xmlns:cx6="http://schemas.microsoft.com/office/drawing/2016/5/12/chartex" xmlns:cx7="http://schemas.microsoft.com/office/drawing/2016/5/13/chartex" xmlns:cx8="http://schemas.microsoft.com/office/drawing/2016/5/14/chartex" xmlns:mc="http://schemas.openxmlformats.org/markup-compatibility/2006" xmlns:aink="http://schemas.microsoft.com/office/drawing/2016/ink" xmlns:am3d="http://schemas.microsoft.com/office/drawing/2017/model3d" xmlns:o="urn:schemas-microsoft-com:office:office" xmlns:oel="http://schemas.microsoft.com/office/2019/extlst" xmlns:r="http://schemas.openxmlformats.org/officeDocument/2006/relationships" xmlns:m="http://schemas.openxmlformats.org/officeDocument/2006/math" xmlns:v="urn:schemas-microsoft-com:vml" xmlns:wp14="http://schemas.microsoft.com/office/word/2010/wordprocessingDrawing" xmlns:wp="http://schemas.openxmlformats.org/drawingml/2006/wordprocessingDrawing" xmlns:w10="urn:schemas-microsoft-com:office:word" xmlns:w="http://schemas.openxmlformats.org/wordprocessingml/2006/main" xmlns:w14="http://schemas.microsoft.com/office/word/2010/wordml" xmlns:w15="http://schemas.microsoft.com/office/word/2012/wordml" xmlns:w16cex="http://schemas.microsoft.com/office/word/2018/wordml/cex" xmlns:w16cid="http://schemas.microsoft.com/office/word/2016/wordml/cid" xmlns:w16="http://schemas.microsoft.com/office/word/2018/wordml" xmlns:w16du="http://schemas.microsoft.com/office/word/2023/wordml/word16du" xmlns:w16sdtdh="http://schemas.microsoft.com/office/word/2020/wordml/sdtdatahash" xmlns:w16sdtfl="http://schemas.microsoft.com/office/word/2024/wordml/sdtformatlock" xmlns:w16se="http://schemas.microsoft.com/office/word/2015/wordml/symex" xmlns:wpg="http://schemas.microsoft.com/office/word/2010/wordprocessingGroup" xmlns:wpi="http://schemas.microsoft.com/office/word/2010/wordprocessingInk" xmlns:wne="http://schemas.microsoft.com/office/word/2006/wordml" xmlns:wps="http://schemas.microsoft.com/office/word/2010/wordprocessingShape" mc:Ignorable="w14 w15 w16se w16cid w16 w16cex w16sdtdh w16sdtfl w16du wp14">
+<w:numbering xmlns:wpc="http://schemas.microsoft.com/office/word/2010/wordprocessingCanvas" xmlns:cx="http://schemas.microsoft.com/office/drawing/2014/chartex" xmlns:cx1="http://schemas.microsoft.com/office/drawing/2015/9/8/chartex" xmlns:cx2="http://schemas.microsoft.com/office/drawing/2015/10/21/chartex" xmlns:cx3="http://schemas.microsoft.com/office/drawing/2016/5/9/chartex" xmlns:cx4="http://schemas.microsoft.com/office/drawing/2016/5/10/chartex" xmlns:cx5="http://schemas.microsoft.com/office/drawing/2016/5/11/chartex" xmlns:cx6="http://schemas.microsoft.com/office/drawing/2016/5/12/chartex" xmlns:cx7="http://schemas.microsoft.com/office/drawing/2016/5/13/chartex" xmlns:cx8="http://schemas.microsoft.com/office/drawing/2016/5/14/chartex" xmlns:mc="http://schemas.openxmlformats.org/markup-compatibility/2006" xmlns:aink="http://schemas.microsoft.com/office/drawing/2016/ink" xmlns:am3d="http://schemas.microsoft.com/office/drawing/2017/model3d" xmlns:o="urn:schemas-microsoft-com:office:office" xmlns:r="http://schemas.openxmlformats.org/officeDocument/2006/relationships" xmlns:m="http://schemas.openxmlformats.org/officeDocument/2006/math" xmlns:v="urn:schemas-microsoft-com:vml" xmlns:wp14="http://schemas.microsoft.com/office/word/2010/wordprocessingDrawing" xmlns:wp="http://schemas.openxmlformats.org/drawingml/2006/wordprocessingDrawing" xmlns:w10="urn:schemas-microsoft-com:office:word" xmlns:w="http://schemas.openxmlformats.org/wordprocessingml/2006/main" xmlns:w14="http://schemas.microsoft.com/office/word/2010/wordml" xmlns:w15="http://schemas.microsoft.com/office/word/2012/wordml" xmlns:w16cex="http://schemas.microsoft.com/office/word/2018/wordml/cex" xmlns:w16cid="http://schemas.microsoft.com/office/word/2016/wordml/cid" xmlns:w16="http://schemas.microsoft.com/office/word/2018/wordml" xmlns:w16sdtdh="http://schemas.microsoft.com/office/word/2020/wordml/sdtdatahash" xmlns:w16se="http://schemas.microsoft.com/office/word/2015/wordml/symex" xmlns:wpg="http://schemas.microsoft.com/office/word/2010/wordprocessingGroup" xmlns:wpi="http://schemas.microsoft.com/office/word/2010/wordprocessingInk" xmlns:wne="http://schemas.microsoft.com/office/word/2006/wordml" xmlns:wps="http://schemas.microsoft.com/office/word/2010/wordprocessingShape" mc:Ignorable="w14 w15 w16se w16cid w16 w16cex w16sdtdh wp14">
   <w:abstractNum w:abstractNumId="0" w15:restartNumberingAfterBreak="0">
     <w:nsid w:val="023B499F"/>
     <w:multiLevelType w:val="hybridMultilevel"/>
@@ -22521,139 +22680,139 @@
       </w:rPr>
     </w:lvl>
   </w:abstractNum>
-  <w:num w:numId="1" w16cid:durableId="1211304674">
+  <w:num w:numId="1">
     <w:abstractNumId w:val="21"/>
   </w:num>
-  <w:num w:numId="2" w16cid:durableId="1472556581">
+  <w:num w:numId="2">
     <w:abstractNumId w:val="5"/>
   </w:num>
-  <w:num w:numId="3" w16cid:durableId="1219366820">
+  <w:num w:numId="3">
     <w:abstractNumId w:val="30"/>
   </w:num>
-  <w:num w:numId="4" w16cid:durableId="1657881167">
+  <w:num w:numId="4">
     <w:abstractNumId w:val="16"/>
   </w:num>
-  <w:num w:numId="5" w16cid:durableId="636574519">
+  <w:num w:numId="5">
     <w:abstractNumId w:val="14"/>
   </w:num>
-  <w:num w:numId="6" w16cid:durableId="550118537">
+  <w:num w:numId="6">
     <w:abstractNumId w:val="25"/>
   </w:num>
-  <w:num w:numId="7" w16cid:durableId="526992982">
+  <w:num w:numId="7">
     <w:abstractNumId w:val="19"/>
   </w:num>
-  <w:num w:numId="8" w16cid:durableId="659121027">
+  <w:num w:numId="8">
     <w:abstractNumId w:val="22"/>
   </w:num>
-  <w:num w:numId="9" w16cid:durableId="1948583899">
+  <w:num w:numId="9">
     <w:abstractNumId w:val="24"/>
   </w:num>
-  <w:num w:numId="10" w16cid:durableId="871310785">
+  <w:num w:numId="10">
     <w:abstractNumId w:val="1"/>
   </w:num>
-  <w:num w:numId="11" w16cid:durableId="2140873727">
+  <w:num w:numId="11">
     <w:abstractNumId w:val="33"/>
   </w:num>
-  <w:num w:numId="12" w16cid:durableId="1421176428">
+  <w:num w:numId="12">
     <w:abstractNumId w:val="2"/>
   </w:num>
-  <w:num w:numId="13" w16cid:durableId="1477525402">
+  <w:num w:numId="13">
     <w:abstractNumId w:val="3"/>
   </w:num>
-  <w:num w:numId="14" w16cid:durableId="452216052">
+  <w:num w:numId="14">
     <w:abstractNumId w:val="32"/>
   </w:num>
-  <w:num w:numId="15" w16cid:durableId="1723359035">
+  <w:num w:numId="15">
     <w:abstractNumId w:val="23"/>
     <w:lvlOverride w:ilvl="0">
       <w:startOverride w:val="1"/>
     </w:lvlOverride>
   </w:num>
-  <w:num w:numId="16" w16cid:durableId="627202868">
+  <w:num w:numId="16">
     <w:abstractNumId w:val="29"/>
     <w:lvlOverride w:ilvl="0">
       <w:startOverride w:val="1"/>
     </w:lvlOverride>
   </w:num>
-  <w:num w:numId="17" w16cid:durableId="1828011821">
+  <w:num w:numId="17">
     <w:abstractNumId w:val="7"/>
     <w:lvlOverride w:ilvl="0">
       <w:startOverride w:val="1"/>
     </w:lvlOverride>
   </w:num>
-  <w:num w:numId="18" w16cid:durableId="1115099837">
+  <w:num w:numId="18">
     <w:abstractNumId w:val="18"/>
     <w:lvlOverride w:ilvl="0">
       <w:startOverride w:val="1"/>
     </w:lvlOverride>
   </w:num>
-  <w:num w:numId="19" w16cid:durableId="2120947872">
+  <w:num w:numId="19">
     <w:abstractNumId w:val="27"/>
     <w:lvlOverride w:ilvl="0">
       <w:startOverride w:val="1"/>
     </w:lvlOverride>
   </w:num>
-  <w:num w:numId="20" w16cid:durableId="1773936030">
+  <w:num w:numId="20">
     <w:abstractNumId w:val="11"/>
     <w:lvlOverride w:ilvl="0">
       <w:startOverride w:val="1"/>
     </w:lvlOverride>
   </w:num>
-  <w:num w:numId="21" w16cid:durableId="1624728425">
+  <w:num w:numId="21">
     <w:abstractNumId w:val="10"/>
     <w:lvlOverride w:ilvl="0">
       <w:startOverride w:val="1"/>
     </w:lvlOverride>
   </w:num>
-  <w:num w:numId="22" w16cid:durableId="155387398">
+  <w:num w:numId="22">
     <w:abstractNumId w:val="8"/>
     <w:lvlOverride w:ilvl="0">
       <w:startOverride w:val="1"/>
     </w:lvlOverride>
   </w:num>
-  <w:num w:numId="23" w16cid:durableId="1358699590">
+  <w:num w:numId="23">
     <w:abstractNumId w:val="28"/>
   </w:num>
-  <w:num w:numId="24" w16cid:durableId="935405612">
+  <w:num w:numId="24">
     <w:abstractNumId w:val="20"/>
   </w:num>
-  <w:num w:numId="25" w16cid:durableId="388039247">
+  <w:num w:numId="25">
     <w:abstractNumId w:val="17"/>
   </w:num>
-  <w:num w:numId="26" w16cid:durableId="483931781">
+  <w:num w:numId="26">
     <w:abstractNumId w:val="13"/>
     <w:lvlOverride w:ilvl="0">
       <w:startOverride w:val="1"/>
     </w:lvlOverride>
   </w:num>
-  <w:num w:numId="27" w16cid:durableId="651569611">
+  <w:num w:numId="27">
     <w:abstractNumId w:val="26"/>
   </w:num>
-  <w:num w:numId="28" w16cid:durableId="909191692">
+  <w:num w:numId="28">
     <w:abstractNumId w:val="6"/>
   </w:num>
-  <w:num w:numId="29" w16cid:durableId="1652829165">
+  <w:num w:numId="29">
     <w:abstractNumId w:val="12"/>
   </w:num>
-  <w:num w:numId="30" w16cid:durableId="412699649">
+  <w:num w:numId="30">
     <w:abstractNumId w:val="4"/>
   </w:num>
-  <w:num w:numId="31" w16cid:durableId="1137841503">
+  <w:num w:numId="31">
     <w:abstractNumId w:val="15"/>
   </w:num>
-  <w:num w:numId="32" w16cid:durableId="1073434398">
+  <w:num w:numId="32">
     <w:abstractNumId w:val="9"/>
     <w:lvlOverride w:ilvl="0">
       <w:startOverride w:val="1"/>
     </w:lvlOverride>
   </w:num>
-  <w:num w:numId="33" w16cid:durableId="501774827">
+  <w:num w:numId="33">
     <w:abstractNumId w:val="0"/>
     <w:lvlOverride w:ilvl="0">
       <w:startOverride w:val="1"/>
     </w:lvlOverride>
   </w:num>
-  <w:num w:numId="34" w16cid:durableId="114644838">
+  <w:num w:numId="34">
     <w:abstractNumId w:val="31"/>
     <w:lvlOverride w:ilvl="0">
       <w:startOverride w:val="1"/>
@@ -22663,7 +22822,7 @@
 </file>
 
 <file path=word/styles.xml><?xml version="1.0" encoding="utf-8"?>
-<w:styles xmlns:mc="http://schemas.openxmlformats.org/markup-compatibility/2006" xmlns:r="http://schemas.openxmlformats.org/officeDocument/2006/relationships" xmlns:w="http://schemas.openxmlformats.org/wordprocessingml/2006/main" xmlns:w14="http://schemas.microsoft.com/office/word/2010/wordml" xmlns:w15="http://schemas.microsoft.com/office/word/2012/wordml" xmlns:w16cex="http://schemas.microsoft.com/office/word/2018/wordml/cex" xmlns:w16cid="http://schemas.microsoft.com/office/word/2016/wordml/cid" xmlns:w16="http://schemas.microsoft.com/office/word/2018/wordml" xmlns:w16du="http://schemas.microsoft.com/office/word/2023/wordml/word16du" xmlns:w16sdtdh="http://schemas.microsoft.com/office/word/2020/wordml/sdtdatahash" xmlns:w16sdtfl="http://schemas.microsoft.com/office/word/2024/wordml/sdtformatlock" xmlns:w16se="http://schemas.microsoft.com/office/word/2015/wordml/symex" mc:Ignorable="w14 w15 w16se w16cid w16 w16cex w16sdtdh w16sdtfl w16du">
+<w:styles xmlns:mc="http://schemas.openxmlformats.org/markup-compatibility/2006" xmlns:r="http://schemas.openxmlformats.org/officeDocument/2006/relationships" xmlns:w="http://schemas.openxmlformats.org/wordprocessingml/2006/main" xmlns:w14="http://schemas.microsoft.com/office/word/2010/wordml" xmlns:w15="http://schemas.microsoft.com/office/word/2012/wordml" xmlns:w16cex="http://schemas.microsoft.com/office/word/2018/wordml/cex" xmlns:w16cid="http://schemas.microsoft.com/office/word/2016/wordml/cid" xmlns:w16="http://schemas.microsoft.com/office/word/2018/wordml" xmlns:w16sdtdh="http://schemas.microsoft.com/office/word/2020/wordml/sdtdatahash" xmlns:w16se="http://schemas.microsoft.com/office/word/2015/wordml/symex" mc:Ignorable="w14 w15 w16se w16cid w16 w16cex w16sdtdh">
   <w:docDefaults>
     <w:rPrDefault>
       <w:rPr>

</xml_diff>

<commit_message>
Correcciones en botones, mensajes, diagramas y errores
</commit_message>
<xml_diff>
--- a/Documentación/Carpeta Trabajo Practico Integrador Nicolás Alcalá.docx
+++ b/Documentación/Carpeta Trabajo Practico Integrador Nicolás Alcalá.docx
@@ -18,15 +18,7 @@
           <w:sz w:val="36"/>
           <w:szCs w:val="36"/>
         </w:rPr>
-        <w:t>ol</w:t>
-      </w:r>
-      <w:r>
-        <w:rPr>
-          <w:rFonts w:cs="Arial" w:ascii="Arial" w:hAnsi="Arial"/>
-          <w:sz w:val="36"/>
-          <w:szCs w:val="36"/>
-        </w:rPr>
-        <w:t xml:space="preserve">Sistema de ABM de usuarios + Login + Composite </w:t>
+        <w:t xml:space="preserve">olSistema de ABM de usuarios + Login + Composite </w:t>
         <w:br/>
         <w:t>+ Observer</w:t>
       </w:r>
@@ -383,6 +375,7 @@
             <w:rPr>
               <w:webHidden/>
               <w:rStyle w:val="Enlacedelndice"/>
+              <w:vanish w:val="false"/>
             </w:rPr>
             <w:instrText xml:space="preserve"> TOC \z \o "1-3" \u \h</w:instrText>
           </w:r>
@@ -390,6 +383,7 @@
             <w:rPr>
               <w:webHidden/>
               <w:rStyle w:val="Enlacedelndice"/>
+              <w:vanish w:val="false"/>
             </w:rPr>
             <w:fldChar w:fldCharType="separate"/>
           </w:r>
@@ -398,8 +392,15 @@
               <w:rPr>
                 <w:webHidden/>
                 <w:rStyle w:val="Enlacedelndice"/>
+                <w:vanish w:val="false"/>
               </w:rPr>
               <w:t>Historial de revisión</w:t>
+            </w:r>
+            <w:r>
+              <w:rPr>
+                <w:rStyle w:val="Enlacedelndice"/>
+                <w:vanish w:val="false"/>
+              </w:rPr>
               <w:tab/>
               <w:t>1</w:t>
             </w:r>
@@ -419,6 +420,7 @@
               <w:rPr>
                 <w:webHidden/>
                 <w:rStyle w:val="Enlacedelndice"/>
+                <w:vanish w:val="false"/>
               </w:rPr>
               <w:t>T00. Documentos de aspectos técnicos que provee el sistema de información.</w:t>
               <w:tab/>
@@ -440,6 +442,7 @@
               <w:rPr>
                 <w:webHidden/>
                 <w:rStyle w:val="Enlacedelndice"/>
+                <w:vanish w:val="false"/>
               </w:rPr>
               <w:t>T01. Arquitectura Base</w:t>
               <w:tab/>
@@ -461,6 +464,7 @@
               <w:rPr>
                 <w:webHidden/>
                 <w:rStyle w:val="Enlacedelndice"/>
+                <w:vanish w:val="false"/>
               </w:rPr>
               <w:t>Propósito del sistema</w:t>
               <w:tab/>
@@ -482,6 +486,7 @@
               <w:rPr>
                 <w:webHidden/>
                 <w:rStyle w:val="Enlacedelndice"/>
+                <w:vanish w:val="false"/>
               </w:rPr>
               <w:t>Decisiones de arquitectura</w:t>
               <w:tab/>
@@ -503,6 +508,7 @@
               <w:rPr>
                 <w:webHidden/>
                 <w:rStyle w:val="Enlacedelndice"/>
+                <w:vanish w:val="false"/>
               </w:rPr>
               <w:t>Criterios de diseño orientado a objetos</w:t>
               <w:tab/>
@@ -524,6 +530,7 @@
               <w:rPr>
                 <w:webHidden/>
                 <w:rStyle w:val="Enlacedelndice"/>
+                <w:vanish w:val="false"/>
               </w:rPr>
               <w:t>Gráficos</w:t>
               <w:tab/>
@@ -545,6 +552,7 @@
               <w:rPr>
                 <w:webHidden/>
                 <w:rStyle w:val="Enlacedelndice"/>
+                <w:vanish w:val="false"/>
               </w:rPr>
               <w:t>Especificación de Casos de Uso</w:t>
               <w:tab/>
@@ -566,6 +574,7 @@
               <w:rPr>
                 <w:webHidden/>
                 <w:rStyle w:val="Enlacedelndice"/>
+                <w:vanish w:val="false"/>
               </w:rPr>
               <w:t>T02. Gestión de Log In / Log Out del Sistema</w:t>
               <w:tab/>
@@ -587,6 +596,7 @@
               <w:rPr>
                 <w:webHidden/>
                 <w:rStyle w:val="Enlacedelndice"/>
+                <w:vanish w:val="false"/>
               </w:rPr>
               <w:t>Política de apagado del sistema</w:t>
               <w:tab/>
@@ -608,6 +618,7 @@
               <w:rPr>
                 <w:webHidden/>
                 <w:rStyle w:val="Enlacedelndice"/>
+                <w:vanish w:val="false"/>
               </w:rPr>
               <w:t>Apagado mediante Log-out (cierre formal)</w:t>
               <w:tab/>
@@ -629,6 +640,7 @@
               <w:rPr>
                 <w:webHidden/>
                 <w:rStyle w:val="Enlacedelndice"/>
+                <w:vanish w:val="false"/>
               </w:rPr>
               <w:t>Apagado directo (cierre de la aplicación)</w:t>
               <w:tab/>
@@ -650,6 +662,7 @@
               <w:rPr>
                 <w:webHidden/>
                 <w:rStyle w:val="Enlacedelndice"/>
+                <w:vanish w:val="false"/>
               </w:rPr>
               <w:t>Consideraciones de seguridad y auditoría</w:t>
               <w:tab/>
@@ -671,6 +684,7 @@
               <w:rPr>
                 <w:webHidden/>
                 <w:rStyle w:val="Enlacedelndice"/>
+                <w:vanish w:val="false"/>
               </w:rPr>
               <w:t>T03. Gestión de encriptado</w:t>
               <w:tab/>
@@ -692,6 +706,7 @@
               <w:rPr>
                 <w:webHidden/>
                 <w:rStyle w:val="Enlacedelndice"/>
+                <w:vanish w:val="false"/>
               </w:rPr>
               <w:t>Objetivo</w:t>
               <w:tab/>
@@ -713,6 +728,7 @@
               <w:rPr>
                 <w:webHidden/>
                 <w:rStyle w:val="Enlacedelndice"/>
+                <w:vanish w:val="false"/>
               </w:rPr>
               <w:t>Descripción detallada de cómo funciona</w:t>
               <w:tab/>
@@ -734,6 +750,7 @@
               <w:rPr>
                 <w:webHidden/>
                 <w:rStyle w:val="Enlacedelndice"/>
+                <w:vanish w:val="false"/>
               </w:rPr>
               <w:t>Gráficos</w:t>
               <w:tab/>
@@ -755,6 +772,7 @@
               <w:rPr>
                 <w:webHidden/>
                 <w:rStyle w:val="Enlacedelndice"/>
+                <w:vanish w:val="false"/>
               </w:rPr>
               <w:t>T04. Gestión de Perfiles de Usuario</w:t>
               <w:tab/>
@@ -776,6 +794,7 @@
               <w:rPr>
                 <w:webHidden/>
                 <w:rStyle w:val="Enlacedelndice"/>
+                <w:vanish w:val="false"/>
               </w:rPr>
               <w:t>Objetivo</w:t>
               <w:tab/>
@@ -797,6 +816,7 @@
               <w:rPr>
                 <w:webHidden/>
                 <w:rStyle w:val="Enlacedelndice"/>
+                <w:vanish w:val="false"/>
               </w:rPr>
               <w:t>Descripción de cómo funciona</w:t>
               <w:tab/>
@@ -818,6 +838,7 @@
               <w:rPr>
                 <w:webHidden/>
                 <w:rStyle w:val="Enlacedelndice"/>
+                <w:vanish w:val="false"/>
               </w:rPr>
               <w:t>Permisos del Sistema</w:t>
               <w:tab/>
@@ -839,6 +860,7 @@
               <w:rPr>
                 <w:webHidden/>
                 <w:rStyle w:val="Enlacedelndice"/>
+                <w:vanish w:val="false"/>
               </w:rPr>
               <w:t>Gráficos</w:t>
               <w:tab/>
@@ -860,6 +882,7 @@
               <w:rPr>
                 <w:webHidden/>
                 <w:rStyle w:val="Enlacedelndice"/>
+                <w:vanish w:val="false"/>
               </w:rPr>
               <w:t>Casos de Uso: Permisos</w:t>
               <w:tab/>
@@ -881,6 +904,7 @@
               <w:rPr>
                 <w:webHidden/>
                 <w:rStyle w:val="Enlacedelndice"/>
+                <w:vanish w:val="false"/>
               </w:rPr>
               <w:t>T05. Gestión de Múltiples Idiomas</w:t>
               <w:tab/>
@@ -902,6 +926,7 @@
               <w:rPr>
                 <w:webHidden/>
                 <w:rStyle w:val="Enlacedelndice"/>
+                <w:vanish w:val="false"/>
               </w:rPr>
               <w:t>Objetivo</w:t>
               <w:tab/>
@@ -923,6 +948,7 @@
               <w:rPr>
                 <w:webHidden/>
                 <w:rStyle w:val="Enlacedelndice"/>
+                <w:vanish w:val="false"/>
               </w:rPr>
               <w:t>Descripción detallada de cómo funciona</w:t>
               <w:tab/>
@@ -944,6 +970,7 @@
               <w:rPr>
                 <w:webHidden/>
                 <w:rStyle w:val="Enlacedelndice"/>
+                <w:vanish w:val="false"/>
               </w:rPr>
               <w:t>Gráficos</w:t>
               <w:tab/>
@@ -965,6 +992,7 @@
               <w:rPr>
                 <w:webHidden/>
                 <w:rStyle w:val="Enlacedelndice"/>
+                <w:vanish w:val="false"/>
               </w:rPr>
               <w:t>Casos de Uso: Idiomas</w:t>
               <w:tab/>
@@ -986,6 +1014,7 @@
               <w:rPr>
                 <w:webHidden/>
                 <w:rStyle w:val="Enlacedelndice"/>
+                <w:vanish w:val="false"/>
               </w:rPr>
               <w:t>T06. Gestión de Bitácora y Control de Cambios</w:t>
               <w:tab/>
@@ -1007,6 +1036,7 @@
               <w:rPr>
                 <w:webHidden/>
                 <w:rStyle w:val="Enlacedelndice"/>
+                <w:vanish w:val="false"/>
               </w:rPr>
               <w:t>T06a. Gestión de Bitácora</w:t>
               <w:tab/>
@@ -1028,6 +1058,7 @@
               <w:rPr>
                 <w:webHidden/>
                 <w:rStyle w:val="Enlacedelndice"/>
+                <w:vanish w:val="false"/>
               </w:rPr>
               <w:t>T06b. Auditoría</w:t>
               <w:tab/>
@@ -1049,6 +1080,7 @@
               <w:rPr>
                 <w:webHidden/>
                 <w:rStyle w:val="Enlacedelndice"/>
+                <w:vanish w:val="false"/>
               </w:rPr>
               <w:t>T06c. Control de cambios</w:t>
               <w:tab/>
@@ -1070,6 +1102,7 @@
               <w:rPr>
                 <w:webHidden/>
                 <w:rStyle w:val="Enlacedelndice"/>
+                <w:vanish w:val="false"/>
               </w:rPr>
               <w:t>Gráficos</w:t>
               <w:tab/>
@@ -1091,6 +1124,7 @@
               <w:rPr>
                 <w:webHidden/>
                 <w:rStyle w:val="Enlacedelndice"/>
+                <w:vanish w:val="false"/>
               </w:rPr>
               <w:t>Casos de Uso: Bitácora</w:t>
               <w:tab/>
@@ -1112,6 +1146,7 @@
               <w:rPr>
                 <w:webHidden/>
                 <w:rStyle w:val="Enlacedelndice"/>
+                <w:vanish w:val="false"/>
               </w:rPr>
               <w:t>T07. Gestión de Backup y Restore de la Base de Datos</w:t>
               <w:tab/>
@@ -1133,6 +1168,7 @@
               <w:rPr>
                 <w:webHidden/>
                 <w:rStyle w:val="Enlacedelndice"/>
+                <w:vanish w:val="false"/>
               </w:rPr>
               <w:t>Objetivo</w:t>
               <w:tab/>
@@ -1154,6 +1190,7 @@
               <w:rPr>
                 <w:webHidden/>
                 <w:rStyle w:val="Enlacedelndice"/>
+                <w:vanish w:val="false"/>
               </w:rPr>
               <w:t>Descripción detallada de cómo funciona</w:t>
               <w:tab/>
@@ -1175,6 +1212,7 @@
               <w:rPr>
                 <w:webHidden/>
                 <w:rStyle w:val="Enlacedelndice"/>
+                <w:vanish w:val="false"/>
               </w:rPr>
               <w:t>Diagrama de Clases</w:t>
               <w:tab/>
@@ -1196,6 +1234,7 @@
               <w:rPr>
                 <w:webHidden/>
                 <w:rStyle w:val="Enlacedelndice"/>
+                <w:vanish w:val="false"/>
               </w:rPr>
               <w:t>Casos de Uso: BackUp y Restore</w:t>
               <w:tab/>
@@ -1217,6 +1256,7 @@
               <w:rPr>
                 <w:webHidden/>
                 <w:rStyle w:val="Enlacedelndice"/>
+                <w:vanish w:val="false"/>
               </w:rPr>
               <w:t>T08. Dígito Verificador (integridad de datos)</w:t>
               <w:tab/>
@@ -1238,6 +1278,7 @@
               <w:rPr>
                 <w:webHidden/>
                 <w:rStyle w:val="Enlacedelndice"/>
+                <w:vanish w:val="false"/>
               </w:rPr>
               <w:t>Objetivo</w:t>
               <w:tab/>
@@ -1259,6 +1300,7 @@
               <w:rPr>
                 <w:webHidden/>
                 <w:rStyle w:val="Enlacedelndice"/>
+                <w:vanish w:val="false"/>
               </w:rPr>
               <w:t>Descripción detallada de cómo funciona</w:t>
               <w:tab/>
@@ -1280,6 +1322,7 @@
               <w:rPr>
                 <w:webHidden/>
                 <w:rStyle w:val="Enlacedelndice"/>
+                <w:vanish w:val="false"/>
               </w:rPr>
               <w:t>Diagrama de Clases</w:t>
               <w:tab/>
@@ -1301,6 +1344,7 @@
               <w:rPr>
                 <w:webHidden/>
                 <w:rStyle w:val="Enlacedelndice"/>
+                <w:vanish w:val="false"/>
               </w:rPr>
               <w:t>Casos de Uso: Integridad</w:t>
               <w:tab/>
@@ -1322,6 +1366,7 @@
               <w:rPr>
                 <w:webHidden/>
                 <w:rStyle w:val="Enlacedelndice"/>
+                <w:vanish w:val="false"/>
               </w:rPr>
               <w:t>Global del Sistema</w:t>
               <w:tab/>
@@ -1343,6 +1388,7 @@
               <w:rPr>
                 <w:webHidden/>
                 <w:rStyle w:val="Enlacedelndice"/>
+                <w:vanish w:val="false"/>
               </w:rPr>
               <w:t>Diagrama de Casos de Uso Global del sistema</w:t>
               <w:tab/>
@@ -1364,6 +1410,7 @@
               <w:rPr>
                 <w:webHidden/>
                 <w:rStyle w:val="Enlacedelndice"/>
+                <w:vanish w:val="false"/>
               </w:rPr>
               <w:t>Diagrama Entidad Relación del sistema</w:t>
               <w:tab/>
@@ -1385,6 +1432,7 @@
               <w:rPr>
                 <w:webHidden/>
                 <w:rStyle w:val="Enlacedelndice"/>
+                <w:vanish w:val="false"/>
               </w:rPr>
               <w:t>Modelo Relacional del sistema</w:t>
               <w:tab/>
@@ -1394,6 +1442,7 @@
           <w:r>
             <w:rPr>
               <w:rStyle w:val="Enlacedelndice"/>
+              <w:vanish w:val="false"/>
             </w:rPr>
             <w:fldChar w:fldCharType="end"/>
           </w:r>
@@ -4488,7 +4537,7 @@
         <w:pStyle w:val="ListParagraph"/>
         <w:numPr>
           <w:ilvl w:val="0"/>
-          <w:numId w:val="79"/>
+          <w:numId w:val="80"/>
         </w:numPr>
         <w:spacing w:lineRule="auto" w:line="240" w:before="0" w:after="80"/>
         <w:contextualSpacing w:val="false"/>
@@ -4501,26 +4550,6 @@
           <w:szCs w:val="24"/>
         </w:rPr>
         <w:t>Implementar el ABM completo de usuarios con persistencia en SQL Server.</w:t>
-      </w:r>
-    </w:p>
-    <w:p>
-      <w:pPr>
-        <w:pStyle w:val="ListParagraph"/>
-        <w:numPr>
-          <w:ilvl w:val="0"/>
-          <w:numId w:val="80"/>
-        </w:numPr>
-        <w:spacing w:lineRule="auto" w:line="240" w:before="0" w:after="80"/>
-        <w:contextualSpacing w:val="false"/>
-        <w:rPr/>
-      </w:pPr>
-      <w:r>
-        <w:rPr>
-          <w:rFonts w:eastAsia="Arial" w:cs="Arial" w:ascii="Arial" w:hAnsi="Arial"/>
-          <w:sz w:val="24"/>
-          <w:szCs w:val="24"/>
-        </w:rPr>
-        <w:t>Garantizar que las contraseñas nunca se almacenen en texto plano mediante SHA-256.</w:t>
       </w:r>
     </w:p>
     <w:p>
@@ -4540,7 +4569,7 @@
           <w:sz w:val="24"/>
           <w:szCs w:val="24"/>
         </w:rPr>
-        <w:t>Establecer una arquitectura extensible que soporte el agregado de nuevos módulos de negocio sin modificar las capas inferiores.</w:t>
+        <w:t>Garantizar que las contraseñas nunca se almacenen en texto plano mediante SHA-256.</w:t>
       </w:r>
     </w:p>
     <w:p>
@@ -4560,7 +4589,7 @@
           <w:sz w:val="24"/>
           <w:szCs w:val="24"/>
         </w:rPr>
-        <w:t>Documentar el esquema de persistencia detallando el comportamiento interno de la capa DAL tanto para operaciones de consulta como de actualización.</w:t>
+        <w:t>Establecer una arquitectura extensible que soporte el agregado de nuevos módulos de negocio sin modificar las capas inferiores.</w:t>
       </w:r>
     </w:p>
     <w:p>
@@ -4569,6 +4598,26 @@
         <w:numPr>
           <w:ilvl w:val="0"/>
           <w:numId w:val="83"/>
+        </w:numPr>
+        <w:spacing w:lineRule="auto" w:line="240" w:before="0" w:after="80"/>
+        <w:contextualSpacing w:val="false"/>
+        <w:rPr/>
+      </w:pPr>
+      <w:r>
+        <w:rPr>
+          <w:rFonts w:eastAsia="Arial" w:cs="Arial" w:ascii="Arial" w:hAnsi="Arial"/>
+          <w:sz w:val="24"/>
+          <w:szCs w:val="24"/>
+        </w:rPr>
+        <w:t>Documentar el esquema de persistencia detallando el comportamiento interno de la capa DAL tanto para operaciones de consulta como de actualización.</w:t>
+      </w:r>
+    </w:p>
+    <w:p>
+      <w:pPr>
+        <w:pStyle w:val="ListParagraph"/>
+        <w:numPr>
+          <w:ilvl w:val="0"/>
+          <w:numId w:val="84"/>
         </w:numPr>
         <w:spacing w:lineRule="auto" w:line="240" w:before="0" w:after="80"/>
         <w:contextualSpacing w:val="false"/>
@@ -5822,7 +5871,7 @@
         <w:pStyle w:val="ListParagraph"/>
         <w:numPr>
           <w:ilvl w:val="0"/>
-          <w:numId w:val="84"/>
+          <w:numId w:val="85"/>
         </w:numPr>
         <w:spacing w:lineRule="auto" w:line="240" w:before="0" w:after="40"/>
         <w:contextualSpacing w:val="false"/>
@@ -5835,26 +5884,6 @@
           <w:szCs w:val="20"/>
         </w:rPr>
         <w:t>El usuario ingresa sus credenciales y presiona Ingresar.</w:t>
-      </w:r>
-    </w:p>
-    <w:p>
-      <w:pPr>
-        <w:pStyle w:val="ListParagraph"/>
-        <w:numPr>
-          <w:ilvl w:val="0"/>
-          <w:numId w:val="85"/>
-        </w:numPr>
-        <w:spacing w:lineRule="auto" w:line="240" w:before="0" w:after="40"/>
-        <w:contextualSpacing w:val="false"/>
-        <w:rPr/>
-      </w:pPr>
-      <w:r>
-        <w:rPr>
-          <w:rFonts w:eastAsia="Arial" w:cs="Arial" w:ascii="Arial" w:hAnsi="Arial"/>
-          <w:sz w:val="20"/>
-          <w:szCs w:val="20"/>
-        </w:rPr>
-        <w:t>El sistema valida que los campos no estén vacíos.</w:t>
       </w:r>
     </w:p>
     <w:p>
@@ -5874,7 +5903,7 @@
           <w:sz w:val="20"/>
           <w:szCs w:val="20"/>
         </w:rPr>
-        <w:t>El sistema hashea la contraseña y consulta la base de datos.</w:t>
+        <w:t>El sistema valida que los campos no estén vacíos.</w:t>
       </w:r>
     </w:p>
     <w:p>
@@ -5883,6 +5912,26 @@
         <w:numPr>
           <w:ilvl w:val="0"/>
           <w:numId w:val="87"/>
+        </w:numPr>
+        <w:spacing w:lineRule="auto" w:line="240" w:before="0" w:after="40"/>
+        <w:contextualSpacing w:val="false"/>
+        <w:rPr/>
+      </w:pPr>
+      <w:r>
+        <w:rPr>
+          <w:rFonts w:eastAsia="Arial" w:cs="Arial" w:ascii="Arial" w:hAnsi="Arial"/>
+          <w:sz w:val="20"/>
+          <w:szCs w:val="20"/>
+        </w:rPr>
+        <w:t>El sistema hashea la contraseña y consulta la base de datos.</w:t>
+      </w:r>
+    </w:p>
+    <w:p>
+      <w:pPr>
+        <w:pStyle w:val="ListParagraph"/>
+        <w:numPr>
+          <w:ilvl w:val="0"/>
+          <w:numId w:val="88"/>
         </w:numPr>
         <w:spacing w:lineRule="auto" w:line="240" w:before="0" w:after="40"/>
         <w:contextualSpacing w:val="false"/>
@@ -6008,7 +6057,7 @@
       <w:r>
         <w:rPr/>
         <w:drawing>
-          <wp:anchor behindDoc="0" distT="0" distB="0" distL="0" distR="0" simplePos="0" locked="0" layoutInCell="0" allowOverlap="1" relativeHeight="56">
+          <wp:anchor behindDoc="0" distT="0" distB="0" distL="0" distR="0" simplePos="0" locked="0" layoutInCell="0" allowOverlap="1" relativeHeight="53">
             <wp:simplePos x="0" y="0"/>
             <wp:positionH relativeFrom="column">
               <wp:align>center</wp:align>
@@ -6627,7 +6676,7 @@
         <w:pStyle w:val="ListParagraph"/>
         <w:numPr>
           <w:ilvl w:val="0"/>
-          <w:numId w:val="88"/>
+          <w:numId w:val="89"/>
         </w:numPr>
         <w:spacing w:lineRule="auto" w:line="240" w:before="0" w:after="40"/>
         <w:contextualSpacing w:val="false"/>
@@ -6640,26 +6689,6 @@
           <w:szCs w:val="20"/>
         </w:rPr>
         <w:t>El usuario ingresa nombre y contraseña y presiona Registrar.</w:t>
-      </w:r>
-    </w:p>
-    <w:p>
-      <w:pPr>
-        <w:pStyle w:val="ListParagraph"/>
-        <w:numPr>
-          <w:ilvl w:val="0"/>
-          <w:numId w:val="89"/>
-        </w:numPr>
-        <w:spacing w:lineRule="auto" w:line="240" w:before="0" w:after="40"/>
-        <w:contextualSpacing w:val="false"/>
-        <w:rPr/>
-      </w:pPr>
-      <w:r>
-        <w:rPr>
-          <w:rFonts w:eastAsia="Arial" w:cs="Arial" w:ascii="Arial" w:hAnsi="Arial"/>
-          <w:sz w:val="20"/>
-          <w:szCs w:val="20"/>
-        </w:rPr>
-        <w:t>El sistema valida el formato del usuario (BE) y la contraseña (BLL).</w:t>
       </w:r>
     </w:p>
     <w:p>
@@ -6679,7 +6708,7 @@
           <w:sz w:val="20"/>
           <w:szCs w:val="20"/>
         </w:rPr>
-        <w:t>El sistema hashea la contraseña y verifica que el nombre no esté en uso.</w:t>
+        <w:t>El sistema valida el formato del usuario (BE) y la contraseña (BLL).</w:t>
       </w:r>
     </w:p>
     <w:p>
@@ -6688,6 +6717,26 @@
         <w:numPr>
           <w:ilvl w:val="0"/>
           <w:numId w:val="91"/>
+        </w:numPr>
+        <w:spacing w:lineRule="auto" w:line="240" w:before="0" w:after="40"/>
+        <w:contextualSpacing w:val="false"/>
+        <w:rPr/>
+      </w:pPr>
+      <w:r>
+        <w:rPr>
+          <w:rFonts w:eastAsia="Arial" w:cs="Arial" w:ascii="Arial" w:hAnsi="Arial"/>
+          <w:sz w:val="20"/>
+          <w:szCs w:val="20"/>
+        </w:rPr>
+        <w:t>El sistema hashea la contraseña y verifica que el nombre no esté en uso.</w:t>
+      </w:r>
+    </w:p>
+    <w:p>
+      <w:pPr>
+        <w:pStyle w:val="ListParagraph"/>
+        <w:numPr>
+          <w:ilvl w:val="0"/>
+          <w:numId w:val="92"/>
         </w:numPr>
         <w:spacing w:lineRule="auto" w:line="240" w:before="0" w:after="40"/>
         <w:contextualSpacing w:val="false"/>
@@ -7440,7 +7489,7 @@
         <w:pStyle w:val="ListParagraph"/>
         <w:numPr>
           <w:ilvl w:val="0"/>
-          <w:numId w:val="92"/>
+          <w:numId w:val="93"/>
         </w:numPr>
         <w:spacing w:lineRule="auto" w:line="240" w:before="0" w:after="40"/>
         <w:contextualSpacing w:val="false"/>
@@ -7460,7 +7509,7 @@
         <w:pStyle w:val="ListParagraph"/>
         <w:numPr>
           <w:ilvl w:val="0"/>
-          <w:numId w:val="93"/>
+          <w:numId w:val="94"/>
         </w:numPr>
         <w:spacing w:lineRule="auto" w:line="240" w:before="0" w:after="40"/>
         <w:contextualSpacing w:val="false"/>
@@ -7480,7 +7529,7 @@
         <w:pStyle w:val="ListParagraph"/>
         <w:numPr>
           <w:ilvl w:val="0"/>
-          <w:numId w:val="94"/>
+          <w:numId w:val="95"/>
         </w:numPr>
         <w:spacing w:lineRule="auto" w:line="240" w:before="0" w:after="40"/>
         <w:contextualSpacing w:val="false"/>
@@ -8032,7 +8081,7 @@
         <w:pStyle w:val="ListParagraph"/>
         <w:numPr>
           <w:ilvl w:val="0"/>
-          <w:numId w:val="95"/>
+          <w:numId w:val="96"/>
         </w:numPr>
         <w:spacing w:lineRule="auto" w:line="240" w:before="0" w:after="40"/>
         <w:contextualSpacing w:val="false"/>
@@ -8045,26 +8094,6 @@
           <w:szCs w:val="20"/>
         </w:rPr>
         <w:t>El usuario selecciona Listar en el menú de frmNav.</w:t>
-      </w:r>
-    </w:p>
-    <w:p>
-      <w:pPr>
-        <w:pStyle w:val="ListParagraph"/>
-        <w:numPr>
-          <w:ilvl w:val="0"/>
-          <w:numId w:val="96"/>
-        </w:numPr>
-        <w:spacing w:lineRule="auto" w:line="240" w:before="0" w:after="40"/>
-        <w:contextualSpacing w:val="false"/>
-        <w:rPr/>
-      </w:pPr>
-      <w:r>
-        <w:rPr>
-          <w:rFonts w:eastAsia="Arial" w:cs="Arial" w:ascii="Arial" w:hAnsi="Arial"/>
-          <w:sz w:val="20"/>
-          <w:szCs w:val="20"/>
-        </w:rPr>
-        <w:t>El sistema abre frmListar y consulta todos los usuarios a la base de datos.</w:t>
       </w:r>
     </w:p>
     <w:p>
@@ -8084,7 +8113,7 @@
           <w:sz w:val="20"/>
           <w:szCs w:val="20"/>
         </w:rPr>
-        <w:t>El sistema muestra la lista completa en el DataGridView.</w:t>
+        <w:t>El sistema abre frmListar y consulta todos los usuarios a la base de datos.</w:t>
       </w:r>
     </w:p>
     <w:p>
@@ -8104,6 +8133,26 @@
           <w:sz w:val="20"/>
           <w:szCs w:val="20"/>
         </w:rPr>
+        <w:t>El sistema muestra la lista completa en el DataGridView.</w:t>
+      </w:r>
+    </w:p>
+    <w:p>
+      <w:pPr>
+        <w:pStyle w:val="ListParagraph"/>
+        <w:numPr>
+          <w:ilvl w:val="0"/>
+          <w:numId w:val="99"/>
+        </w:numPr>
+        <w:spacing w:lineRule="auto" w:line="240" w:before="0" w:after="40"/>
+        <w:contextualSpacing w:val="false"/>
+        <w:rPr/>
+      </w:pPr>
+      <w:r>
+        <w:rPr>
+          <w:rFonts w:eastAsia="Arial" w:cs="Arial" w:ascii="Arial" w:hAnsi="Arial"/>
+          <w:sz w:val="20"/>
+          <w:szCs w:val="20"/>
+        </w:rPr>
         <w:t>El usuario cierra el formulario al terminar.</w:t>
       </w:r>
     </w:p>
@@ -8115,7 +8164,7 @@
       <w:r>
         <w:rPr/>
         <w:drawing>
-          <wp:anchor behindDoc="0" distT="0" distB="0" distL="0" distR="0" simplePos="0" locked="0" layoutInCell="0" allowOverlap="1" relativeHeight="48">
+          <wp:anchor behindDoc="0" distT="0" distB="0" distL="0" distR="0" simplePos="0" locked="0" layoutInCell="0" allowOverlap="1" relativeHeight="47">
             <wp:simplePos x="0" y="0"/>
             <wp:positionH relativeFrom="column">
               <wp:align>center</wp:align>
@@ -8711,7 +8760,7 @@
         <w:pStyle w:val="ListParagraph"/>
         <w:numPr>
           <w:ilvl w:val="0"/>
-          <w:numId w:val="99"/>
+          <w:numId w:val="100"/>
         </w:numPr>
         <w:spacing w:lineRule="auto" w:line="240" w:before="0" w:after="40"/>
         <w:contextualSpacing w:val="false"/>
@@ -8724,26 +8773,6 @@
           <w:szCs w:val="20"/>
         </w:rPr>
         <w:t>El usuario selecciona Registrar en el menú de frmNav.</w:t>
-      </w:r>
-    </w:p>
-    <w:p>
-      <w:pPr>
-        <w:pStyle w:val="ListParagraph"/>
-        <w:numPr>
-          <w:ilvl w:val="0"/>
-          <w:numId w:val="100"/>
-        </w:numPr>
-        <w:spacing w:lineRule="auto" w:line="240" w:before="0" w:after="40"/>
-        <w:contextualSpacing w:val="false"/>
-        <w:rPr/>
-      </w:pPr>
-      <w:r>
-        <w:rPr>
-          <w:rFonts w:eastAsia="Arial" w:cs="Arial" w:ascii="Arial" w:hAnsi="Arial"/>
-          <w:sz w:val="20"/>
-          <w:szCs w:val="20"/>
-        </w:rPr>
-        <w:t>El sistema abre frmRegistrar.</w:t>
       </w:r>
     </w:p>
     <w:p>
@@ -8763,7 +8792,7 @@
           <w:sz w:val="20"/>
           <w:szCs w:val="20"/>
         </w:rPr>
-        <w:t>El usuario ingresa nombre y contraseña y presiona Registrar.</w:t>
+        <w:t>El sistema abre frmRegistrar.</w:t>
       </w:r>
     </w:p>
     <w:p>
@@ -8772,6 +8801,26 @@
         <w:numPr>
           <w:ilvl w:val="0"/>
           <w:numId w:val="102"/>
+        </w:numPr>
+        <w:spacing w:lineRule="auto" w:line="240" w:before="0" w:after="40"/>
+        <w:contextualSpacing w:val="false"/>
+        <w:rPr/>
+      </w:pPr>
+      <w:r>
+        <w:rPr>
+          <w:rFonts w:eastAsia="Arial" w:cs="Arial" w:ascii="Arial" w:hAnsi="Arial"/>
+          <w:sz w:val="20"/>
+          <w:szCs w:val="20"/>
+        </w:rPr>
+        <w:t>El usuario ingresa nombre y contraseña y presiona Registrar.</w:t>
+      </w:r>
+    </w:p>
+    <w:p>
+      <w:pPr>
+        <w:pStyle w:val="ListParagraph"/>
+        <w:numPr>
+          <w:ilvl w:val="0"/>
+          <w:numId w:val="103"/>
         </w:numPr>
         <w:spacing w:lineRule="auto" w:line="240" w:before="0" w:after="40"/>
         <w:contextualSpacing w:val="false"/>
@@ -9365,7 +9414,7 @@
         <w:pStyle w:val="ListParagraph"/>
         <w:numPr>
           <w:ilvl w:val="0"/>
-          <w:numId w:val="103"/>
+          <w:numId w:val="104"/>
         </w:numPr>
         <w:spacing w:lineRule="auto" w:line="240" w:before="0" w:after="40"/>
         <w:contextualSpacing w:val="false"/>
@@ -9378,26 +9427,6 @@
           <w:szCs w:val="20"/>
         </w:rPr>
         <w:t>El usuario selecciona Modificar en el menú de frmNav.</w:t>
-      </w:r>
-    </w:p>
-    <w:p>
-      <w:pPr>
-        <w:pStyle w:val="ListParagraph"/>
-        <w:numPr>
-          <w:ilvl w:val="0"/>
-          <w:numId w:val="104"/>
-        </w:numPr>
-        <w:spacing w:lineRule="auto" w:line="240" w:before="0" w:after="40"/>
-        <w:contextualSpacing w:val="false"/>
-        <w:rPr/>
-      </w:pPr>
-      <w:r>
-        <w:rPr>
-          <w:rFonts w:eastAsia="Arial" w:cs="Arial" w:ascii="Arial" w:hAnsi="Arial"/>
-          <w:sz w:val="20"/>
-          <w:szCs w:val="20"/>
-        </w:rPr>
-        <w:t>El sistema abre frmModificar con la lista de usuarios cargada.</w:t>
       </w:r>
     </w:p>
     <w:p>
@@ -9417,7 +9446,7 @@
           <w:sz w:val="20"/>
           <w:szCs w:val="20"/>
         </w:rPr>
-        <w:t>El usuario selecciona un registro; el sistema autocompleta los campos.</w:t>
+        <w:t>El sistema abre frmModificar con la lista de usuarios cargada.</w:t>
       </w:r>
     </w:p>
     <w:p>
@@ -9437,6 +9466,26 @@
           <w:sz w:val="20"/>
           <w:szCs w:val="20"/>
         </w:rPr>
+        <w:t>El usuario selecciona un registro; el sistema autocompleta los campos.</w:t>
+      </w:r>
+    </w:p>
+    <w:p>
+      <w:pPr>
+        <w:pStyle w:val="ListParagraph"/>
+        <w:numPr>
+          <w:ilvl w:val="0"/>
+          <w:numId w:val="107"/>
+        </w:numPr>
+        <w:spacing w:lineRule="auto" w:line="240" w:before="0" w:after="40"/>
+        <w:contextualSpacing w:val="false"/>
+        <w:rPr/>
+      </w:pPr>
+      <w:r>
+        <w:rPr>
+          <w:rFonts w:eastAsia="Arial" w:cs="Arial" w:ascii="Arial" w:hAnsi="Arial"/>
+          <w:sz w:val="20"/>
+          <w:szCs w:val="20"/>
+        </w:rPr>
         <w:t>El usuario edita el nombre y confirma; el sistema valida y actualiza en la base de datos.</w:t>
       </w:r>
     </w:p>
@@ -9484,6 +9533,28 @@
     </w:p>
     <w:p>
       <w:pPr>
+        <w:pStyle w:val="ListParagraph"/>
+        <w:numPr>
+          <w:ilvl w:val="1"/>
+          <w:numId w:val="4"/>
+        </w:numPr>
+        <w:spacing w:lineRule="auto" w:line="240" w:before="160" w:after="60"/>
+        <w:contextualSpacing/>
+        <w:rPr>
+          <w:sz w:val="20"/>
+          <w:szCs w:val="20"/>
+        </w:rPr>
+      </w:pPr>
+      <w:r>
+        <w:rPr>
+          <w:sz w:val="20"/>
+          <w:szCs w:val="20"/>
+        </w:rPr>
+        <w:t xml:space="preserve">El usuario seleccionado es el administrador: el sistema lo impide y muestra 'No se puede modificar al usuario administrado </w:t>
+      </w:r>
+    </w:p>
+    <w:p>
+      <w:pPr>
         <w:pStyle w:val="Normal"/>
         <w:rPr/>
       </w:pPr>
@@ -9498,16 +9569,31 @@
       </w:pPr>
       <w:r>
         <w:rPr/>
+      </w:r>
+      <w:r>
+        <w:br w:type="page"/>
+      </w:r>
+    </w:p>
+    <w:p>
+      <w:pPr>
+        <w:pStyle w:val="Heading4"/>
+        <w:spacing w:before="0" w:after="40"/>
+        <w:rPr>
+          <w:rFonts w:eastAsia="Arial"/>
+        </w:rPr>
+      </w:pPr>
+      <w:r>
+        <w:rPr/>
         <w:drawing>
-          <wp:anchor behindDoc="0" distT="0" distB="0" distL="0" distR="0" simplePos="0" locked="0" layoutInCell="0" allowOverlap="1" relativeHeight="49">
+          <wp:anchor behindDoc="0" distT="0" distB="0" distL="0" distR="0" simplePos="0" locked="0" layoutInCell="0" allowOverlap="1" relativeHeight="140">
             <wp:simplePos x="0" y="0"/>
             <wp:positionH relativeFrom="column">
               <wp:align>center</wp:align>
             </wp:positionH>
             <wp:positionV relativeFrom="paragraph">
-              <wp:posOffset>635</wp:posOffset>
+              <wp:align>top</wp:align>
             </wp:positionV>
-            <wp:extent cx="6029960" cy="6811645"/>
+            <wp:extent cx="5760085" cy="8730615"/>
             <wp:effectExtent l="0" t="0" r="0" b="0"/>
             <wp:wrapSquare wrapText="largest"/>
             <wp:docPr id="16" name="Imagen13" descr=""/>
@@ -9532,7 +9618,7 @@
                   <pic:spPr bwMode="auto">
                     <a:xfrm>
                       <a:off x="0" y="0"/>
-                      <a:ext cx="6029960" cy="6811645"/>
+                      <a:ext cx="5760085" cy="8730615"/>
                     </a:xfrm>
                     <a:prstGeom prst="rect">
                       <a:avLst/>
@@ -9543,9 +9629,6 @@
             </a:graphic>
           </wp:anchor>
         </w:drawing>
-      </w:r>
-      <w:r>
-        <w:br w:type="page"/>
       </w:r>
     </w:p>
     <w:p>
@@ -10000,7 +10083,7 @@
         <w:pStyle w:val="ListParagraph"/>
         <w:numPr>
           <w:ilvl w:val="0"/>
-          <w:numId w:val="107"/>
+          <w:numId w:val="108"/>
         </w:numPr>
         <w:spacing w:lineRule="auto" w:line="240" w:before="0" w:after="40"/>
         <w:contextualSpacing w:val="false"/>
@@ -10013,26 +10096,6 @@
           <w:szCs w:val="20"/>
         </w:rPr>
         <w:t>El usuario selecciona Eliminar en el menú de frmNav.</w:t>
-      </w:r>
-    </w:p>
-    <w:p>
-      <w:pPr>
-        <w:pStyle w:val="ListParagraph"/>
-        <w:numPr>
-          <w:ilvl w:val="0"/>
-          <w:numId w:val="108"/>
-        </w:numPr>
-        <w:spacing w:lineRule="auto" w:line="240" w:before="0" w:after="40"/>
-        <w:contextualSpacing w:val="false"/>
-        <w:rPr/>
-      </w:pPr>
-      <w:r>
-        <w:rPr>
-          <w:rFonts w:eastAsia="Arial" w:cs="Arial" w:ascii="Arial" w:hAnsi="Arial"/>
-          <w:sz w:val="20"/>
-          <w:szCs w:val="20"/>
-        </w:rPr>
-        <w:t>El sistema abre frmEliminar con la lista de usuarios cargada.</w:t>
       </w:r>
     </w:p>
     <w:p>
@@ -10052,7 +10115,7 @@
           <w:sz w:val="20"/>
           <w:szCs w:val="20"/>
         </w:rPr>
-        <w:t>El usuario selecciona un registro; el sistema autocompleta los campos.</w:t>
+        <w:t>El sistema abre frmEliminar con la lista de usuarios cargada.</w:t>
       </w:r>
     </w:p>
     <w:p>
@@ -10072,6 +10135,26 @@
           <w:sz w:val="20"/>
           <w:szCs w:val="20"/>
         </w:rPr>
+        <w:t>El usuario selecciona un registro; el sistema autocompleta los campos.</w:t>
+      </w:r>
+    </w:p>
+    <w:p>
+      <w:pPr>
+        <w:pStyle w:val="ListParagraph"/>
+        <w:numPr>
+          <w:ilvl w:val="0"/>
+          <w:numId w:val="111"/>
+        </w:numPr>
+        <w:spacing w:lineRule="auto" w:line="240" w:before="0" w:after="40"/>
+        <w:contextualSpacing w:val="false"/>
+        <w:rPr/>
+      </w:pPr>
+      <w:r>
+        <w:rPr>
+          <w:rFonts w:eastAsia="Arial" w:cs="Arial" w:ascii="Arial" w:hAnsi="Arial"/>
+          <w:sz w:val="20"/>
+          <w:szCs w:val="20"/>
+        </w:rPr>
         <w:t>El usuario confirma; el sistema valida, elimina el registro y recarga la grilla.</w:t>
       </w:r>
     </w:p>
@@ -10100,15 +10183,17 @@
     </w:p>
     <w:p>
       <w:pPr>
-        <w:pStyle w:val="ListParagraph"/>
-        <w:numPr>
-          <w:ilvl w:val="1"/>
-          <w:numId w:val="5"/>
-        </w:numPr>
-        <w:spacing w:lineRule="auto" w:line="240" w:before="160" w:after="60"/>
-        <w:contextualSpacing/>
-        <w:rPr/>
-      </w:pPr>
+        <w:pStyle w:val="Normal"/>
+        <w:spacing w:before="160" w:after="60"/>
+        <w:rPr/>
+      </w:pPr>
+      <w:r>
+        <w:rPr>
+          <w:sz w:val="20"/>
+          <w:szCs w:val="20"/>
+        </w:rPr>
+        <w:t xml:space="preserve">4.1: </w:t>
+      </w:r>
       <w:r>
         <w:rPr>
           <w:sz w:val="20"/>
@@ -10120,21 +10205,121 @@
     <w:p>
       <w:pPr>
         <w:pStyle w:val="Normal"/>
-        <w:rPr/>
-      </w:pPr>
-      <w:r>
-        <w:rPr/>
+        <w:spacing w:before="160" w:after="60"/>
+        <w:rPr/>
+      </w:pPr>
+      <w:r>
+        <w:rPr>
+          <w:sz w:val="20"/>
+          <w:szCs w:val="20"/>
+        </w:rPr>
+        <w:t xml:space="preserve">3.1: </w:t>
+      </w:r>
+      <w:r>
+        <w:rPr>
+          <w:sz w:val="20"/>
+          <w:szCs w:val="20"/>
+        </w:rPr>
+        <w:t>El usuario a eliminar es el de la sesión activa: el sistema lo impide y muestra 'No puede eliminar al usuario con el que inició sesió</w:t>
+      </w:r>
+      <w:r>
+        <w:rPr>
+          <w:sz w:val="20"/>
+          <w:szCs w:val="20"/>
+        </w:rPr>
+        <w:t>n</w:t>
       </w:r>
     </w:p>
     <w:p>
       <w:pPr>
         <w:pStyle w:val="Normal"/>
-        <w:rPr/>
+        <w:spacing w:before="160" w:after="60"/>
+        <w:rPr>
+          <w:sz w:val="20"/>
+          <w:szCs w:val="20"/>
+        </w:rPr>
+      </w:pPr>
+      <w:r>
+        <w:rPr>
+          <w:sz w:val="20"/>
+          <w:szCs w:val="20"/>
+        </w:rPr>
+        <w:t xml:space="preserve">3.2: </w:t>
+      </w:r>
+      <w:r>
+        <w:rPr>
+          <w:sz w:val="20"/>
+          <w:szCs w:val="20"/>
+        </w:rPr>
+        <w:t xml:space="preserve">El sistema detecta que el usuario seleccionado es el administrador del sistema y muestra el aviso "No se puede eliminar al usuario administrador". La operación se cancela y no se ejecuta la baja. </w:t>
+      </w:r>
+    </w:p>
+    <w:p>
+      <w:pPr>
+        <w:pStyle w:val="ListParagraph"/>
+        <w:numPr>
+          <w:ilvl w:val="0"/>
+          <w:numId w:val="0"/>
+        </w:numPr>
+        <w:spacing w:lineRule="auto" w:line="240" w:before="160" w:after="60"/>
+        <w:ind w:hanging="0" w:left="360"/>
+        <w:contextualSpacing/>
+        <w:rPr>
+          <w:sz w:val="20"/>
+          <w:szCs w:val="20"/>
+        </w:rPr>
+      </w:pPr>
+      <w:r>
+        <w:rPr/>
+      </w:r>
+    </w:p>
+    <w:p>
+      <w:pPr>
+        <w:pStyle w:val="ListParagraph"/>
+        <w:spacing w:lineRule="auto" w:line="240" w:before="160" w:after="60"/>
+        <w:contextualSpacing/>
+        <w:rPr>
+          <w:sz w:val="20"/>
+          <w:szCs w:val="20"/>
+        </w:rPr>
+      </w:pPr>
+      <w:r>
+        <w:rPr/>
+      </w:r>
+    </w:p>
+    <w:p>
+      <w:pPr>
+        <w:pStyle w:val="Normal"/>
+        <w:rPr/>
+      </w:pPr>
+      <w:r>
+        <w:rPr/>
+      </w:r>
+    </w:p>
+    <w:p>
+      <w:pPr>
+        <w:pStyle w:val="Normal"/>
+        <w:rPr/>
+      </w:pPr>
+      <w:r>
+        <w:rPr/>
+      </w:r>
+      <w:r>
+        <w:br w:type="page"/>
+      </w:r>
+    </w:p>
+    <w:p>
+      <w:pPr>
+        <w:pStyle w:val="Heading4"/>
+        <w:spacing w:before="0" w:after="40"/>
+        <w:rPr>
+          <w:rFonts w:eastAsia="Arial"/>
+        </w:rPr>
       </w:pPr>
       <w:r>
         <w:rPr/>
         <w:drawing>
-          <wp:anchor behindDoc="0" distT="0" distB="0" distL="0" distR="0" simplePos="0" locked="0" layoutInCell="0" allowOverlap="1" relativeHeight="50">
+          <wp:anchor behindDoc="0" distT="0" distB="0" distL="0" distR="0" simplePos="0" locked="0" layoutInCell="0" allowOverlap="1" relativeHeight="141">
             <wp:simplePos x="0" y="0"/>
             <wp:positionH relativeFrom="column">
               <wp:align>center</wp:align>
@@ -10142,7 +10327,7 @@
             <wp:positionV relativeFrom="paragraph">
               <wp:posOffset>635</wp:posOffset>
             </wp:positionV>
-            <wp:extent cx="5946140" cy="8321040"/>
+            <wp:extent cx="5691505" cy="8456295"/>
             <wp:effectExtent l="0" t="0" r="0" b="0"/>
             <wp:wrapSquare wrapText="largest"/>
             <wp:docPr id="17" name="Imagen14" descr=""/>
@@ -10167,7 +10352,7 @@
                   <pic:spPr bwMode="auto">
                     <a:xfrm>
                       <a:off x="0" y="0"/>
-                      <a:ext cx="5946140" cy="8321040"/>
+                      <a:ext cx="5691505" cy="8456295"/>
                     </a:xfrm>
                     <a:prstGeom prst="rect">
                       <a:avLst/>
@@ -10178,9 +10363,6 @@
             </a:graphic>
           </wp:anchor>
         </w:drawing>
-      </w:r>
-      <w:r>
-        <w:br w:type="page"/>
       </w:r>
     </w:p>
     <w:p>
@@ -10667,7 +10849,7 @@
         <w:pStyle w:val="ListParagraph"/>
         <w:numPr>
           <w:ilvl w:val="0"/>
-          <w:numId w:val="111"/>
+          <w:numId w:val="112"/>
         </w:numPr>
         <w:spacing w:lineRule="auto" w:line="240" w:before="0" w:after="40"/>
         <w:contextualSpacing w:val="false"/>
@@ -10687,7 +10869,7 @@
         <w:pStyle w:val="ListParagraph"/>
         <w:numPr>
           <w:ilvl w:val="0"/>
-          <w:numId w:val="112"/>
+          <w:numId w:val="113"/>
         </w:numPr>
         <w:spacing w:lineRule="auto" w:line="240" w:before="0" w:after="40"/>
         <w:contextualSpacing w:val="false"/>
@@ -10707,7 +10889,7 @@
         <w:pStyle w:val="ListParagraph"/>
         <w:numPr>
           <w:ilvl w:val="0"/>
-          <w:numId w:val="113"/>
+          <w:numId w:val="114"/>
         </w:numPr>
         <w:spacing w:lineRule="auto" w:line="240" w:before="0" w:after="40"/>
         <w:contextualSpacing w:val="false"/>
@@ -10899,7 +11081,7 @@
         <w:pStyle w:val="ListParagraph"/>
         <w:numPr>
           <w:ilvl w:val="0"/>
-          <w:numId w:val="114"/>
+          <w:numId w:val="115"/>
         </w:numPr>
         <w:spacing w:lineRule="auto" w:line="240" w:before="0" w:after="80"/>
         <w:contextualSpacing w:val="false"/>
@@ -10912,26 +11094,6 @@
           <w:szCs w:val="24"/>
         </w:rPr>
         <w:t>El usuario selecciona la opción Salir desde el menú de frmNav.</w:t>
-      </w:r>
-    </w:p>
-    <w:p>
-      <w:pPr>
-        <w:pStyle w:val="ListParagraph"/>
-        <w:numPr>
-          <w:ilvl w:val="0"/>
-          <w:numId w:val="115"/>
-        </w:numPr>
-        <w:spacing w:lineRule="auto" w:line="240" w:before="0" w:after="80"/>
-        <w:contextualSpacing w:val="false"/>
-        <w:rPr/>
-      </w:pPr>
-      <w:r>
-        <w:rPr>
-          <w:rFonts w:eastAsia="Arial" w:cs="Arial" w:ascii="Arial" w:hAnsi="Arial"/>
-          <w:sz w:val="24"/>
-          <w:szCs w:val="24"/>
-        </w:rPr>
-        <w:t>El sistema invoca UsuarioBLL.Instancia.Logout(), que asigna UsuarioActivo = null.</w:t>
       </w:r>
     </w:p>
     <w:p>
@@ -10951,7 +11113,7 @@
           <w:sz w:val="24"/>
           <w:szCs w:val="24"/>
         </w:rPr>
-        <w:t>La instancia Singleton permanece en memoria pero sin sesión activa.</w:t>
+        <w:t>El sistema invoca UsuarioBLL.Instancia.Logout(), que asigna UsuarioActivo = null.</w:t>
       </w:r>
     </w:p>
     <w:p>
@@ -10971,7 +11133,7 @@
           <w:sz w:val="24"/>
           <w:szCs w:val="24"/>
         </w:rPr>
-        <w:t>El sistema cierra frmNav y presenta una nueva instancia de frmLogin.</w:t>
+        <w:t>La instancia Singleton permanece en memoria pero sin sesión activa.</w:t>
       </w:r>
     </w:p>
     <w:p>
@@ -10980,6 +11142,26 @@
         <w:numPr>
           <w:ilvl w:val="0"/>
           <w:numId w:val="118"/>
+        </w:numPr>
+        <w:spacing w:lineRule="auto" w:line="240" w:before="0" w:after="80"/>
+        <w:contextualSpacing w:val="false"/>
+        <w:rPr/>
+      </w:pPr>
+      <w:r>
+        <w:rPr>
+          <w:rFonts w:eastAsia="Arial" w:cs="Arial" w:ascii="Arial" w:hAnsi="Arial"/>
+          <w:sz w:val="24"/>
+          <w:szCs w:val="24"/>
+        </w:rPr>
+        <w:t>El sistema cierra frmNav y presenta una nueva instancia de frmLogin.</w:t>
+      </w:r>
+    </w:p>
+    <w:p>
+      <w:pPr>
+        <w:pStyle w:val="ListParagraph"/>
+        <w:numPr>
+          <w:ilvl w:val="0"/>
+          <w:numId w:val="119"/>
         </w:numPr>
         <w:spacing w:lineRule="auto" w:line="240" w:before="0" w:after="80"/>
         <w:contextualSpacing w:val="false"/>
@@ -11619,7 +11801,7 @@
         <mc:AlternateContent>
           <mc:Choice Requires="wps">
             <w:drawing>
-              <wp:anchor behindDoc="0" distT="0" distB="0" distL="0" distR="0" simplePos="0" locked="0" layoutInCell="1" allowOverlap="1" relativeHeight="32" wp14:anchorId="703276EB">
+              <wp:anchor behindDoc="0" distT="0" distB="0" distL="0" distR="0" simplePos="0" locked="0" layoutInCell="1" allowOverlap="1" relativeHeight="31" wp14:anchorId="703276EB">
                 <wp:simplePos x="0" y="0"/>
                 <wp:positionH relativeFrom="column">
                   <wp:posOffset>5130165</wp:posOffset>
@@ -14942,7 +15124,7 @@
       <w:r>
         <w:rPr/>
         <w:drawing>
-          <wp:anchor behindDoc="0" distT="0" distB="0" distL="0" distR="0" simplePos="0" locked="0" layoutInCell="0" allowOverlap="1" relativeHeight="34">
+          <wp:anchor behindDoc="0" distT="0" distB="0" distL="0" distR="0" simplePos="0" locked="0" layoutInCell="0" allowOverlap="1" relativeHeight="33">
             <wp:simplePos x="0" y="0"/>
             <wp:positionH relativeFrom="column">
               <wp:align>center</wp:align>
@@ -15456,7 +15638,7 @@
         <w:pStyle w:val="ListParagraph"/>
         <w:numPr>
           <w:ilvl w:val="0"/>
-          <w:numId w:val="119"/>
+          <w:numId w:val="120"/>
         </w:numPr>
         <w:spacing w:lineRule="auto" w:line="240" w:before="0" w:after="60"/>
         <w:contextualSpacing w:val="false"/>
@@ -15470,27 +15652,6 @@
           <w:szCs w:val="24"/>
         </w:rPr>
         <w:t>El administrador abre Perfiles y selecciona un usuario en la grilla.</w:t>
-      </w:r>
-    </w:p>
-    <w:p>
-      <w:pPr>
-        <w:pStyle w:val="ListParagraph"/>
-        <w:numPr>
-          <w:ilvl w:val="0"/>
-          <w:numId w:val="120"/>
-        </w:numPr>
-        <w:spacing w:lineRule="auto" w:line="240" w:before="0" w:after="60"/>
-        <w:contextualSpacing w:val="false"/>
-        <w:jc w:val="both"/>
-        <w:rPr/>
-      </w:pPr>
-      <w:r>
-        <w:rPr>
-          <w:rFonts w:eastAsia="Arial" w:cs="Arial" w:ascii="Arial" w:hAnsi="Arial"/>
-          <w:sz w:val="24"/>
-          <w:szCs w:val="24"/>
-        </w:rPr>
-        <w:t>El sistema marca en las listas los permisos atómicos y los conjuntos que el usuario ya posee, y dibuja su árbol de permisos.</w:t>
       </w:r>
     </w:p>
     <w:p>
@@ -15511,7 +15672,7 @@
           <w:sz w:val="24"/>
           <w:szCs w:val="24"/>
         </w:rPr>
-        <w:t>El administrador marca o desmarca permisos en ambas listas y presiona Guardar.</w:t>
+        <w:t>El sistema marca en las listas los permisos atómicos y los conjuntos que el usuario ya posee, y dibuja su árbol de permisos.</w:t>
       </w:r>
     </w:p>
     <w:p>
@@ -15532,22 +15693,7 @@
           <w:sz w:val="24"/>
           <w:szCs w:val="24"/>
         </w:rPr>
-        <w:t>El sistema reemplaza los permisos del usuario, registra el cambio en la bitácora (con el valor anterior y el nuevo) y refresca el árbol.</w:t>
-      </w:r>
-    </w:p>
-    <w:p>
-      <w:pPr>
-        <w:pStyle w:val="Normal"/>
-        <w:spacing w:before="120" w:after="160"/>
-        <w:rPr/>
-      </w:pPr>
-      <w:r>
-        <w:rPr>
-          <w:rFonts w:eastAsia="Arial" w:cs="Arial" w:ascii="Arial" w:hAnsi="Arial"/>
-          <w:sz w:val="24"/>
-          <w:szCs w:val="24"/>
-        </w:rPr>
-        <w:t>Flujos alternativos:</w:t>
+        <w:t>El administrador marca o desmarca permisos en ambas listas y presiona Guardar.</w:t>
       </w:r>
     </w:p>
     <w:p>
@@ -15568,6 +15714,42 @@
           <w:sz w:val="24"/>
           <w:szCs w:val="24"/>
         </w:rPr>
+        <w:t>El sistema reemplaza los permisos del usuario, registra el cambio en la bitácora (con el valor anterior y el nuevo) y refresca el árbol.</w:t>
+      </w:r>
+    </w:p>
+    <w:p>
+      <w:pPr>
+        <w:pStyle w:val="Normal"/>
+        <w:spacing w:before="120" w:after="160"/>
+        <w:rPr/>
+      </w:pPr>
+      <w:r>
+        <w:rPr>
+          <w:rFonts w:eastAsia="Arial" w:cs="Arial" w:ascii="Arial" w:hAnsi="Arial"/>
+          <w:sz w:val="24"/>
+          <w:szCs w:val="24"/>
+        </w:rPr>
+        <w:t>Flujos alternativos:</w:t>
+      </w:r>
+    </w:p>
+    <w:p>
+      <w:pPr>
+        <w:pStyle w:val="ListParagraph"/>
+        <w:numPr>
+          <w:ilvl w:val="0"/>
+          <w:numId w:val="124"/>
+        </w:numPr>
+        <w:spacing w:lineRule="auto" w:line="240" w:before="0" w:after="60"/>
+        <w:contextualSpacing w:val="false"/>
+        <w:jc w:val="both"/>
+        <w:rPr/>
+      </w:pPr>
+      <w:r>
+        <w:rPr>
+          <w:rFonts w:eastAsia="Arial" w:cs="Arial" w:ascii="Arial" w:hAnsi="Arial"/>
+          <w:sz w:val="24"/>
+          <w:szCs w:val="24"/>
+        </w:rPr>
         <w:t>Sin usuario seleccionado: el sistema muestra el aviso “Seleccione un usuario”.</w:t>
       </w:r>
     </w:p>
@@ -15614,7 +15796,7 @@
       <w:r>
         <w:rPr/>
         <w:drawing>
-          <wp:anchor behindDoc="0" distT="0" distB="0" distL="0" distR="0" simplePos="0" locked="0" layoutInCell="0" allowOverlap="1" relativeHeight="51">
+          <wp:anchor behindDoc="0" distT="0" distB="0" distL="0" distR="0" simplePos="0" locked="0" layoutInCell="0" allowOverlap="1" relativeHeight="48">
             <wp:simplePos x="0" y="0"/>
             <wp:positionH relativeFrom="column">
               <wp:align>center</wp:align>
@@ -15681,7 +15863,7 @@
       <w:r>
         <w:rPr/>
         <w:drawing>
-          <wp:anchor behindDoc="0" distT="0" distB="0" distL="0" distR="0" simplePos="0" locked="0" layoutInCell="0" allowOverlap="1" relativeHeight="52">
+          <wp:anchor behindDoc="0" distT="0" distB="0" distL="0" distR="0" simplePos="0" locked="0" layoutInCell="0" allowOverlap="1" relativeHeight="49">
             <wp:simplePos x="0" y="0"/>
             <wp:positionH relativeFrom="column">
               <wp:align>center</wp:align>
@@ -16080,7 +16262,7 @@
         <w:pStyle w:val="ListParagraph"/>
         <w:numPr>
           <w:ilvl w:val="0"/>
-          <w:numId w:val="124"/>
+          <w:numId w:val="125"/>
         </w:numPr>
         <w:spacing w:lineRule="auto" w:line="240" w:before="0" w:after="60"/>
         <w:contextualSpacing w:val="false"/>
@@ -16094,27 +16276,6 @@
           <w:szCs w:val="24"/>
         </w:rPr>
         <w:t>El administrador abre Permisos e ingresa un nombre para el conjunto.</w:t>
-      </w:r>
-    </w:p>
-    <w:p>
-      <w:pPr>
-        <w:pStyle w:val="ListParagraph"/>
-        <w:numPr>
-          <w:ilvl w:val="0"/>
-          <w:numId w:val="125"/>
-        </w:numPr>
-        <w:spacing w:lineRule="auto" w:line="240" w:before="0" w:after="60"/>
-        <w:contextualSpacing w:val="false"/>
-        <w:jc w:val="both"/>
-        <w:rPr/>
-      </w:pPr>
-      <w:r>
-        <w:rPr>
-          <w:rFonts w:eastAsia="Arial" w:cs="Arial" w:ascii="Arial" w:hAnsi="Arial"/>
-          <w:sz w:val="24"/>
-          <w:szCs w:val="24"/>
-        </w:rPr>
-        <w:t>Marca los permisos que lo integran; la lista incluye permisos atómicos y también compuestos, lo que permite formar un conjunto a partir de otros conjuntos.</w:t>
       </w:r>
     </w:p>
     <w:p>
@@ -16135,22 +16296,7 @@
           <w:sz w:val="24"/>
           <w:szCs w:val="24"/>
         </w:rPr>
-        <w:t>Presiona Crear; el sistema genera un permiso compuesto con un código único (GExxx), registra sus hijos y deja constancia en la bitácora.</w:t>
-      </w:r>
-    </w:p>
-    <w:p>
-      <w:pPr>
-        <w:pStyle w:val="Normal"/>
-        <w:spacing w:before="120" w:after="160"/>
-        <w:rPr/>
-      </w:pPr>
-      <w:r>
-        <w:rPr>
-          <w:rFonts w:eastAsia="Arial" w:cs="Arial" w:ascii="Arial" w:hAnsi="Arial"/>
-          <w:sz w:val="24"/>
-          <w:szCs w:val="24"/>
-        </w:rPr>
-        <w:t>Flujos alternativos:</w:t>
+        <w:t>Marca los permisos que lo integran; la lista incluye permisos atómicos y también compuestos, lo que permite formar un conjunto a partir de otros conjuntos.</w:t>
       </w:r>
     </w:p>
     <w:p>
@@ -16171,7 +16317,22 @@
           <w:sz w:val="24"/>
           <w:szCs w:val="24"/>
         </w:rPr>
-        <w:t>Actualizar / Eliminar: el administrador selecciona un conjunto y ejecuta la acción; el TreeView muestra el árbol del conjunto seleccionado.</w:t>
+        <w:t>Presiona Crear; el sistema genera un permiso compuesto con un código único (GExxx), registra sus hijos y deja constancia en la bitácora.</w:t>
+      </w:r>
+    </w:p>
+    <w:p>
+      <w:pPr>
+        <w:pStyle w:val="Normal"/>
+        <w:spacing w:before="120" w:after="160"/>
+        <w:rPr/>
+      </w:pPr>
+      <w:r>
+        <w:rPr>
+          <w:rFonts w:eastAsia="Arial" w:cs="Arial" w:ascii="Arial" w:hAnsi="Arial"/>
+          <w:sz w:val="24"/>
+          <w:szCs w:val="24"/>
+        </w:rPr>
+        <w:t>Flujos alternativos:</w:t>
       </w:r>
     </w:p>
     <w:p>
@@ -16192,6 +16353,27 @@
           <w:sz w:val="24"/>
           <w:szCs w:val="24"/>
         </w:rPr>
+        <w:t>Actualizar / Eliminar: el administrador selecciona un conjunto y ejecuta la acción; el TreeView muestra el árbol del conjunto seleccionado.</w:t>
+      </w:r>
+    </w:p>
+    <w:p>
+      <w:pPr>
+        <w:pStyle w:val="ListParagraph"/>
+        <w:numPr>
+          <w:ilvl w:val="0"/>
+          <w:numId w:val="129"/>
+        </w:numPr>
+        <w:spacing w:lineRule="auto" w:line="240" w:before="0" w:after="60"/>
+        <w:contextualSpacing w:val="false"/>
+        <w:jc w:val="both"/>
+        <w:rPr/>
+      </w:pPr>
+      <w:r>
+        <w:rPr>
+          <w:rFonts w:eastAsia="Arial" w:cs="Arial" w:ascii="Arial" w:hAnsi="Arial"/>
+          <w:sz w:val="24"/>
+          <w:szCs w:val="24"/>
+        </w:rPr>
         <w:t>Conjunto del sistema: si intenta modificar o eliminar Operador, Traductor, Auditor o Administrador, el sistema lo impide por tratarse de perfiles protegidos</w:t>
       </w:r>
     </w:p>
@@ -16227,7 +16409,7 @@
       <w:r>
         <w:rPr/>
         <w:drawing>
-          <wp:anchor behindDoc="0" distT="0" distB="0" distL="0" distR="0" simplePos="0" locked="0" layoutInCell="0" allowOverlap="1" relativeHeight="53">
+          <wp:anchor behindDoc="0" distT="0" distB="0" distL="0" distR="0" simplePos="0" locked="0" layoutInCell="0" allowOverlap="1" relativeHeight="50">
             <wp:simplePos x="0" y="0"/>
             <wp:positionH relativeFrom="column">
               <wp:align>center</wp:align>
@@ -16349,7 +16531,7 @@
       <w:r>
         <w:rPr/>
         <w:drawing>
-          <wp:anchor behindDoc="0" distT="0" distB="0" distL="0" distR="0" simplePos="0" locked="0" layoutInCell="0" allowOverlap="1" relativeHeight="54">
+          <wp:anchor behindDoc="0" distT="0" distB="0" distL="0" distR="0" simplePos="0" locked="0" layoutInCell="0" allowOverlap="1" relativeHeight="51">
             <wp:simplePos x="0" y="0"/>
             <wp:positionH relativeFrom="column">
               <wp:align>center</wp:align>
@@ -16405,7 +16587,7 @@
       <w:r>
         <w:rPr/>
         <w:drawing>
-          <wp:anchor behindDoc="0" distT="0" distB="0" distL="0" distR="0" simplePos="0" locked="0" layoutInCell="0" allowOverlap="1" relativeHeight="55">
+          <wp:anchor behindDoc="0" distT="0" distB="0" distL="0" distR="0" simplePos="0" locked="0" layoutInCell="0" allowOverlap="1" relativeHeight="52">
             <wp:simplePos x="0" y="0"/>
             <wp:positionH relativeFrom="column">
               <wp:align>center</wp:align>
@@ -16516,7 +16698,7 @@
       <w:r>
         <w:rPr/>
         <w:drawing>
-          <wp:anchor behindDoc="0" distT="0" distB="0" distL="0" distR="0" simplePos="0" locked="0" layoutInCell="0" allowOverlap="1" relativeHeight="57">
+          <wp:anchor behindDoc="0" distT="0" distB="0" distL="0" distR="0" simplePos="0" locked="0" layoutInCell="0" allowOverlap="1" relativeHeight="54">
             <wp:simplePos x="0" y="0"/>
             <wp:positionH relativeFrom="column">
               <wp:align>center</wp:align>
@@ -16794,9 +16976,17 @@
       <w:r>
         <w:rPr/>
         <w:drawing>
-          <wp:inline distT="0" distB="0" distL="0" distR="0">
-            <wp:extent cx="4579620" cy="5984240"/>
+          <wp:anchor behindDoc="0" distT="0" distB="0" distL="0" distR="0" simplePos="0" locked="0" layoutInCell="0" allowOverlap="1" relativeHeight="143">
+            <wp:simplePos x="0" y="0"/>
+            <wp:positionH relativeFrom="column">
+              <wp:align>center</wp:align>
+            </wp:positionH>
+            <wp:positionV relativeFrom="paragraph">
+              <wp:posOffset>635</wp:posOffset>
+            </wp:positionV>
+            <wp:extent cx="5760085" cy="7207250"/>
             <wp:effectExtent l="0" t="0" r="0" b="0"/>
+            <wp:wrapSquare wrapText="largest"/>
             <wp:docPr id="36" name="Imagen26" descr=""/>
             <wp:cNvGraphicFramePr>
               <a:graphicFrameLocks xmlns:a="http://schemas.openxmlformats.org/drawingml/2006/main" noChangeAspect="1"/>
@@ -16819,7 +17009,7 @@
                   <pic:spPr bwMode="auto">
                     <a:xfrm>
                       <a:off x="0" y="0"/>
-                      <a:ext cx="4579620" cy="5984240"/>
+                      <a:ext cx="5760085" cy="7207250"/>
                     </a:xfrm>
                     <a:prstGeom prst="rect">
                       <a:avLst/>
@@ -16828,7 +17018,7 @@
                 </pic:pic>
               </a:graphicData>
             </a:graphic>
-          </wp:inline>
+          </wp:anchor>
         </w:drawing>
       </w:r>
     </w:p>
@@ -17309,7 +17499,7 @@
         <w:pStyle w:val="ListParagraph"/>
         <w:numPr>
           <w:ilvl w:val="0"/>
-          <w:numId w:val="129"/>
+          <w:numId w:val="130"/>
         </w:numPr>
         <w:spacing w:lineRule="auto" w:line="240" w:before="0" w:after="60"/>
         <w:contextualSpacing w:val="false"/>
@@ -17323,27 +17513,6 @@
           <w:szCs w:val="24"/>
         </w:rPr>
         <w:t>El usuario selecciona un idioma del menú de idiomas.</w:t>
-      </w:r>
-    </w:p>
-    <w:p>
-      <w:pPr>
-        <w:pStyle w:val="ListParagraph"/>
-        <w:numPr>
-          <w:ilvl w:val="0"/>
-          <w:numId w:val="130"/>
-        </w:numPr>
-        <w:spacing w:lineRule="auto" w:line="240" w:before="0" w:after="60"/>
-        <w:contextualSpacing w:val="false"/>
-        <w:jc w:val="both"/>
-        <w:rPr/>
-      </w:pPr>
-      <w:r>
-        <w:rPr>
-          <w:rFonts w:eastAsia="Arial" w:cs="Arial" w:ascii="Arial" w:hAnsi="Arial"/>
-          <w:sz w:val="24"/>
-          <w:szCs w:val="24"/>
-        </w:rPr>
-        <w:t>GestorIdioma fija el idioma activo y notifica a todos los observadores suscriptos.</w:t>
       </w:r>
     </w:p>
     <w:p>
@@ -17364,6 +17533,27 @@
           <w:sz w:val="24"/>
           <w:szCs w:val="24"/>
         </w:rPr>
+        <w:t>GestorIdioma fija el idioma activo y notifica a todos los observadores suscriptos.</w:t>
+      </w:r>
+    </w:p>
+    <w:p>
+      <w:pPr>
+        <w:pStyle w:val="ListParagraph"/>
+        <w:numPr>
+          <w:ilvl w:val="0"/>
+          <w:numId w:val="132"/>
+        </w:numPr>
+        <w:spacing w:lineRule="auto" w:line="240" w:before="0" w:after="60"/>
+        <w:contextualSpacing w:val="false"/>
+        <w:jc w:val="both"/>
+        <w:rPr/>
+      </w:pPr>
+      <w:r>
+        <w:rPr>
+          <w:rFonts w:eastAsia="Arial" w:cs="Arial" w:ascii="Arial" w:hAnsi="Arial"/>
+          <w:sz w:val="24"/>
+          <w:szCs w:val="24"/>
+        </w:rPr>
         <w:t>Cada formulario, al recibir la notificación, traduce sus controles mediante TraductorUI.</w:t>
       </w:r>
     </w:p>
@@ -17387,7 +17577,7 @@
         <w:pStyle w:val="ListParagraph"/>
         <w:numPr>
           <w:ilvl w:val="0"/>
-          <w:numId w:val="132"/>
+          <w:numId w:val="133"/>
         </w:numPr>
         <w:spacing w:lineRule="auto" w:line="240" w:before="0" w:after="60"/>
         <w:contextualSpacing w:val="false"/>
@@ -17848,7 +18038,7 @@
         <w:pStyle w:val="ListParagraph"/>
         <w:numPr>
           <w:ilvl w:val="0"/>
-          <w:numId w:val="133"/>
+          <w:numId w:val="134"/>
         </w:numPr>
         <w:spacing w:lineRule="auto" w:line="240" w:before="0" w:after="60"/>
         <w:contextualSpacing w:val="false"/>
@@ -17862,27 +18052,6 @@
           <w:szCs w:val="24"/>
         </w:rPr>
         <w:t>El usuario agrega un idioma (se le asignan todas las claves) o una clave/tag (se asigna a todos los idiomas).</w:t>
-      </w:r>
-    </w:p>
-    <w:p>
-      <w:pPr>
-        <w:pStyle w:val="ListParagraph"/>
-        <w:numPr>
-          <w:ilvl w:val="0"/>
-          <w:numId w:val="134"/>
-        </w:numPr>
-        <w:spacing w:lineRule="auto" w:line="240" w:before="0" w:after="60"/>
-        <w:contextualSpacing w:val="false"/>
-        <w:jc w:val="both"/>
-        <w:rPr/>
-      </w:pPr>
-      <w:r>
-        <w:rPr>
-          <w:rFonts w:eastAsia="Arial" w:cs="Arial" w:ascii="Arial" w:hAnsi="Arial"/>
-          <w:sz w:val="24"/>
-          <w:szCs w:val="24"/>
-        </w:rPr>
-        <w:t>Selecciona un idioma, edita la traducción de una clave y presiona Guardar.</w:t>
       </w:r>
     </w:p>
     <w:p>
@@ -17903,6 +18072,27 @@
           <w:sz w:val="24"/>
           <w:szCs w:val="24"/>
         </w:rPr>
+        <w:t>Selecciona un idioma, edita la traducción de una clave y presiona Guardar.</w:t>
+      </w:r>
+    </w:p>
+    <w:p>
+      <w:pPr>
+        <w:pStyle w:val="ListParagraph"/>
+        <w:numPr>
+          <w:ilvl w:val="0"/>
+          <w:numId w:val="136"/>
+        </w:numPr>
+        <w:spacing w:lineRule="auto" w:line="240" w:before="0" w:after="60"/>
+        <w:contextualSpacing w:val="false"/>
+        <w:jc w:val="both"/>
+        <w:rPr/>
+      </w:pPr>
+      <w:r>
+        <w:rPr>
+          <w:rFonts w:eastAsia="Arial" w:cs="Arial" w:ascii="Arial" w:hAnsi="Arial"/>
+          <w:sz w:val="24"/>
+          <w:szCs w:val="24"/>
+        </w:rPr>
         <w:t>El sistema persiste la traducción y registra la operación en la bitácora de auditoría de idiomas.</w:t>
       </w:r>
     </w:p>
@@ -17926,7 +18116,7 @@
         <w:pStyle w:val="ListParagraph"/>
         <w:numPr>
           <w:ilvl w:val="0"/>
-          <w:numId w:val="136"/>
+          <w:numId w:val="137"/>
         </w:numPr>
         <w:spacing w:lineRule="auto" w:line="240" w:before="0" w:after="60"/>
         <w:contextualSpacing w:val="false"/>
@@ -18094,7 +18284,7 @@
           <w:szCs w:val="24"/>
         </w:rPr>
         <w:drawing>
-          <wp:anchor behindDoc="0" distT="0" distB="0" distL="0" distR="0" simplePos="0" locked="0" layoutInCell="0" allowOverlap="1" relativeHeight="58">
+          <wp:anchor behindDoc="0" distT="0" distB="0" distL="0" distR="0" simplePos="0" locked="0" layoutInCell="0" allowOverlap="1" relativeHeight="55">
             <wp:simplePos x="0" y="0"/>
             <wp:positionH relativeFrom="column">
               <wp:align>center</wp:align>
@@ -18168,6 +18358,875 @@
     </w:p>
     <w:p>
       <w:pPr>
+        <w:pStyle w:val="Heading4"/>
+        <w:rPr/>
+      </w:pPr>
+      <w:r>
+        <w:rPr>
+          <w:rFonts w:eastAsia="Arial"/>
+        </w:rPr>
+        <w:t>CU-1</w:t>
+      </w:r>
+      <w:r>
+        <w:rPr>
+          <w:rFonts w:eastAsia="Arial"/>
+        </w:rPr>
+        <w:t>9</w:t>
+      </w:r>
+      <w:r>
+        <w:rPr>
+          <w:rFonts w:eastAsia="Arial"/>
+        </w:rPr>
+        <w:t xml:space="preserve">: </w:t>
+      </w:r>
+      <w:r>
+        <w:rPr>
+          <w:rFonts w:eastAsia="Arial"/>
+        </w:rPr>
+        <w:t>Actualizar Idioma</w:t>
+      </w:r>
+    </w:p>
+    <w:tbl>
+      <w:tblPr>
+        <w:tblW w:w="9071" w:type="dxa"/>
+        <w:jc w:val="left"/>
+        <w:tblInd w:w="55" w:type="dxa"/>
+        <w:tblLayout w:type="fixed"/>
+        <w:tblCellMar>
+          <w:top w:w="55" w:type="dxa"/>
+          <w:left w:w="55" w:type="dxa"/>
+          <w:bottom w:w="55" w:type="dxa"/>
+          <w:right w:w="55" w:type="dxa"/>
+        </w:tblCellMar>
+      </w:tblPr>
+      <w:tblGrid>
+        <w:gridCol w:w="1690"/>
+        <w:gridCol w:w="7381"/>
+      </w:tblGrid>
+      <w:tr>
+        <w:trPr/>
+        <w:tc>
+          <w:tcPr>
+            <w:tcW w:w="1690" w:type="dxa"/>
+            <w:tcBorders>
+              <w:top w:val="single" w:sz="4" w:space="0" w:color="000000"/>
+              <w:left w:val="single" w:sz="4" w:space="0" w:color="000000"/>
+              <w:bottom w:val="single" w:sz="4" w:space="0" w:color="000000"/>
+            </w:tcBorders>
+            <w:vAlign w:val="center"/>
+          </w:tcPr>
+          <w:p>
+            <w:pPr>
+              <w:pStyle w:val="Contenidodelatabla"/>
+              <w:spacing w:before="0" w:after="160"/>
+              <w:jc w:val="left"/>
+              <w:rPr>
+                <w:rFonts w:ascii="Liberation Serif" w:hAnsi="Liberation Serif"/>
+                <w:b w:val="false"/>
+                <w:bCs w:val="false"/>
+                <w:i w:val="false"/>
+                <w:i w:val="false"/>
+                <w:iCs w:val="false"/>
+                <w:strike w:val="false"/>
+                <w:dstrike w:val="false"/>
+                <w:outline w:val="false"/>
+                <w:shadow w:val="false"/>
+                <w:color w:val="000000"/>
+                <w:sz w:val="24"/>
+                <w:szCs w:val="24"/>
+                <w:u w:val="none"/>
+              </w:rPr>
+            </w:pPr>
+            <w:r>
+              <w:rPr>
+                <w:rStyle w:val="Strong"/>
+                <w:rFonts w:ascii="Arial" w:hAnsi="Arial"/>
+                <w:i w:val="false"/>
+                <w:iCs w:val="false"/>
+                <w:strike w:val="false"/>
+                <w:dstrike w:val="false"/>
+                <w:outline w:val="false"/>
+                <w:shadow w:val="false"/>
+                <w:color w:val="auto"/>
+                <w:sz w:val="22"/>
+                <w:szCs w:val="22"/>
+                <w:u w:val="none"/>
+              </w:rPr>
+              <w:t>Identificador</w:t>
+            </w:r>
+          </w:p>
+        </w:tc>
+        <w:tc>
+          <w:tcPr>
+            <w:tcW w:w="7381" w:type="dxa"/>
+            <w:tcBorders>
+              <w:top w:val="single" w:sz="4" w:space="0" w:color="000000"/>
+              <w:left w:val="single" w:sz="4" w:space="0" w:color="000000"/>
+              <w:bottom w:val="single" w:sz="4" w:space="0" w:color="000000"/>
+              <w:right w:val="single" w:sz="4" w:space="0" w:color="000000"/>
+            </w:tcBorders>
+            <w:vAlign w:val="center"/>
+          </w:tcPr>
+          <w:p>
+            <w:pPr>
+              <w:pStyle w:val="Contenidodelatabla"/>
+              <w:spacing w:before="0" w:after="160"/>
+              <w:jc w:val="left"/>
+              <w:rPr>
+                <w:rFonts w:ascii="Liberation Serif" w:hAnsi="Liberation Serif"/>
+                <w:b w:val="false"/>
+                <w:bCs w:val="false"/>
+                <w:i w:val="false"/>
+                <w:i w:val="false"/>
+                <w:iCs w:val="false"/>
+                <w:strike w:val="false"/>
+                <w:dstrike w:val="false"/>
+                <w:outline w:val="false"/>
+                <w:shadow w:val="false"/>
+                <w:color w:val="auto"/>
+                <w:sz w:val="24"/>
+                <w:szCs w:val="24"/>
+                <w:u w:val="none"/>
+              </w:rPr>
+            </w:pPr>
+            <w:r>
+              <w:rPr>
+                <w:rFonts w:ascii="Liberation Serif" w:hAnsi="Liberation Serif"/>
+                <w:b w:val="false"/>
+                <w:bCs w:val="false"/>
+                <w:i w:val="false"/>
+                <w:iCs w:val="false"/>
+                <w:strike w:val="false"/>
+                <w:dstrike w:val="false"/>
+                <w:outline w:val="false"/>
+                <w:shadow w:val="false"/>
+                <w:color w:val="auto"/>
+                <w:sz w:val="24"/>
+                <w:szCs w:val="24"/>
+                <w:u w:val="none"/>
+              </w:rPr>
+              <w:t>CU-19</w:t>
+            </w:r>
+          </w:p>
+        </w:tc>
+      </w:tr>
+      <w:tr>
+        <w:trPr/>
+        <w:tc>
+          <w:tcPr>
+            <w:tcW w:w="1690" w:type="dxa"/>
+            <w:tcBorders>
+              <w:left w:val="single" w:sz="4" w:space="0" w:color="000000"/>
+              <w:bottom w:val="single" w:sz="4" w:space="0" w:color="000000"/>
+            </w:tcBorders>
+            <w:vAlign w:val="center"/>
+          </w:tcPr>
+          <w:p>
+            <w:pPr>
+              <w:pStyle w:val="Contenidodelatabla"/>
+              <w:spacing w:before="0" w:after="160"/>
+              <w:jc w:val="left"/>
+              <w:rPr>
+                <w:rFonts w:ascii="Liberation Serif" w:hAnsi="Liberation Serif"/>
+                <w:b w:val="false"/>
+                <w:bCs w:val="false"/>
+                <w:i w:val="false"/>
+                <w:i w:val="false"/>
+                <w:iCs w:val="false"/>
+                <w:strike w:val="false"/>
+                <w:dstrike w:val="false"/>
+                <w:outline w:val="false"/>
+                <w:shadow w:val="false"/>
+                <w:color w:val="000000"/>
+                <w:sz w:val="24"/>
+                <w:szCs w:val="24"/>
+                <w:u w:val="none"/>
+              </w:rPr>
+            </w:pPr>
+            <w:r>
+              <w:rPr>
+                <w:rStyle w:val="Strong"/>
+                <w:rFonts w:ascii="Arial" w:hAnsi="Arial"/>
+                <w:i w:val="false"/>
+                <w:iCs w:val="false"/>
+                <w:strike w:val="false"/>
+                <w:dstrike w:val="false"/>
+                <w:outline w:val="false"/>
+                <w:shadow w:val="false"/>
+                <w:color w:val="auto"/>
+                <w:sz w:val="22"/>
+                <w:szCs w:val="22"/>
+                <w:u w:val="none"/>
+              </w:rPr>
+              <w:t>Actor</w:t>
+            </w:r>
+          </w:p>
+        </w:tc>
+        <w:tc>
+          <w:tcPr>
+            <w:tcW w:w="7381" w:type="dxa"/>
+            <w:tcBorders>
+              <w:left w:val="single" w:sz="4" w:space="0" w:color="000000"/>
+              <w:bottom w:val="single" w:sz="4" w:space="0" w:color="000000"/>
+              <w:right w:val="single" w:sz="4" w:space="0" w:color="000000"/>
+            </w:tcBorders>
+            <w:vAlign w:val="center"/>
+          </w:tcPr>
+          <w:p>
+            <w:pPr>
+              <w:pStyle w:val="Contenidodelatabla"/>
+              <w:spacing w:before="0" w:after="160"/>
+              <w:jc w:val="left"/>
+              <w:rPr>
+                <w:rFonts w:ascii="Liberation Serif" w:hAnsi="Liberation Serif"/>
+                <w:b w:val="false"/>
+                <w:bCs w:val="false"/>
+                <w:i w:val="false"/>
+                <w:i w:val="false"/>
+                <w:iCs w:val="false"/>
+                <w:strike w:val="false"/>
+                <w:dstrike w:val="false"/>
+                <w:outline w:val="false"/>
+                <w:shadow w:val="false"/>
+                <w:color w:val="auto"/>
+                <w:sz w:val="24"/>
+                <w:szCs w:val="24"/>
+                <w:u w:val="none"/>
+              </w:rPr>
+            </w:pPr>
+            <w:r>
+              <w:rPr>
+                <w:rFonts w:ascii="Liberation Serif" w:hAnsi="Liberation Serif"/>
+                <w:b w:val="false"/>
+                <w:bCs w:val="false"/>
+                <w:i w:val="false"/>
+                <w:iCs w:val="false"/>
+                <w:strike w:val="false"/>
+                <w:dstrike w:val="false"/>
+                <w:outline w:val="false"/>
+                <w:shadow w:val="false"/>
+                <w:color w:val="auto"/>
+                <w:sz w:val="24"/>
+                <w:szCs w:val="24"/>
+                <w:u w:val="none"/>
+              </w:rPr>
+              <w:t>Usuario con permisos de idioma (perfil Traductor)</w:t>
+            </w:r>
+          </w:p>
+        </w:tc>
+      </w:tr>
+      <w:tr>
+        <w:trPr/>
+        <w:tc>
+          <w:tcPr>
+            <w:tcW w:w="1690" w:type="dxa"/>
+            <w:tcBorders>
+              <w:left w:val="single" w:sz="4" w:space="0" w:color="000000"/>
+              <w:bottom w:val="single" w:sz="4" w:space="0" w:color="000000"/>
+            </w:tcBorders>
+            <w:vAlign w:val="center"/>
+          </w:tcPr>
+          <w:p>
+            <w:pPr>
+              <w:pStyle w:val="Contenidodelatabla"/>
+              <w:spacing w:before="0" w:after="160"/>
+              <w:jc w:val="left"/>
+              <w:rPr>
+                <w:rFonts w:ascii="Liberation Serif" w:hAnsi="Liberation Serif"/>
+                <w:b w:val="false"/>
+                <w:bCs w:val="false"/>
+                <w:i w:val="false"/>
+                <w:i w:val="false"/>
+                <w:iCs w:val="false"/>
+                <w:strike w:val="false"/>
+                <w:dstrike w:val="false"/>
+                <w:outline w:val="false"/>
+                <w:shadow w:val="false"/>
+                <w:color w:val="000000"/>
+                <w:sz w:val="24"/>
+                <w:szCs w:val="24"/>
+                <w:u w:val="none"/>
+              </w:rPr>
+            </w:pPr>
+            <w:r>
+              <w:rPr>
+                <w:rStyle w:val="Strong"/>
+                <w:rFonts w:ascii="Arial" w:hAnsi="Arial"/>
+                <w:i w:val="false"/>
+                <w:iCs w:val="false"/>
+                <w:strike w:val="false"/>
+                <w:dstrike w:val="false"/>
+                <w:outline w:val="false"/>
+                <w:shadow w:val="false"/>
+                <w:color w:val="auto"/>
+                <w:sz w:val="22"/>
+                <w:szCs w:val="22"/>
+                <w:u w:val="none"/>
+              </w:rPr>
+              <w:t>Precondición</w:t>
+            </w:r>
+          </w:p>
+        </w:tc>
+        <w:tc>
+          <w:tcPr>
+            <w:tcW w:w="7381" w:type="dxa"/>
+            <w:tcBorders>
+              <w:left w:val="single" w:sz="4" w:space="0" w:color="000000"/>
+              <w:bottom w:val="single" w:sz="4" w:space="0" w:color="000000"/>
+              <w:right w:val="single" w:sz="4" w:space="0" w:color="000000"/>
+            </w:tcBorders>
+            <w:vAlign w:val="center"/>
+          </w:tcPr>
+          <w:p>
+            <w:pPr>
+              <w:pStyle w:val="Contenidodelatabla"/>
+              <w:spacing w:before="0" w:after="160"/>
+              <w:jc w:val="left"/>
+              <w:rPr>
+                <w:rFonts w:ascii="Liberation Serif" w:hAnsi="Liberation Serif"/>
+                <w:b w:val="false"/>
+                <w:bCs w:val="false"/>
+                <w:i w:val="false"/>
+                <w:i w:val="false"/>
+                <w:iCs w:val="false"/>
+                <w:strike w:val="false"/>
+                <w:dstrike w:val="false"/>
+                <w:outline w:val="false"/>
+                <w:shadow w:val="false"/>
+                <w:color w:val="000000"/>
+                <w:sz w:val="24"/>
+                <w:szCs w:val="24"/>
+                <w:u w:val="none"/>
+              </w:rPr>
+            </w:pPr>
+            <w:r>
+              <w:rPr>
+                <w:rStyle w:val="Textooriginal"/>
+                <w:rFonts w:ascii="Arial" w:hAnsi="Arial"/>
+                <w:b w:val="false"/>
+                <w:bCs w:val="false"/>
+                <w:i w:val="false"/>
+                <w:iCs w:val="false"/>
+                <w:strike w:val="false"/>
+                <w:dstrike w:val="false"/>
+                <w:outline w:val="false"/>
+                <w:shadow w:val="false"/>
+                <w:color w:val="auto"/>
+                <w:sz w:val="22"/>
+                <w:szCs w:val="22"/>
+                <w:u w:val="none"/>
+              </w:rPr>
+              <w:t>frmIdioma</w:t>
+            </w:r>
+            <w:r>
+              <w:rPr>
+                <w:rFonts w:ascii="Arial" w:hAnsi="Arial"/>
+                <w:b w:val="false"/>
+                <w:bCs w:val="false"/>
+                <w:i w:val="false"/>
+                <w:iCs w:val="false"/>
+                <w:strike w:val="false"/>
+                <w:dstrike w:val="false"/>
+                <w:outline w:val="false"/>
+                <w:shadow w:val="false"/>
+                <w:color w:val="auto"/>
+                <w:sz w:val="22"/>
+                <w:szCs w:val="22"/>
+                <w:u w:val="none"/>
+              </w:rPr>
+              <w:t xml:space="preserve"> visible. Existe al menos un idioma cargado y hay uno seleccionado en la grilla.</w:t>
+            </w:r>
+          </w:p>
+        </w:tc>
+      </w:tr>
+      <w:tr>
+        <w:trPr/>
+        <w:tc>
+          <w:tcPr>
+            <w:tcW w:w="1690" w:type="dxa"/>
+            <w:tcBorders>
+              <w:left w:val="single" w:sz="4" w:space="0" w:color="000000"/>
+              <w:bottom w:val="single" w:sz="4" w:space="0" w:color="000000"/>
+            </w:tcBorders>
+            <w:vAlign w:val="center"/>
+          </w:tcPr>
+          <w:p>
+            <w:pPr>
+              <w:pStyle w:val="Contenidodelatabla"/>
+              <w:spacing w:before="0" w:after="160"/>
+              <w:jc w:val="left"/>
+              <w:rPr>
+                <w:rFonts w:ascii="Liberation Serif" w:hAnsi="Liberation Serif"/>
+                <w:b w:val="false"/>
+                <w:bCs w:val="false"/>
+                <w:i w:val="false"/>
+                <w:i w:val="false"/>
+                <w:iCs w:val="false"/>
+                <w:strike w:val="false"/>
+                <w:dstrike w:val="false"/>
+                <w:outline w:val="false"/>
+                <w:shadow w:val="false"/>
+                <w:color w:val="000000"/>
+                <w:sz w:val="24"/>
+                <w:szCs w:val="24"/>
+                <w:u w:val="none"/>
+              </w:rPr>
+            </w:pPr>
+            <w:r>
+              <w:rPr>
+                <w:rStyle w:val="Strong"/>
+                <w:rFonts w:ascii="Arial" w:hAnsi="Arial"/>
+                <w:i w:val="false"/>
+                <w:iCs w:val="false"/>
+                <w:strike w:val="false"/>
+                <w:dstrike w:val="false"/>
+                <w:outline w:val="false"/>
+                <w:shadow w:val="false"/>
+                <w:color w:val="auto"/>
+                <w:sz w:val="22"/>
+                <w:szCs w:val="22"/>
+                <w:u w:val="none"/>
+              </w:rPr>
+              <w:t>Postcondición</w:t>
+            </w:r>
+          </w:p>
+        </w:tc>
+        <w:tc>
+          <w:tcPr>
+            <w:tcW w:w="7381" w:type="dxa"/>
+            <w:tcBorders>
+              <w:left w:val="single" w:sz="4" w:space="0" w:color="000000"/>
+              <w:bottom w:val="single" w:sz="4" w:space="0" w:color="000000"/>
+              <w:right w:val="single" w:sz="4" w:space="0" w:color="000000"/>
+            </w:tcBorders>
+            <w:vAlign w:val="center"/>
+          </w:tcPr>
+          <w:p>
+            <w:pPr>
+              <w:pStyle w:val="Contenidodelatabla"/>
+              <w:spacing w:before="0" w:after="160"/>
+              <w:jc w:val="left"/>
+              <w:rPr>
+                <w:rFonts w:ascii="Liberation Serif" w:hAnsi="Liberation Serif"/>
+                <w:b w:val="false"/>
+                <w:bCs w:val="false"/>
+                <w:i w:val="false"/>
+                <w:i w:val="false"/>
+                <w:iCs w:val="false"/>
+                <w:strike w:val="false"/>
+                <w:dstrike w:val="false"/>
+                <w:outline w:val="false"/>
+                <w:shadow w:val="false"/>
+                <w:color w:val="auto"/>
+                <w:sz w:val="24"/>
+                <w:szCs w:val="24"/>
+                <w:u w:val="none"/>
+              </w:rPr>
+            </w:pPr>
+            <w:r>
+              <w:rPr>
+                <w:rFonts w:ascii="Liberation Serif" w:hAnsi="Liberation Serif"/>
+                <w:b w:val="false"/>
+                <w:bCs w:val="false"/>
+                <w:i w:val="false"/>
+                <w:iCs w:val="false"/>
+                <w:strike w:val="false"/>
+                <w:dstrike w:val="false"/>
+                <w:outline w:val="false"/>
+                <w:shadow w:val="false"/>
+                <w:color w:val="auto"/>
+                <w:sz w:val="24"/>
+                <w:szCs w:val="24"/>
+                <w:u w:val="none"/>
+              </w:rPr>
+              <w:t>El idioma queda actualizado (nombre y/o condición de por defecto). Si se marcó como predeterminado, ningún otro idioma queda como por defecto. La operación se registra en la bitácora.</w:t>
+            </w:r>
+          </w:p>
+        </w:tc>
+      </w:tr>
+      <w:tr>
+        <w:trPr/>
+        <w:tc>
+          <w:tcPr>
+            <w:tcW w:w="1690" w:type="dxa"/>
+            <w:tcBorders>
+              <w:left w:val="single" w:sz="4" w:space="0" w:color="000000"/>
+              <w:bottom w:val="single" w:sz="4" w:space="0" w:color="000000"/>
+            </w:tcBorders>
+            <w:vAlign w:val="center"/>
+          </w:tcPr>
+          <w:p>
+            <w:pPr>
+              <w:pStyle w:val="Contenidodelatabla"/>
+              <w:spacing w:before="0" w:after="160"/>
+              <w:jc w:val="left"/>
+              <w:rPr>
+                <w:rFonts w:ascii="Liberation Serif" w:hAnsi="Liberation Serif"/>
+                <w:b w:val="false"/>
+                <w:bCs w:val="false"/>
+                <w:i w:val="false"/>
+                <w:i w:val="false"/>
+                <w:iCs w:val="false"/>
+                <w:strike w:val="false"/>
+                <w:dstrike w:val="false"/>
+                <w:outline w:val="false"/>
+                <w:shadow w:val="false"/>
+                <w:color w:val="000000"/>
+                <w:sz w:val="24"/>
+                <w:szCs w:val="24"/>
+                <w:u w:val="none"/>
+              </w:rPr>
+            </w:pPr>
+            <w:r>
+              <w:rPr>
+                <w:rStyle w:val="Strong"/>
+                <w:rFonts w:ascii="Arial" w:hAnsi="Arial"/>
+                <w:i w:val="false"/>
+                <w:iCs w:val="false"/>
+                <w:strike w:val="false"/>
+                <w:dstrike w:val="false"/>
+                <w:outline w:val="false"/>
+                <w:shadow w:val="false"/>
+                <w:color w:val="auto"/>
+                <w:sz w:val="22"/>
+                <w:szCs w:val="22"/>
+                <w:u w:val="none"/>
+              </w:rPr>
+              <w:t>Prioridad</w:t>
+            </w:r>
+          </w:p>
+        </w:tc>
+        <w:tc>
+          <w:tcPr>
+            <w:tcW w:w="7381" w:type="dxa"/>
+            <w:tcBorders>
+              <w:left w:val="single" w:sz="4" w:space="0" w:color="000000"/>
+              <w:bottom w:val="single" w:sz="4" w:space="0" w:color="000000"/>
+              <w:right w:val="single" w:sz="4" w:space="0" w:color="000000"/>
+            </w:tcBorders>
+            <w:vAlign w:val="center"/>
+          </w:tcPr>
+          <w:p>
+            <w:pPr>
+              <w:pStyle w:val="Contenidodelatabla"/>
+              <w:spacing w:before="0" w:after="160"/>
+              <w:jc w:val="left"/>
+              <w:rPr>
+                <w:rFonts w:ascii="Liberation Serif" w:hAnsi="Liberation Serif"/>
+                <w:b w:val="false"/>
+                <w:bCs w:val="false"/>
+                <w:i w:val="false"/>
+                <w:i w:val="false"/>
+                <w:iCs w:val="false"/>
+                <w:strike w:val="false"/>
+                <w:dstrike w:val="false"/>
+                <w:outline w:val="false"/>
+                <w:shadow w:val="false"/>
+                <w:color w:val="auto"/>
+                <w:sz w:val="24"/>
+                <w:szCs w:val="24"/>
+                <w:u w:val="none"/>
+              </w:rPr>
+            </w:pPr>
+            <w:r>
+              <w:rPr>
+                <w:rFonts w:ascii="Liberation Serif" w:hAnsi="Liberation Serif"/>
+                <w:b w:val="false"/>
+                <w:bCs w:val="false"/>
+                <w:i w:val="false"/>
+                <w:iCs w:val="false"/>
+                <w:strike w:val="false"/>
+                <w:dstrike w:val="false"/>
+                <w:outline w:val="false"/>
+                <w:shadow w:val="false"/>
+                <w:color w:val="auto"/>
+                <w:sz w:val="24"/>
+                <w:szCs w:val="24"/>
+                <w:u w:val="none"/>
+              </w:rPr>
+              <w:t>Media</w:t>
+            </w:r>
+          </w:p>
+        </w:tc>
+      </w:tr>
+    </w:tbl>
+    <w:p>
+      <w:pPr>
+        <w:pStyle w:val="Normal"/>
+        <w:rPr>
+          <w:rFonts w:eastAsia="Arial"/>
+        </w:rPr>
+      </w:pPr>
+      <w:r>
+        <w:rPr/>
+      </w:r>
+    </w:p>
+    <w:p>
+      <w:pPr>
+        <w:pStyle w:val="BodyText"/>
+        <w:rPr>
+          <w:rFonts w:ascii="Arial" w:hAnsi="Arial"/>
+          <w:sz w:val="24"/>
+          <w:szCs w:val="24"/>
+        </w:rPr>
+      </w:pPr>
+      <w:r>
+        <w:rPr>
+          <w:rFonts w:eastAsia="Arial" w:ascii="Arial" w:hAnsi="Arial"/>
+          <w:sz w:val="24"/>
+          <w:szCs w:val="24"/>
+        </w:rPr>
+        <w:t>Flujo principal:</w:t>
+      </w:r>
+    </w:p>
+    <w:p>
+      <w:pPr>
+        <w:pStyle w:val="BodyText"/>
+        <w:numPr>
+          <w:ilvl w:val="0"/>
+          <w:numId w:val="78"/>
+        </w:numPr>
+        <w:tabs>
+          <w:tab w:val="clear" w:pos="708"/>
+          <w:tab w:val="left" w:pos="0" w:leader="none"/>
+        </w:tabs>
+        <w:bidi w:val="0"/>
+        <w:spacing w:before="0" w:after="0"/>
+        <w:ind w:hanging="283" w:left="709" w:right="0"/>
+        <w:rPr>
+          <w:rFonts w:ascii="Arial" w:hAnsi="Arial"/>
+          <w:sz w:val="24"/>
+          <w:szCs w:val="24"/>
+        </w:rPr>
+      </w:pPr>
+      <w:r>
+        <w:rPr>
+          <w:rFonts w:ascii="Arial" w:hAnsi="Arial"/>
+          <w:sz w:val="24"/>
+          <w:szCs w:val="24"/>
+        </w:rPr>
+        <w:t xml:space="preserve">El usuario selecciona un idioma en la grilla; el sistema autocompleta el nombre y el estado de "Por defecto". </w:t>
+      </w:r>
+    </w:p>
+    <w:p>
+      <w:pPr>
+        <w:pStyle w:val="BodyText"/>
+        <w:numPr>
+          <w:ilvl w:val="0"/>
+          <w:numId w:val="78"/>
+        </w:numPr>
+        <w:tabs>
+          <w:tab w:val="clear" w:pos="708"/>
+          <w:tab w:val="left" w:pos="0" w:leader="none"/>
+        </w:tabs>
+        <w:bidi w:val="0"/>
+        <w:spacing w:before="0" w:after="0"/>
+        <w:ind w:hanging="283" w:left="709"/>
+        <w:rPr>
+          <w:rFonts w:ascii="Arial" w:hAnsi="Arial"/>
+          <w:sz w:val="24"/>
+          <w:szCs w:val="24"/>
+        </w:rPr>
+      </w:pPr>
+      <w:r>
+        <w:rPr>
+          <w:rFonts w:ascii="Arial" w:hAnsi="Arial"/>
+          <w:sz w:val="24"/>
+          <w:szCs w:val="24"/>
+        </w:rPr>
+        <w:t xml:space="preserve">El usuario edita el nombre o cambia la casilla "Por defecto" y presiona Actualizar. </w:t>
+      </w:r>
+    </w:p>
+    <w:p>
+      <w:pPr>
+        <w:pStyle w:val="BodyText"/>
+        <w:numPr>
+          <w:ilvl w:val="0"/>
+          <w:numId w:val="78"/>
+        </w:numPr>
+        <w:tabs>
+          <w:tab w:val="clear" w:pos="708"/>
+          <w:tab w:val="left" w:pos="0" w:leader="none"/>
+        </w:tabs>
+        <w:bidi w:val="0"/>
+        <w:spacing w:before="0" w:after="0"/>
+        <w:ind w:hanging="283" w:left="709"/>
+        <w:rPr>
+          <w:rFonts w:ascii="Arial" w:hAnsi="Arial"/>
+          <w:sz w:val="24"/>
+          <w:szCs w:val="24"/>
+        </w:rPr>
+      </w:pPr>
+      <w:r>
+        <w:rPr>
+          <w:rFonts w:ascii="Arial" w:hAnsi="Arial"/>
+          <w:sz w:val="24"/>
+          <w:szCs w:val="24"/>
+        </w:rPr>
+        <w:t xml:space="preserve">El sistema valida los datos y persiste el cambio. Si el idioma se marcó como predeterminado, quita esa condición del resto en la misma transacción. </w:t>
+      </w:r>
+    </w:p>
+    <w:p>
+      <w:pPr>
+        <w:pStyle w:val="BodyText"/>
+        <w:numPr>
+          <w:ilvl w:val="0"/>
+          <w:numId w:val="78"/>
+        </w:numPr>
+        <w:tabs>
+          <w:tab w:val="clear" w:pos="708"/>
+          <w:tab w:val="left" w:pos="0" w:leader="none"/>
+        </w:tabs>
+        <w:bidi w:val="0"/>
+        <w:ind w:hanging="283" w:left="709"/>
+        <w:rPr>
+          <w:rFonts w:ascii="Arial" w:hAnsi="Arial"/>
+          <w:sz w:val="24"/>
+          <w:szCs w:val="24"/>
+        </w:rPr>
+      </w:pPr>
+      <w:r>
+        <w:rPr>
+          <w:rFonts w:ascii="Arial" w:hAnsi="Arial"/>
+          <w:sz w:val="24"/>
+          <w:szCs w:val="24"/>
+        </w:rPr>
+        <w:t xml:space="preserve">El sistema registra la operación en la bitácora, recarga la lista de idiomas y refresca la grilla. </w:t>
+      </w:r>
+    </w:p>
+    <w:p>
+      <w:pPr>
+        <w:pStyle w:val="BodyText"/>
+        <w:bidi w:val="0"/>
+        <w:ind w:hanging="0" w:left="0" w:right="0"/>
+        <w:rPr>
+          <w:rFonts w:ascii="Arial" w:hAnsi="Arial"/>
+          <w:sz w:val="24"/>
+          <w:szCs w:val="24"/>
+        </w:rPr>
+      </w:pPr>
+      <w:r>
+        <w:rPr>
+          <w:rFonts w:ascii="Arial" w:hAnsi="Arial"/>
+          <w:sz w:val="24"/>
+          <w:szCs w:val="24"/>
+        </w:rPr>
+        <w:t>Flujos alternativos:</w:t>
+      </w:r>
+    </w:p>
+    <w:p>
+      <w:pPr>
+        <w:pStyle w:val="BodyText"/>
+        <w:bidi w:val="0"/>
+        <w:ind w:hanging="0" w:left="0" w:right="0"/>
+        <w:rPr>
+          <w:rFonts w:ascii="Arial" w:hAnsi="Arial"/>
+          <w:sz w:val="24"/>
+          <w:szCs w:val="24"/>
+        </w:rPr>
+      </w:pPr>
+      <w:r>
+        <w:rPr>
+          <w:rFonts w:ascii="Arial" w:hAnsi="Arial"/>
+          <w:sz w:val="24"/>
+          <w:szCs w:val="24"/>
+        </w:rPr>
+        <w:t>2.1 Sin idioma seleccionado o nombre vacío: se muestra el aviso correspondiente y no se realiza la actualización.</w:t>
+      </w:r>
+    </w:p>
+    <w:p>
+      <w:pPr>
+        <w:pStyle w:val="BodyText"/>
+        <w:bidi w:val="0"/>
+        <w:ind w:hanging="0" w:left="0" w:right="0"/>
+        <w:rPr/>
+      </w:pPr>
+      <w:r>
+        <w:rPr>
+          <w:rFonts w:ascii="Arial" w:hAnsi="Arial"/>
+          <w:sz w:val="24"/>
+          <w:szCs w:val="24"/>
+        </w:rPr>
+        <w:t>3.1 Nombre en uso por otro idioma: se muestra el aviso "El idioma ya existe" y la operación se cancela.</w:t>
+      </w:r>
+    </w:p>
+    <w:p>
+      <w:pPr>
+        <w:pStyle w:val="BodyText"/>
+        <w:bidi w:val="0"/>
+        <w:ind w:hanging="0" w:left="0" w:right="0"/>
+        <w:rPr>
+          <w:rFonts w:ascii="Arial" w:hAnsi="Arial" w:eastAsia="Arial"/>
+          <w:sz w:val="24"/>
+          <w:szCs w:val="24"/>
+        </w:rPr>
+      </w:pPr>
+      <w:r>
+        <w:rPr/>
+      </w:r>
+    </w:p>
+    <w:p>
+      <w:pPr>
+        <w:pStyle w:val="BodyText"/>
+        <w:bidi w:val="0"/>
+        <w:ind w:hanging="0" w:left="0" w:right="0"/>
+        <w:rPr>
+          <w:rFonts w:ascii="Arial" w:hAnsi="Arial" w:eastAsia="Arial"/>
+          <w:sz w:val="24"/>
+          <w:szCs w:val="24"/>
+        </w:rPr>
+      </w:pPr>
+      <w:r>
+        <w:rPr/>
+        <w:drawing>
+          <wp:anchor behindDoc="0" distT="0" distB="0" distL="0" distR="0" simplePos="0" locked="0" layoutInCell="0" allowOverlap="1" relativeHeight="142">
+            <wp:simplePos x="0" y="0"/>
+            <wp:positionH relativeFrom="column">
+              <wp:align>center</wp:align>
+            </wp:positionH>
+            <wp:positionV relativeFrom="paragraph">
+              <wp:posOffset>635</wp:posOffset>
+            </wp:positionV>
+            <wp:extent cx="5760085" cy="5982335"/>
+            <wp:effectExtent l="0" t="0" r="0" b="0"/>
+            <wp:wrapSquare wrapText="largest"/>
+            <wp:docPr id="42" name="Imagen46" descr=""/>
+            <wp:cNvGraphicFramePr>
+              <a:graphicFrameLocks xmlns:a="http://schemas.openxmlformats.org/drawingml/2006/main" noChangeAspect="1"/>
+            </wp:cNvGraphicFramePr>
+            <a:graphic xmlns:a="http://schemas.openxmlformats.org/drawingml/2006/main">
+              <a:graphicData uri="http://schemas.openxmlformats.org/drawingml/2006/picture">
+                <pic:pic xmlns:pic="http://schemas.openxmlformats.org/drawingml/2006/picture">
+                  <pic:nvPicPr>
+                    <pic:cNvPr id="42" name="Imagen46" descr=""/>
+                    <pic:cNvPicPr>
+                      <a:picLocks noChangeAspect="1" noChangeArrowheads="1"/>
+                    </pic:cNvPicPr>
+                  </pic:nvPicPr>
+                  <pic:blipFill>
+                    <a:blip r:embed="rId42"/>
+                    <a:stretch>
+                      <a:fillRect/>
+                    </a:stretch>
+                  </pic:blipFill>
+                  <pic:spPr bwMode="auto">
+                    <a:xfrm>
+                      <a:off x="0" y="0"/>
+                      <a:ext cx="5760085" cy="5982335"/>
+                    </a:xfrm>
+                    <a:prstGeom prst="rect">
+                      <a:avLst/>
+                    </a:prstGeom>
+                  </pic:spPr>
+                </pic:pic>
+              </a:graphicData>
+            </a:graphic>
+          </wp:anchor>
+        </w:drawing>
+      </w:r>
+    </w:p>
+    <w:p>
+      <w:pPr>
         <w:pStyle w:val="Normal"/>
         <w:rPr>
           <w:rFonts w:eastAsia="Arial"/>
@@ -18273,8 +19332,6 @@
             <w:tcW w:w="2999" w:type="dxa"/>
             <w:cnfStyle w:val="001000000100" w:firstRow="0" w:lastRow="0" w:firstColumn="1" w:lastColumn="0" w:oddVBand="0" w:evenVBand="0" w:oddHBand="0" w:evenHBand="0" w:firstRowFirstColumn="1" w:firstRowLastColumn="0" w:lastRowFirstColumn="0" w:lastRowLastColumn="0"/>
             <w:tcBorders>
-              <w:top w:val="nil"/>
-              <w:left w:val="nil"/>
               <w:right w:val="nil"/>
             </w:tcBorders>
             <w:shd w:color="auto" w:fill="FFFFFF" w:themeFill="background1" w:val="clear"/>
@@ -18287,13 +19344,11 @@
               <w:spacing w:before="0" w:after="0"/>
               <w:jc w:val="right"/>
               <w:rPr>
-                <w:rFonts w:ascii="Aptos" w:hAnsi="Aptos" w:eastAsia="Aptos" w:cs=""/>
                 <w:b/>
                 <w:bCs/>
                 <w:i/>
                 <w:i/>
-                <w:iCs/>
-                <w:lang w:val="es-AR" w:eastAsia="en-US" w:bidi="ar-SA"/>
+                <w:color w:val="auto"/>
               </w:rPr>
             </w:pPr>
             <w:r>
@@ -18303,7 +19358,7 @@
                 <w:bCs/>
                 <w:i/>
                 <w:iCs/>
-                <w:color w:val="FFFFFF"/>
+                <w:color w:val="auto"/>
                 <w:lang w:val="es-AR" w:eastAsia="en-US" w:bidi="ar-SA"/>
               </w:rPr>
               <w:t>Clase / Componente</w:t>
@@ -18314,10 +19369,8 @@
           <w:tcPr>
             <w:tcW w:w="6071" w:type="dxa"/>
             <w:tcBorders>
-              <w:top w:val="nil"/>
               <w:left w:val="nil"/>
               <w:bottom w:val="nil"/>
-              <w:right w:val="nil"/>
             </w:tcBorders>
             <w:shd w:color="auto" w:fill="FFFFFF" w:themeFill="background1" w:val="clear"/>
           </w:tcPr>
@@ -18330,10 +19383,9 @@
               <w:jc w:val="left"/>
               <w:cnfStyle w:val="100000000000" w:firstRow="1" w:lastRow="0" w:firstColumn="0" w:lastColumn="0" w:oddVBand="0" w:evenVBand="0" w:oddHBand="0" w:evenHBand="0" w:firstRowFirstColumn="0" w:firstRowLastColumn="0" w:lastRowFirstColumn="0" w:lastRowLastColumn="0"/>
               <w:rPr>
-                <w:rFonts w:ascii="Aptos" w:hAnsi="Aptos" w:eastAsia="Aptos" w:cs=""/>
                 <w:b/>
                 <w:bCs/>
-                <w:lang w:val="es-AR" w:eastAsia="en-US" w:bidi="ar-SA"/>
+                <w:color w:val="auto"/>
               </w:rPr>
             </w:pPr>
             <w:r>
@@ -18341,7 +19393,7 @@
                 <w:rFonts w:eastAsia="Arial" w:cs="Arial" w:ascii="Arial" w:hAnsi="Arial"/>
                 <w:b/>
                 <w:bCs/>
-                <w:color w:val="FFFFFF"/>
+                <w:color w:val="auto"/>
                 <w:lang w:val="es-AR" w:eastAsia="en-US" w:bidi="ar-SA"/>
               </w:rPr>
               <w:t>Responsabilidad</w:t>
@@ -18359,7 +19411,6 @@
             <w:cnfStyle w:val="001000000000" w:firstRow="0" w:lastRow="0" w:firstColumn="1" w:lastColumn="0" w:oddVBand="0" w:evenVBand="0" w:oddHBand="0" w:evenHBand="0" w:firstRowFirstColumn="0" w:firstRowLastColumn="0" w:lastRowFirstColumn="0" w:lastRowLastColumn="0"/>
             <w:tcBorders>
               <w:top w:val="nil"/>
-              <w:left w:val="nil"/>
               <w:bottom w:val="nil"/>
               <w:right w:val="nil"/>
             </w:tcBorders>
@@ -18431,7 +19482,6 @@
             <w:cnfStyle w:val="001000000000" w:firstRow="0" w:lastRow="0" w:firstColumn="1" w:lastColumn="0" w:oddVBand="0" w:evenVBand="0" w:oddHBand="0" w:evenHBand="0" w:firstRowFirstColumn="0" w:firstRowLastColumn="0" w:lastRowFirstColumn="0" w:lastRowLastColumn="0"/>
             <w:tcBorders>
               <w:top w:val="nil"/>
-              <w:left w:val="nil"/>
               <w:bottom w:val="nil"/>
               <w:right w:val="nil"/>
             </w:tcBorders>
@@ -18504,7 +19554,6 @@
             <w:cnfStyle w:val="001000000000" w:firstRow="0" w:lastRow="0" w:firstColumn="1" w:lastColumn="0" w:oddVBand="0" w:evenVBand="0" w:oddHBand="0" w:evenHBand="0" w:firstRowFirstColumn="0" w:firstRowLastColumn="0" w:lastRowFirstColumn="0" w:lastRowLastColumn="0"/>
             <w:tcBorders>
               <w:top w:val="nil"/>
-              <w:left w:val="nil"/>
               <w:bottom w:val="nil"/>
               <w:right w:val="nil"/>
             </w:tcBorders>
@@ -18576,7 +19625,6 @@
             <w:cnfStyle w:val="001000000000" w:firstRow="0" w:lastRow="0" w:firstColumn="1" w:lastColumn="0" w:oddVBand="0" w:evenVBand="0" w:oddHBand="0" w:evenHBand="0" w:firstRowFirstColumn="0" w:firstRowLastColumn="0" w:lastRowFirstColumn="0" w:lastRowLastColumn="0"/>
             <w:tcBorders>
               <w:top w:val="nil"/>
-              <w:left w:val="nil"/>
               <w:bottom w:val="nil"/>
               <w:right w:val="nil"/>
             </w:tcBorders>
@@ -18649,8 +19697,6 @@
             <w:cnfStyle w:val="001000000000" w:firstRow="0" w:lastRow="0" w:firstColumn="1" w:lastColumn="0" w:oddVBand="0" w:evenVBand="0" w:oddHBand="0" w:evenHBand="0" w:firstRowFirstColumn="0" w:firstRowLastColumn="0" w:lastRowFirstColumn="0" w:lastRowLastColumn="0"/>
             <w:tcBorders>
               <w:top w:val="nil"/>
-              <w:left w:val="nil"/>
-              <w:bottom w:val="nil"/>
               <w:right w:val="nil"/>
             </w:tcBorders>
             <w:shd w:color="auto" w:fill="FFFFFF" w:themeFill="background1" w:val="clear"/>
@@ -18698,17 +19744,35 @@
               <w:spacing w:before="0" w:after="0"/>
               <w:jc w:val="left"/>
               <w:cnfStyle w:val="000000100000" w:firstRow="0" w:lastRow="0" w:firstColumn="0" w:lastColumn="0" w:oddVBand="0" w:evenVBand="0" w:oddHBand="1" w:evenHBand="0" w:firstRowFirstColumn="0" w:firstRowLastColumn="0" w:lastRowFirstColumn="0" w:lastRowLastColumn="0"/>
-              <w:rPr>
-                <w:rFonts w:ascii="Aptos" w:hAnsi="Aptos" w:eastAsia="Aptos" w:cs=""/>
-                <w:lang w:val="es-AR" w:eastAsia="en-US" w:bidi="ar-SA"/>
-              </w:rPr>
+              <w:rPr/>
             </w:pPr>
             <w:r>
               <w:rPr>
                 <w:rFonts w:eastAsia="Arial" w:cs="Arial" w:ascii="Arial" w:hAnsi="Arial"/>
-                <w:lang w:val="es-AR" w:eastAsia="en-US" w:bidi="ar-SA"/>
-              </w:rPr>
-              <w:t>Persistencia de idiomas, claves y traducciones; mantiene la matriz consistente.</w:t>
+                <w:b w:val="false"/>
+                <w:bCs w:val="false"/>
+                <w:lang w:val="es-AR" w:eastAsia="en-US" w:bidi="ar-SA"/>
+              </w:rPr>
+              <w:t xml:space="preserve">Persistencia de idiomas, claves y traducciones; mantiene la matriz consistente. Incluye </w:t>
+            </w:r>
+            <w:r>
+              <w:rPr>
+                <w:rStyle w:val="Strong"/>
+                <w:rFonts w:eastAsia="Arial" w:cs="Arial" w:ascii="Arial" w:hAnsi="Arial"/>
+                <w:b w:val="false"/>
+                <w:bCs w:val="false"/>
+                <w:lang w:val="es-AR" w:eastAsia="en-US" w:bidi="ar-SA"/>
+              </w:rPr>
+              <w:t>UpdateIdioma</w:t>
+            </w:r>
+            <w:r>
+              <w:rPr>
+                <w:rFonts w:eastAsia="Arial" w:cs="Arial" w:ascii="Arial" w:hAnsi="Arial"/>
+                <w:b w:val="false"/>
+                <w:bCs w:val="false"/>
+                <w:lang w:val="es-AR" w:eastAsia="en-US" w:bidi="ar-SA"/>
+              </w:rPr>
+              <w:t xml:space="preserve">, que garantiza un único idioma por defecto por transacción. </w:t>
             </w:r>
           </w:p>
         </w:tc>
@@ -19086,7 +20150,7 @@
       <w:r>
         <w:rPr/>
         <w:drawing>
-          <wp:anchor behindDoc="0" distT="0" distB="0" distL="0" distR="0" simplePos="0" locked="0" layoutInCell="0" allowOverlap="1" relativeHeight="46">
+          <wp:anchor behindDoc="0" distT="0" distB="0" distL="0" distR="0" simplePos="0" locked="0" layoutInCell="0" allowOverlap="1" relativeHeight="45">
             <wp:simplePos x="0" y="0"/>
             <wp:positionH relativeFrom="column">
               <wp:align>center</wp:align>
@@ -19097,7 +20161,7 @@
             <wp:extent cx="5203190" cy="4590415"/>
             <wp:effectExtent l="0" t="0" r="0" b="0"/>
             <wp:wrapSquare wrapText="largest"/>
-            <wp:docPr id="42" name="Imagen39" descr=""/>
+            <wp:docPr id="43" name="Imagen39" descr=""/>
             <wp:cNvGraphicFramePr>
               <a:graphicFrameLocks xmlns:a="http://schemas.openxmlformats.org/drawingml/2006/main" noChangeAspect="1"/>
             </wp:cNvGraphicFramePr>
@@ -19105,13 +20169,13 @@
               <a:graphicData uri="http://schemas.openxmlformats.org/drawingml/2006/picture">
                 <pic:pic xmlns:pic="http://schemas.openxmlformats.org/drawingml/2006/picture">
                   <pic:nvPicPr>
-                    <pic:cNvPr id="42" name="Imagen39" descr=""/>
+                    <pic:cNvPr id="43" name="Imagen39" descr=""/>
                     <pic:cNvPicPr>
                       <a:picLocks noChangeAspect="1" noChangeArrowheads="1"/>
                     </pic:cNvPicPr>
                   </pic:nvPicPr>
                   <pic:blipFill>
-                    <a:blip r:embed="rId42"/>
+                    <a:blip r:embed="rId43"/>
                     <a:stretch>
                       <a:fillRect/>
                     </a:stretch>
@@ -19168,7 +20232,7 @@
       <w:r>
         <w:rPr/>
         <w:drawing>
-          <wp:anchor behindDoc="0" distT="0" distB="0" distL="0" distR="0" simplePos="0" locked="0" layoutInCell="0" allowOverlap="1" relativeHeight="35">
+          <wp:anchor behindDoc="0" distT="0" distB="0" distL="0" distR="0" simplePos="0" locked="0" layoutInCell="0" allowOverlap="1" relativeHeight="34">
             <wp:simplePos x="0" y="0"/>
             <wp:positionH relativeFrom="column">
               <wp:align>center</wp:align>
@@ -19179,7 +20243,7 @@
             <wp:extent cx="4742815" cy="5892165"/>
             <wp:effectExtent l="0" t="0" r="0" b="0"/>
             <wp:wrapSquare wrapText="largest"/>
-            <wp:docPr id="43" name="Imagen30" descr=""/>
+            <wp:docPr id="44" name="Imagen30" descr=""/>
             <wp:cNvGraphicFramePr>
               <a:graphicFrameLocks xmlns:a="http://schemas.openxmlformats.org/drawingml/2006/main" noChangeAspect="1"/>
             </wp:cNvGraphicFramePr>
@@ -19187,13 +20251,13 @@
               <a:graphicData uri="http://schemas.openxmlformats.org/drawingml/2006/picture">
                 <pic:pic xmlns:pic="http://schemas.openxmlformats.org/drawingml/2006/picture">
                   <pic:nvPicPr>
-                    <pic:cNvPr id="43" name="Imagen30" descr=""/>
+                    <pic:cNvPr id="44" name="Imagen30" descr=""/>
                     <pic:cNvPicPr>
                       <a:picLocks noChangeAspect="1" noChangeArrowheads="1"/>
                     </pic:cNvPicPr>
                   </pic:nvPicPr>
                   <pic:blipFill>
-                    <a:blip r:embed="rId43"/>
+                    <a:blip r:embed="rId44"/>
                     <a:stretch>
                       <a:fillRect/>
                     </a:stretch>
@@ -19780,7 +20844,7 @@
         <w:pStyle w:val="ListParagraph"/>
         <w:numPr>
           <w:ilvl w:val="0"/>
-          <w:numId w:val="137"/>
+          <w:numId w:val="138"/>
         </w:numPr>
         <w:spacing w:lineRule="auto" w:line="240" w:before="0" w:after="60"/>
         <w:contextualSpacing w:val="false"/>
@@ -19794,27 +20858,6 @@
           <w:szCs w:val="24"/>
         </w:rPr>
         <w:t>El usuario ingresa los filtros deseados: rango de fechas, usuario, actividad y tipo de evento.</w:t>
-      </w:r>
-    </w:p>
-    <w:p>
-      <w:pPr>
-        <w:pStyle w:val="ListParagraph"/>
-        <w:numPr>
-          <w:ilvl w:val="0"/>
-          <w:numId w:val="138"/>
-        </w:numPr>
-        <w:spacing w:lineRule="auto" w:line="240" w:before="0" w:after="60"/>
-        <w:contextualSpacing w:val="false"/>
-        <w:jc w:val="both"/>
-        <w:rPr/>
-      </w:pPr>
-      <w:r>
-        <w:rPr>
-          <w:rFonts w:eastAsia="Arial" w:cs="Arial" w:ascii="Arial" w:hAnsi="Arial"/>
-          <w:sz w:val="24"/>
-          <w:szCs w:val="24"/>
-        </w:rPr>
-        <w:t>El sistema arma la consulta combinando solo los filtros completados y la ejecuta.</w:t>
       </w:r>
     </w:p>
     <w:p>
@@ -19835,22 +20878,7 @@
           <w:sz w:val="24"/>
           <w:szCs w:val="24"/>
         </w:rPr>
-        <w:t>Se muestran los resultados ordenados por fecha, con los eventos de error resaltados.</w:t>
-      </w:r>
-    </w:p>
-    <w:p>
-      <w:pPr>
-        <w:pStyle w:val="Normal"/>
-        <w:spacing w:before="120" w:after="160"/>
-        <w:rPr/>
-      </w:pPr>
-      <w:r>
-        <w:rPr>
-          <w:rFonts w:eastAsia="Arial" w:cs="Arial" w:ascii="Arial" w:hAnsi="Arial"/>
-          <w:sz w:val="24"/>
-          <w:szCs w:val="24"/>
-        </w:rPr>
-        <w:t>Flujos alternativos:</w:t>
+        <w:t>El sistema arma la consulta combinando solo los filtros completados y la ejecuta.</w:t>
       </w:r>
     </w:p>
     <w:p>
@@ -19871,6 +20899,42 @@
           <w:sz w:val="24"/>
           <w:szCs w:val="24"/>
         </w:rPr>
+        <w:t>Se muestran los resultados ordenados por fecha, con los eventos de error resaltados.</w:t>
+      </w:r>
+    </w:p>
+    <w:p>
+      <w:pPr>
+        <w:pStyle w:val="Normal"/>
+        <w:spacing w:before="120" w:after="160"/>
+        <w:rPr/>
+      </w:pPr>
+      <w:r>
+        <w:rPr>
+          <w:rFonts w:eastAsia="Arial" w:cs="Arial" w:ascii="Arial" w:hAnsi="Arial"/>
+          <w:sz w:val="24"/>
+          <w:szCs w:val="24"/>
+        </w:rPr>
+        <w:t>Flujos alternativos:</w:t>
+      </w:r>
+    </w:p>
+    <w:p>
+      <w:pPr>
+        <w:pStyle w:val="ListParagraph"/>
+        <w:numPr>
+          <w:ilvl w:val="0"/>
+          <w:numId w:val="141"/>
+        </w:numPr>
+        <w:spacing w:lineRule="auto" w:line="240" w:before="0" w:after="60"/>
+        <w:contextualSpacing w:val="false"/>
+        <w:jc w:val="both"/>
+        <w:rPr/>
+      </w:pPr>
+      <w:r>
+        <w:rPr>
+          <w:rFonts w:eastAsia="Arial" w:cs="Arial" w:ascii="Arial" w:hAnsi="Arial"/>
+          <w:sz w:val="24"/>
+          <w:szCs w:val="24"/>
+        </w:rPr>
         <w:t>Filtro 'Todos': cuando un filtro queda en 'Todos', no se aplica esa condición.</w:t>
       </w:r>
     </w:p>
@@ -19898,7 +20962,7 @@
           <wp:inline distT="0" distB="0" distL="0" distR="0">
             <wp:extent cx="5996940" cy="3352800"/>
             <wp:effectExtent l="0" t="0" r="0" b="0"/>
-            <wp:docPr id="44" name="Imagen32" descr=""/>
+            <wp:docPr id="45" name="Imagen32" descr=""/>
             <wp:cNvGraphicFramePr>
               <a:graphicFrameLocks xmlns:a="http://schemas.openxmlformats.org/drawingml/2006/main" noChangeAspect="1"/>
             </wp:cNvGraphicFramePr>
@@ -19906,13 +20970,13 @@
               <a:graphicData uri="http://schemas.openxmlformats.org/drawingml/2006/picture">
                 <pic:pic xmlns:pic="http://schemas.openxmlformats.org/drawingml/2006/picture">
                   <pic:nvPicPr>
-                    <pic:cNvPr id="44" name="Imagen32" descr=""/>
+                    <pic:cNvPr id="45" name="Imagen32" descr=""/>
                     <pic:cNvPicPr>
                       <a:picLocks noChangeAspect="1" noChangeArrowheads="1"/>
                     </pic:cNvPicPr>
                   </pic:nvPicPr>
                   <pic:blipFill>
-                    <a:blip r:embed="rId44"/>
+                    <a:blip r:embed="rId45"/>
                     <a:stretch>
                       <a:fillRect/>
                     </a:stretch>
@@ -19954,7 +21018,7 @@
       <w:r>
         <w:rPr/>
         <w:drawing>
-          <wp:anchor behindDoc="0" distT="0" distB="0" distL="0" distR="0" simplePos="0" locked="0" layoutInCell="0" allowOverlap="1" relativeHeight="59">
+          <wp:anchor behindDoc="0" distT="0" distB="0" distL="0" distR="0" simplePos="0" locked="0" layoutInCell="0" allowOverlap="1" relativeHeight="56">
             <wp:simplePos x="0" y="0"/>
             <wp:positionH relativeFrom="column">
               <wp:align>center</wp:align>
@@ -19965,7 +21029,7 @@
             <wp:extent cx="5760085" cy="5742305"/>
             <wp:effectExtent l="0" t="0" r="0" b="0"/>
             <wp:wrapSquare wrapText="largest"/>
-            <wp:docPr id="45" name="Imagen53" descr=""/>
+            <wp:docPr id="46" name="Imagen53" descr=""/>
             <wp:cNvGraphicFramePr>
               <a:graphicFrameLocks xmlns:a="http://schemas.openxmlformats.org/drawingml/2006/main" noChangeAspect="1"/>
             </wp:cNvGraphicFramePr>
@@ -19973,13 +21037,13 @@
               <a:graphicData uri="http://schemas.openxmlformats.org/drawingml/2006/picture">
                 <pic:pic xmlns:pic="http://schemas.openxmlformats.org/drawingml/2006/picture">
                   <pic:nvPicPr>
-                    <pic:cNvPr id="45" name="Imagen53" descr=""/>
+                    <pic:cNvPr id="46" name="Imagen53" descr=""/>
                     <pic:cNvPicPr>
                       <a:picLocks noChangeAspect="1" noChangeArrowheads="1"/>
                     </pic:cNvPicPr>
                   </pic:nvPicPr>
                   <pic:blipFill>
-                    <a:blip r:embed="rId45"/>
+                    <a:blip r:embed="rId46"/>
                     <a:stretch>
                       <a:fillRect/>
                     </a:stretch>
@@ -20420,7 +21484,7 @@
         <w:pStyle w:val="ListParagraph"/>
         <w:numPr>
           <w:ilvl w:val="0"/>
-          <w:numId w:val="141"/>
+          <w:numId w:val="142"/>
         </w:numPr>
         <w:spacing w:lineRule="auto" w:line="240" w:before="0" w:after="60"/>
         <w:contextualSpacing w:val="false"/>
@@ -20434,27 +21498,6 @@
           <w:szCs w:val="24"/>
         </w:rPr>
         <w:t>El usuario abre la pestaña de Auditoría de Usuarios o de Auditoría de Idiomas.</w:t>
-      </w:r>
-    </w:p>
-    <w:p>
-      <w:pPr>
-        <w:pStyle w:val="ListParagraph"/>
-        <w:numPr>
-          <w:ilvl w:val="0"/>
-          <w:numId w:val="142"/>
-        </w:numPr>
-        <w:spacing w:lineRule="auto" w:line="240" w:before="0" w:after="60"/>
-        <w:contextualSpacing w:val="false"/>
-        <w:jc w:val="both"/>
-        <w:rPr/>
-      </w:pPr>
-      <w:r>
-        <w:rPr>
-          <w:rFonts w:eastAsia="Arial" w:cs="Arial" w:ascii="Arial" w:hAnsi="Arial"/>
-          <w:sz w:val="24"/>
-          <w:szCs w:val="24"/>
-        </w:rPr>
-        <w:t>El sistema consulta la tabla de auditoría correspondiente.</w:t>
       </w:r>
     </w:p>
     <w:p>
@@ -20475,6 +21518,27 @@
           <w:sz w:val="24"/>
           <w:szCs w:val="24"/>
         </w:rPr>
+        <w:t>El sistema consulta la tabla de auditoría correspondiente.</w:t>
+      </w:r>
+    </w:p>
+    <w:p>
+      <w:pPr>
+        <w:pStyle w:val="ListParagraph"/>
+        <w:numPr>
+          <w:ilvl w:val="0"/>
+          <w:numId w:val="144"/>
+        </w:numPr>
+        <w:spacing w:lineRule="auto" w:line="240" w:before="0" w:after="60"/>
+        <w:contextualSpacing w:val="false"/>
+        <w:jc w:val="both"/>
+        <w:rPr/>
+      </w:pPr>
+      <w:r>
+        <w:rPr>
+          <w:rFonts w:eastAsia="Arial" w:cs="Arial" w:ascii="Arial" w:hAnsi="Arial"/>
+          <w:sz w:val="24"/>
+          <w:szCs w:val="24"/>
+        </w:rPr>
         <w:t>Se muestra el historial indicando quién hizo el cambio, cuándo y qué, con los valores anterior y nuevo.</w:t>
       </w:r>
     </w:p>
@@ -20490,7 +21554,7 @@
           <wp:inline distT="0" distB="0" distL="0" distR="0">
             <wp:extent cx="5527040" cy="5156200"/>
             <wp:effectExtent l="0" t="0" r="0" b="0"/>
-            <wp:docPr id="46" name="Imagen33" descr=""/>
+            <wp:docPr id="47" name="Imagen33" descr=""/>
             <wp:cNvGraphicFramePr>
               <a:graphicFrameLocks xmlns:a="http://schemas.openxmlformats.org/drawingml/2006/main" noChangeAspect="1"/>
             </wp:cNvGraphicFramePr>
@@ -20498,13 +21562,13 @@
               <a:graphicData uri="http://schemas.openxmlformats.org/drawingml/2006/picture">
                 <pic:pic xmlns:pic="http://schemas.openxmlformats.org/drawingml/2006/picture">
                   <pic:nvPicPr>
-                    <pic:cNvPr id="46" name="Imagen33" descr=""/>
+                    <pic:cNvPr id="47" name="Imagen33" descr=""/>
                     <pic:cNvPicPr>
                       <a:picLocks noChangeAspect="1" noChangeArrowheads="1"/>
                     </pic:cNvPicPr>
                   </pic:nvPicPr>
                   <pic:blipFill>
-                    <a:blip r:embed="rId46"/>
+                    <a:blip r:embed="rId47"/>
                     <a:stretch>
                       <a:fillRect/>
                     </a:stretch>
@@ -20544,7 +21608,7 @@
       <w:r>
         <w:rPr/>
         <w:drawing>
-          <wp:anchor behindDoc="0" distT="0" distB="0" distL="0" distR="0" simplePos="0" locked="0" layoutInCell="0" allowOverlap="1" relativeHeight="60">
+          <wp:anchor behindDoc="0" distT="0" distB="0" distL="0" distR="0" simplePos="0" locked="0" layoutInCell="0" allowOverlap="1" relativeHeight="57">
             <wp:simplePos x="0" y="0"/>
             <wp:positionH relativeFrom="column">
               <wp:align>center</wp:align>
@@ -20555,7 +21619,7 @@
             <wp:extent cx="5760085" cy="6224905"/>
             <wp:effectExtent l="0" t="0" r="0" b="0"/>
             <wp:wrapSquare wrapText="largest"/>
-            <wp:docPr id="47" name="Imagen54" descr=""/>
+            <wp:docPr id="48" name="Imagen54" descr=""/>
             <wp:cNvGraphicFramePr>
               <a:graphicFrameLocks xmlns:a="http://schemas.openxmlformats.org/drawingml/2006/main" noChangeAspect="1"/>
             </wp:cNvGraphicFramePr>
@@ -20563,13 +21627,13 @@
               <a:graphicData uri="http://schemas.openxmlformats.org/drawingml/2006/picture">
                 <pic:pic xmlns:pic="http://schemas.openxmlformats.org/drawingml/2006/picture">
                   <pic:nvPicPr>
-                    <pic:cNvPr id="47" name="Imagen54" descr=""/>
+                    <pic:cNvPr id="48" name="Imagen54" descr=""/>
                     <pic:cNvPicPr>
                       <a:picLocks noChangeAspect="1" noChangeArrowheads="1"/>
                     </pic:cNvPicPr>
                   </pic:nvPicPr>
                   <pic:blipFill>
-                    <a:blip r:embed="rId47"/>
+                    <a:blip r:embed="rId48"/>
                     <a:stretch>
                       <a:fillRect/>
                     </a:stretch>
@@ -21437,7 +22501,7 @@
       <w:r>
         <w:rPr/>
         <w:drawing>
-          <wp:anchor behindDoc="0" distT="0" distB="0" distL="0" distR="0" simplePos="0" locked="0" layoutInCell="0" allowOverlap="1" relativeHeight="47">
+          <wp:anchor behindDoc="0" distT="0" distB="0" distL="0" distR="0" simplePos="0" locked="0" layoutInCell="0" allowOverlap="1" relativeHeight="46">
             <wp:simplePos x="0" y="0"/>
             <wp:positionH relativeFrom="column">
               <wp:align>center</wp:align>
@@ -21448,7 +22512,7 @@
             <wp:extent cx="6445885" cy="4083685"/>
             <wp:effectExtent l="0" t="0" r="0" b="0"/>
             <wp:wrapSquare wrapText="largest"/>
-            <wp:docPr id="48" name="Imagen45" descr=""/>
+            <wp:docPr id="49" name="Imagen45" descr=""/>
             <wp:cNvGraphicFramePr>
               <a:graphicFrameLocks xmlns:a="http://schemas.openxmlformats.org/drawingml/2006/main" noChangeAspect="1"/>
             </wp:cNvGraphicFramePr>
@@ -21456,13 +22520,13 @@
               <a:graphicData uri="http://schemas.openxmlformats.org/drawingml/2006/picture">
                 <pic:pic xmlns:pic="http://schemas.openxmlformats.org/drawingml/2006/picture">
                   <pic:nvPicPr>
-                    <pic:cNvPr id="48" name="Imagen45" descr=""/>
+                    <pic:cNvPr id="49" name="Imagen45" descr=""/>
                     <pic:cNvPicPr>
                       <a:picLocks noChangeAspect="1" noChangeArrowheads="1"/>
                     </pic:cNvPicPr>
                   </pic:nvPicPr>
                   <pic:blipFill>
-                    <a:blip r:embed="rId48"/>
+                    <a:blip r:embed="rId49"/>
                     <a:stretch>
                       <a:fillRect/>
                     </a:stretch>
@@ -23236,7 +24300,7 @@
       <w:r>
         <w:rPr/>
         <w:drawing>
-          <wp:anchor behindDoc="0" distT="0" distB="0" distL="0" distR="0" simplePos="0" locked="0" layoutInCell="0" allowOverlap="1" relativeHeight="36">
+          <wp:anchor behindDoc="0" distT="0" distB="0" distL="0" distR="0" simplePos="0" locked="0" layoutInCell="0" allowOverlap="1" relativeHeight="35">
             <wp:simplePos x="0" y="0"/>
             <wp:positionH relativeFrom="column">
               <wp:align>center</wp:align>
@@ -23247,7 +24311,7 @@
             <wp:extent cx="5760085" cy="5647055"/>
             <wp:effectExtent l="0" t="0" r="0" b="0"/>
             <wp:wrapSquare wrapText="largest"/>
-            <wp:docPr id="49" name="Imagen17" descr=""/>
+            <wp:docPr id="50" name="Imagen17" descr=""/>
             <wp:cNvGraphicFramePr>
               <a:graphicFrameLocks xmlns:a="http://schemas.openxmlformats.org/drawingml/2006/main" noChangeAspect="1"/>
             </wp:cNvGraphicFramePr>
@@ -23255,13 +24319,13 @@
               <a:graphicData uri="http://schemas.openxmlformats.org/drawingml/2006/picture">
                 <pic:pic xmlns:pic="http://schemas.openxmlformats.org/drawingml/2006/picture">
                   <pic:nvPicPr>
-                    <pic:cNvPr id="49" name="Imagen17" descr=""/>
+                    <pic:cNvPr id="50" name="Imagen17" descr=""/>
                     <pic:cNvPicPr>
                       <a:picLocks noChangeAspect="1" noChangeArrowheads="1"/>
                     </pic:cNvPicPr>
                   </pic:nvPicPr>
                   <pic:blipFill>
-                    <a:blip r:embed="rId49"/>
+                    <a:blip r:embed="rId50"/>
                     <a:stretch>
                       <a:fillRect/>
                     </a:stretch>
@@ -24321,7 +25385,7 @@
       <w:r>
         <w:rPr/>
         <w:drawing>
-          <wp:anchor behindDoc="0" distT="0" distB="0" distL="0" distR="0" simplePos="0" locked="0" layoutInCell="0" allowOverlap="1" relativeHeight="37">
+          <wp:anchor behindDoc="0" distT="0" distB="0" distL="0" distR="0" simplePos="0" locked="0" layoutInCell="0" allowOverlap="1" relativeHeight="36">
             <wp:simplePos x="0" y="0"/>
             <wp:positionH relativeFrom="column">
               <wp:posOffset>80010</wp:posOffset>
@@ -24332,7 +25396,7 @@
             <wp:extent cx="5760085" cy="2895600"/>
             <wp:effectExtent l="0" t="0" r="0" b="0"/>
             <wp:wrapSquare wrapText="largest"/>
-            <wp:docPr id="50" name="Imagen31" descr=""/>
+            <wp:docPr id="51" name="Imagen31" descr=""/>
             <wp:cNvGraphicFramePr>
               <a:graphicFrameLocks xmlns:a="http://schemas.openxmlformats.org/drawingml/2006/main" noChangeAspect="1"/>
             </wp:cNvGraphicFramePr>
@@ -24340,13 +25404,13 @@
               <a:graphicData uri="http://schemas.openxmlformats.org/drawingml/2006/picture">
                 <pic:pic xmlns:pic="http://schemas.openxmlformats.org/drawingml/2006/picture">
                   <pic:nvPicPr>
-                    <pic:cNvPr id="50" name="Imagen31" descr=""/>
+                    <pic:cNvPr id="51" name="Imagen31" descr=""/>
                     <pic:cNvPicPr>
                       <a:picLocks noChangeAspect="1" noChangeArrowheads="1"/>
                     </pic:cNvPicPr>
                   </pic:nvPicPr>
                   <pic:blipFill>
-                    <a:blip r:embed="rId50"/>
+                    <a:blip r:embed="rId51"/>
                     <a:stretch>
                       <a:fillRect/>
                     </a:stretch>
@@ -24385,7 +25449,7 @@
       <w:r>
         <w:rPr/>
         <w:drawing>
-          <wp:anchor behindDoc="0" distT="0" distB="0" distL="0" distR="0" simplePos="0" locked="0" layoutInCell="0" allowOverlap="1" relativeHeight="38">
+          <wp:anchor behindDoc="0" distT="0" distB="0" distL="0" distR="0" simplePos="0" locked="0" layoutInCell="0" allowOverlap="1" relativeHeight="37">
             <wp:simplePos x="0" y="0"/>
             <wp:positionH relativeFrom="column">
               <wp:align>center</wp:align>
@@ -24396,7 +25460,7 @@
             <wp:extent cx="5760085" cy="3561080"/>
             <wp:effectExtent l="0" t="0" r="0" b="0"/>
             <wp:wrapSquare wrapText="largest"/>
-            <wp:docPr id="51" name="Imagen40" descr=""/>
+            <wp:docPr id="52" name="Imagen40" descr=""/>
             <wp:cNvGraphicFramePr>
               <a:graphicFrameLocks xmlns:a="http://schemas.openxmlformats.org/drawingml/2006/main" noChangeAspect="1"/>
             </wp:cNvGraphicFramePr>
@@ -24404,13 +25468,13 @@
               <a:graphicData uri="http://schemas.openxmlformats.org/drawingml/2006/picture">
                 <pic:pic xmlns:pic="http://schemas.openxmlformats.org/drawingml/2006/picture">
                   <pic:nvPicPr>
-                    <pic:cNvPr id="51" name="Imagen40" descr=""/>
+                    <pic:cNvPr id="52" name="Imagen40" descr=""/>
                     <pic:cNvPicPr>
                       <a:picLocks noChangeAspect="1" noChangeArrowheads="1"/>
                     </pic:cNvPicPr>
                   </pic:nvPicPr>
                   <pic:blipFill>
-                    <a:blip r:embed="rId51"/>
+                    <a:blip r:embed="rId52"/>
                     <a:stretch>
                       <a:fillRect/>
                     </a:stretch>
@@ -24546,7 +25610,7 @@
       <w:bookmarkEnd w:id="75"/>
       <w:r>
         <w:drawing>
-          <wp:anchor behindDoc="0" distT="0" distB="0" distL="0" distR="0" simplePos="0" locked="0" layoutInCell="0" allowOverlap="1" relativeHeight="39">
+          <wp:anchor behindDoc="0" distT="0" distB="0" distL="0" distR="0" simplePos="0" locked="0" layoutInCell="0" allowOverlap="1" relativeHeight="38">
             <wp:simplePos x="0" y="0"/>
             <wp:positionH relativeFrom="column">
               <wp:posOffset>0</wp:posOffset>
@@ -24557,7 +25621,7 @@
             <wp:extent cx="5760085" cy="5748655"/>
             <wp:effectExtent l="0" t="0" r="0" b="0"/>
             <wp:wrapSquare wrapText="largest"/>
-            <wp:docPr id="52" name="Imagen34" descr=""/>
+            <wp:docPr id="53" name="Imagen34" descr=""/>
             <wp:cNvGraphicFramePr>
               <a:graphicFrameLocks xmlns:a="http://schemas.openxmlformats.org/drawingml/2006/main" noChangeAspect="1"/>
             </wp:cNvGraphicFramePr>
@@ -24565,13 +25629,13 @@
               <a:graphicData uri="http://schemas.openxmlformats.org/drawingml/2006/picture">
                 <pic:pic xmlns:pic="http://schemas.openxmlformats.org/drawingml/2006/picture">
                   <pic:nvPicPr>
-                    <pic:cNvPr id="52" name="Imagen34" descr=""/>
+                    <pic:cNvPr id="53" name="Imagen34" descr=""/>
                     <pic:cNvPicPr>
                       <a:picLocks noChangeAspect="1" noChangeArrowheads="1"/>
                     </pic:cNvPicPr>
                   </pic:nvPicPr>
                   <pic:blipFill>
-                    <a:blip r:embed="rId52"/>
+                    <a:blip r:embed="rId53"/>
                     <a:stretch>
                       <a:fillRect/>
                     </a:stretch>
@@ -25308,7 +26372,7 @@
       <w:r>
         <w:rPr/>
         <w:drawing>
-          <wp:anchor behindDoc="0" distT="0" distB="0" distL="0" distR="0" simplePos="0" locked="0" layoutInCell="0" allowOverlap="1" relativeHeight="40">
+          <wp:anchor behindDoc="0" distT="0" distB="0" distL="0" distR="0" simplePos="0" locked="0" layoutInCell="0" allowOverlap="1" relativeHeight="39">
             <wp:simplePos x="0" y="0"/>
             <wp:positionH relativeFrom="column">
               <wp:align>center</wp:align>
@@ -25319,7 +26383,7 @@
             <wp:extent cx="5760085" cy="3825875"/>
             <wp:effectExtent l="0" t="0" r="0" b="0"/>
             <wp:wrapSquare wrapText="largest"/>
-            <wp:docPr id="53" name="Imagen41" descr=""/>
+            <wp:docPr id="54" name="Imagen41" descr=""/>
             <wp:cNvGraphicFramePr>
               <a:graphicFrameLocks xmlns:a="http://schemas.openxmlformats.org/drawingml/2006/main" noChangeAspect="1"/>
             </wp:cNvGraphicFramePr>
@@ -25327,13 +26391,13 @@
               <a:graphicData uri="http://schemas.openxmlformats.org/drawingml/2006/picture">
                 <pic:pic xmlns:pic="http://schemas.openxmlformats.org/drawingml/2006/picture">
                   <pic:nvPicPr>
-                    <pic:cNvPr id="53" name="Imagen41" descr=""/>
+                    <pic:cNvPr id="54" name="Imagen41" descr=""/>
                     <pic:cNvPicPr>
                       <a:picLocks noChangeAspect="1" noChangeArrowheads="1"/>
                     </pic:cNvPicPr>
                   </pic:nvPicPr>
                   <pic:blipFill>
-                    <a:blip r:embed="rId53"/>
+                    <a:blip r:embed="rId54"/>
                     <a:stretch>
                       <a:fillRect/>
                     </a:stretch>
@@ -26021,7 +27085,7 @@
       <w:r>
         <w:rPr/>
         <w:drawing>
-          <wp:anchor behindDoc="0" distT="0" distB="0" distL="0" distR="0" simplePos="0" locked="0" layoutInCell="0" allowOverlap="1" relativeHeight="41">
+          <wp:anchor behindDoc="0" distT="0" distB="0" distL="0" distR="0" simplePos="0" locked="0" layoutInCell="0" allowOverlap="1" relativeHeight="40">
             <wp:simplePos x="0" y="0"/>
             <wp:positionH relativeFrom="column">
               <wp:align>center</wp:align>
@@ -26032,7 +27096,7 @@
             <wp:extent cx="6973570" cy="4857750"/>
             <wp:effectExtent l="0" t="0" r="0" b="0"/>
             <wp:wrapSquare wrapText="largest"/>
-            <wp:docPr id="54" name="Imagen42" descr=""/>
+            <wp:docPr id="55" name="Imagen42" descr=""/>
             <wp:cNvGraphicFramePr>
               <a:graphicFrameLocks xmlns:a="http://schemas.openxmlformats.org/drawingml/2006/main" noChangeAspect="1"/>
             </wp:cNvGraphicFramePr>
@@ -26040,13 +27104,13 @@
               <a:graphicData uri="http://schemas.openxmlformats.org/drawingml/2006/picture">
                 <pic:pic xmlns:pic="http://schemas.openxmlformats.org/drawingml/2006/picture">
                   <pic:nvPicPr>
-                    <pic:cNvPr id="54" name="Imagen42" descr=""/>
+                    <pic:cNvPr id="55" name="Imagen42" descr=""/>
                     <pic:cNvPicPr>
                       <a:picLocks noChangeAspect="1" noChangeArrowheads="1"/>
                     </pic:cNvPicPr>
                   </pic:nvPicPr>
                   <pic:blipFill>
-                    <a:blip r:embed="rId54"/>
+                    <a:blip r:embed="rId55"/>
                     <a:stretch>
                       <a:fillRect/>
                     </a:stretch>
@@ -26656,7 +27720,7 @@
       <w:r>
         <w:rPr/>
         <w:drawing>
-          <wp:anchor behindDoc="0" distT="0" distB="0" distL="0" distR="0" simplePos="0" locked="0" layoutInCell="0" allowOverlap="1" relativeHeight="42">
+          <wp:anchor behindDoc="0" distT="0" distB="0" distL="0" distR="0" simplePos="0" locked="0" layoutInCell="0" allowOverlap="1" relativeHeight="41">
             <wp:simplePos x="0" y="0"/>
             <wp:positionH relativeFrom="column">
               <wp:align>center</wp:align>
@@ -26667,7 +27731,7 @@
             <wp:extent cx="6203950" cy="6895465"/>
             <wp:effectExtent l="0" t="0" r="0" b="0"/>
             <wp:wrapSquare wrapText="largest"/>
-            <wp:docPr id="55" name="Imagen43" descr=""/>
+            <wp:docPr id="56" name="Imagen43" descr=""/>
             <wp:cNvGraphicFramePr>
               <a:graphicFrameLocks xmlns:a="http://schemas.openxmlformats.org/drawingml/2006/main" noChangeAspect="1"/>
             </wp:cNvGraphicFramePr>
@@ -26675,13 +27739,13 @@
               <a:graphicData uri="http://schemas.openxmlformats.org/drawingml/2006/picture">
                 <pic:pic xmlns:pic="http://schemas.openxmlformats.org/drawingml/2006/picture">
                   <pic:nvPicPr>
-                    <pic:cNvPr id="55" name="Imagen43" descr=""/>
+                    <pic:cNvPr id="56" name="Imagen43" descr=""/>
                     <pic:cNvPicPr>
                       <a:picLocks noChangeAspect="1" noChangeArrowheads="1"/>
                     </pic:cNvPicPr>
                   </pic:nvPicPr>
                   <pic:blipFill>
-                    <a:blip r:embed="rId55"/>
+                    <a:blip r:embed="rId56"/>
                     <a:stretch>
                       <a:fillRect/>
                     </a:stretch>
@@ -26717,7 +27781,7 @@
       <w:bookmarkEnd w:id="81"/>
       <w:r>
         <w:drawing>
-          <wp:anchor behindDoc="0" distT="0" distB="0" distL="0" distR="0" simplePos="0" locked="0" layoutInCell="0" allowOverlap="1" relativeHeight="43">
+          <wp:anchor behindDoc="0" distT="0" distB="0" distL="0" distR="0" simplePos="0" locked="0" layoutInCell="0" allowOverlap="1" relativeHeight="42">
             <wp:simplePos x="0" y="0"/>
             <wp:positionH relativeFrom="column">
               <wp:posOffset>135255</wp:posOffset>
@@ -26728,7 +27792,7 @@
             <wp:extent cx="5269865" cy="7012305"/>
             <wp:effectExtent l="0" t="0" r="0" b="0"/>
             <wp:wrapSquare wrapText="largest"/>
-            <wp:docPr id="56" name="Imagen35" descr=""/>
+            <wp:docPr id="57" name="Imagen35" descr=""/>
             <wp:cNvGraphicFramePr>
               <a:graphicFrameLocks xmlns:a="http://schemas.openxmlformats.org/drawingml/2006/main" noChangeAspect="1"/>
             </wp:cNvGraphicFramePr>
@@ -26736,13 +27800,13 @@
               <a:graphicData uri="http://schemas.openxmlformats.org/drawingml/2006/picture">
                 <pic:pic xmlns:pic="http://schemas.openxmlformats.org/drawingml/2006/picture">
                   <pic:nvPicPr>
-                    <pic:cNvPr id="56" name="Imagen35" descr=""/>
+                    <pic:cNvPr id="57" name="Imagen35" descr=""/>
                     <pic:cNvPicPr>
                       <a:picLocks noChangeAspect="1" noChangeArrowheads="1"/>
                     </pic:cNvPicPr>
                   </pic:nvPicPr>
                   <pic:blipFill>
-                    <a:blip r:embed="rId56"/>
+                    <a:blip r:embed="rId57"/>
                     <a:stretch>
                       <a:fillRect/>
                     </a:stretch>
@@ -26987,7 +28051,7 @@
       <w:r>
         <w:rPr/>
         <w:drawing>
-          <wp:anchor behindDoc="0" distT="0" distB="0" distL="0" distR="0" simplePos="0" locked="0" layoutInCell="0" allowOverlap="1" relativeHeight="44">
+          <wp:anchor behindDoc="0" distT="0" distB="0" distL="0" distR="0" simplePos="0" locked="0" layoutInCell="0" allowOverlap="1" relativeHeight="43">
             <wp:simplePos x="0" y="0"/>
             <wp:positionH relativeFrom="column">
               <wp:align>center</wp:align>
@@ -26998,7 +28062,7 @@
             <wp:extent cx="5760085" cy="3094990"/>
             <wp:effectExtent l="0" t="0" r="0" b="0"/>
             <wp:wrapSquare wrapText="largest"/>
-            <wp:docPr id="57" name="Imagen36" descr=""/>
+            <wp:docPr id="58" name="Imagen36" descr=""/>
             <wp:cNvGraphicFramePr>
               <a:graphicFrameLocks xmlns:a="http://schemas.openxmlformats.org/drawingml/2006/main" noChangeAspect="1"/>
             </wp:cNvGraphicFramePr>
@@ -27006,13 +28070,13 @@
               <a:graphicData uri="http://schemas.openxmlformats.org/drawingml/2006/picture">
                 <pic:pic xmlns:pic="http://schemas.openxmlformats.org/drawingml/2006/picture">
                   <pic:nvPicPr>
-                    <pic:cNvPr id="57" name="Imagen36" descr=""/>
+                    <pic:cNvPr id="58" name="Imagen36" descr=""/>
                     <pic:cNvPicPr>
                       <a:picLocks noChangeAspect="1" noChangeArrowheads="1"/>
                     </pic:cNvPicPr>
                   </pic:nvPicPr>
                   <pic:blipFill>
-                    <a:blip r:embed="rId57"/>
+                    <a:blip r:embed="rId58"/>
                     <a:stretch>
                       <a:fillRect/>
                     </a:stretch>
@@ -27044,7 +28108,7 @@
       </w:pPr>
       <w:r>
         <w:drawing>
-          <wp:anchor behindDoc="0" distT="0" distB="0" distL="0" distR="0" simplePos="0" locked="0" layoutInCell="0" allowOverlap="1" relativeHeight="45">
+          <wp:anchor behindDoc="0" distT="0" distB="0" distL="0" distR="0" simplePos="0" locked="0" layoutInCell="0" allowOverlap="1" relativeHeight="44">
             <wp:simplePos x="0" y="0"/>
             <wp:positionH relativeFrom="column">
               <wp:align>center</wp:align>
@@ -27055,7 +28119,7 @@
             <wp:extent cx="4393565" cy="4315460"/>
             <wp:effectExtent l="0" t="0" r="0" b="0"/>
             <wp:wrapSquare wrapText="largest"/>
-            <wp:docPr id="58" name="Imagen37" descr=""/>
+            <wp:docPr id="59" name="Imagen37" descr=""/>
             <wp:cNvGraphicFramePr>
               <a:graphicFrameLocks xmlns:a="http://schemas.openxmlformats.org/drawingml/2006/main" noChangeAspect="1"/>
             </wp:cNvGraphicFramePr>
@@ -27063,13 +28127,13 @@
               <a:graphicData uri="http://schemas.openxmlformats.org/drawingml/2006/picture">
                 <pic:pic xmlns:pic="http://schemas.openxmlformats.org/drawingml/2006/picture">
                   <pic:nvPicPr>
-                    <pic:cNvPr id="58" name="Imagen37" descr=""/>
+                    <pic:cNvPr id="59" name="Imagen37" descr=""/>
                     <pic:cNvPicPr>
                       <a:picLocks noChangeAspect="1" noChangeArrowheads="1"/>
                     </pic:cNvPicPr>
                   </pic:nvPicPr>
                   <pic:blipFill>
-                    <a:blip r:embed="rId58"/>
+                    <a:blip r:embed="rId59"/>
                     <a:stretch>
                       <a:fillRect/>
                     </a:stretch>
@@ -27288,7 +28352,7 @@
       <w:r>
         <w:rPr/>
         <w:drawing>
-          <wp:anchor behindDoc="0" distT="0" distB="0" distL="0" distR="0" simplePos="0" locked="0" layoutInCell="0" allowOverlap="1" relativeHeight="61">
+          <wp:anchor behindDoc="0" distT="0" distB="0" distL="0" distR="0" simplePos="0" locked="0" layoutInCell="0" allowOverlap="1" relativeHeight="58">
             <wp:simplePos x="0" y="0"/>
             <wp:positionH relativeFrom="column">
               <wp:align>center</wp:align>
@@ -27299,7 +28363,7 @@
             <wp:extent cx="5760085" cy="4953635"/>
             <wp:effectExtent l="0" t="0" r="0" b="0"/>
             <wp:wrapSquare wrapText="largest"/>
-            <wp:docPr id="59" name="Imagen55" descr=""/>
+            <wp:docPr id="60" name="Imagen55" descr=""/>
             <wp:cNvGraphicFramePr>
               <a:graphicFrameLocks xmlns:a="http://schemas.openxmlformats.org/drawingml/2006/main" noChangeAspect="1"/>
             </wp:cNvGraphicFramePr>
@@ -27307,13 +28371,13 @@
               <a:graphicData uri="http://schemas.openxmlformats.org/drawingml/2006/picture">
                 <pic:pic xmlns:pic="http://schemas.openxmlformats.org/drawingml/2006/picture">
                   <pic:nvPicPr>
-                    <pic:cNvPr id="59" name="Imagen55" descr=""/>
+                    <pic:cNvPr id="60" name="Imagen55" descr=""/>
                     <pic:cNvPicPr>
                       <a:picLocks noChangeAspect="1" noChangeArrowheads="1"/>
                     </pic:cNvPicPr>
                   </pic:nvPicPr>
                   <pic:blipFill>
-                    <a:blip r:embed="rId59"/>
+                    <a:blip r:embed="rId60"/>
                     <a:stretch>
                       <a:fillRect/>
                     </a:stretch>
@@ -27335,12 +28399,12 @@
       </w:r>
     </w:p>
     <w:sectPr>
-      <w:headerReference w:type="even" r:id="rId60"/>
-      <w:headerReference w:type="default" r:id="rId61"/>
-      <w:headerReference w:type="first" r:id="rId62"/>
-      <w:footerReference w:type="even" r:id="rId63"/>
-      <w:footerReference w:type="default" r:id="rId64"/>
-      <w:footerReference w:type="first" r:id="rId65"/>
+      <w:headerReference w:type="even" r:id="rId61"/>
+      <w:headerReference w:type="default" r:id="rId62"/>
+      <w:headerReference w:type="first" r:id="rId63"/>
+      <w:footerReference w:type="even" r:id="rId64"/>
+      <w:footerReference w:type="default" r:id="rId65"/>
+      <w:footerReference w:type="first" r:id="rId66"/>
       <w:type w:val="nextPage"/>
       <w:pgSz w:w="11906" w:h="16838"/>
       <w:pgMar w:left="1701" w:right="1134" w:gutter="0" w:header="709" w:top="2268" w:footer="709" w:bottom="851"/>
@@ -27436,7 +28500,7 @@
         </w:r>
         <w:r>
           <w:rPr/>
-          <w:t>1</w:t>
+          <w:t>10</w:t>
         </w:r>
         <w:r>
           <w:rPr/>
@@ -27488,7 +28552,7 @@
         </w:r>
         <w:r>
           <w:rPr/>
-          <w:t>1</w:t>
+          <w:t>10</w:t>
         </w:r>
         <w:r>
           <w:rPr/>
@@ -27545,8 +28609,8 @@
       <w:gridCol w:w="1674"/>
       <w:gridCol w:w="1615"/>
       <w:gridCol w:w="1528"/>
-      <w:gridCol w:w="1565"/>
-      <w:gridCol w:w="1562"/>
+      <w:gridCol w:w="1566"/>
+      <w:gridCol w:w="1561"/>
     </w:tblGrid>
     <w:tr>
       <w:trPr>
@@ -27579,7 +28643,7 @@
       </w:tc>
       <w:tc>
         <w:tcPr>
-          <w:tcW w:w="6382" w:type="dxa"/>
+          <w:tcW w:w="6383" w:type="dxa"/>
           <w:gridSpan w:val="4"/>
           <w:tcBorders/>
         </w:tcPr>
@@ -27606,7 +28670,7 @@
       </w:tc>
       <w:tc>
         <w:tcPr>
-          <w:tcW w:w="1562" w:type="dxa"/>
+          <w:tcW w:w="1561" w:type="dxa"/>
           <w:tcBorders/>
         </w:tcPr>
         <w:p>
@@ -27677,7 +28741,7 @@
               <wp:inline distT="0" distB="0" distL="0" distR="0">
                 <wp:extent cx="929005" cy="929005"/>
                 <wp:effectExtent l="0" t="0" r="0" b="0"/>
-                <wp:docPr id="60" name="Imagen38" descr="Socios institucionales"/>
+                <wp:docPr id="61" name="Imagen38" descr="Socios institucionales"/>
                 <wp:cNvGraphicFramePr>
                   <a:graphicFrameLocks xmlns:a="http://schemas.openxmlformats.org/drawingml/2006/main" noChangeAspect="1"/>
                 </wp:cNvGraphicFramePr>
@@ -27685,7 +28749,7 @@
                   <a:graphicData uri="http://schemas.openxmlformats.org/drawingml/2006/picture">
                     <pic:pic xmlns:pic="http://schemas.openxmlformats.org/drawingml/2006/picture">
                       <pic:nvPicPr>
-                        <pic:cNvPr id="60" name="Imagen38" descr="Socios institucionales"/>
+                        <pic:cNvPr id="61" name="Imagen38" descr="Socios institucionales"/>
                         <pic:cNvPicPr>
                           <a:picLocks noChangeAspect="1" noChangeArrowheads="1"/>
                         </pic:cNvPicPr>
@@ -27742,7 +28806,7 @@
       </w:tc>
       <w:tc>
         <w:tcPr>
-          <w:tcW w:w="3093" w:type="dxa"/>
+          <w:tcW w:w="3094" w:type="dxa"/>
           <w:gridSpan w:val="2"/>
           <w:tcBorders/>
         </w:tcPr>
@@ -27769,7 +28833,7 @@
       </w:tc>
       <w:tc>
         <w:tcPr>
-          <w:tcW w:w="1562" w:type="dxa"/>
+          <w:tcW w:w="1561" w:type="dxa"/>
           <w:vMerge w:val="restart"/>
           <w:tcBorders/>
         </w:tcPr>
@@ -27931,7 +28995,7 @@
       </w:tc>
       <w:tc>
         <w:tcPr>
-          <w:tcW w:w="1565" w:type="dxa"/>
+          <w:tcW w:w="1566" w:type="dxa"/>
           <w:tcBorders/>
         </w:tcPr>
         <w:p>
@@ -27957,7 +29021,7 @@
       </w:tc>
       <w:tc>
         <w:tcPr>
-          <w:tcW w:w="1562" w:type="dxa"/>
+          <w:tcW w:w="1561" w:type="dxa"/>
           <w:vMerge w:val="continue"/>
           <w:tcBorders/>
         </w:tcPr>
@@ -28092,7 +29156,7 @@
       </w:tc>
       <w:tc>
         <w:tcPr>
-          <w:tcW w:w="1565" w:type="dxa"/>
+          <w:tcW w:w="1566" w:type="dxa"/>
           <w:tcBorders/>
         </w:tcPr>
         <w:p>
@@ -28118,7 +29182,7 @@
       </w:tc>
       <w:tc>
         <w:tcPr>
-          <w:tcW w:w="1562" w:type="dxa"/>
+          <w:tcW w:w="1561" w:type="dxa"/>
           <w:vMerge w:val="continue"/>
           <w:tcBorders/>
         </w:tcPr>
@@ -28175,7 +29239,7 @@
       </w:tc>
       <w:tc>
         <w:tcPr>
-          <w:tcW w:w="6382" w:type="dxa"/>
+          <w:tcW w:w="6383" w:type="dxa"/>
           <w:gridSpan w:val="4"/>
           <w:tcBorders/>
         </w:tcPr>
@@ -28202,7 +29266,7 @@
       </w:tc>
       <w:tc>
         <w:tcPr>
-          <w:tcW w:w="1562" w:type="dxa"/>
+          <w:tcW w:w="1561" w:type="dxa"/>
           <w:vMerge w:val="restart"/>
           <w:tcBorders/>
         </w:tcPr>
@@ -28260,7 +29324,7 @@
       </w:tc>
       <w:tc>
         <w:tcPr>
-          <w:tcW w:w="6382" w:type="dxa"/>
+          <w:tcW w:w="6383" w:type="dxa"/>
           <w:gridSpan w:val="4"/>
           <w:tcBorders/>
         </w:tcPr>
@@ -28287,7 +29351,7 @@
       </w:tc>
       <w:tc>
         <w:tcPr>
-          <w:tcW w:w="1562" w:type="dxa"/>
+          <w:tcW w:w="1561" w:type="dxa"/>
           <w:vMerge w:val="continue"/>
           <w:tcBorders/>
         </w:tcPr>
@@ -28347,8 +29411,8 @@
       <w:gridCol w:w="1674"/>
       <w:gridCol w:w="1615"/>
       <w:gridCol w:w="1528"/>
-      <w:gridCol w:w="1565"/>
-      <w:gridCol w:w="1562"/>
+      <w:gridCol w:w="1566"/>
+      <w:gridCol w:w="1561"/>
     </w:tblGrid>
     <w:tr>
       <w:trPr>
@@ -28381,7 +29445,7 @@
       </w:tc>
       <w:tc>
         <w:tcPr>
-          <w:tcW w:w="6382" w:type="dxa"/>
+          <w:tcW w:w="6383" w:type="dxa"/>
           <w:gridSpan w:val="4"/>
           <w:tcBorders/>
         </w:tcPr>
@@ -28408,7 +29472,7 @@
       </w:tc>
       <w:tc>
         <w:tcPr>
-          <w:tcW w:w="1562" w:type="dxa"/>
+          <w:tcW w:w="1561" w:type="dxa"/>
           <w:tcBorders/>
         </w:tcPr>
         <w:p>
@@ -28479,7 +29543,7 @@
               <wp:inline distT="0" distB="0" distL="0" distR="0">
                 <wp:extent cx="929005" cy="929005"/>
                 <wp:effectExtent l="0" t="0" r="0" b="0"/>
-                <wp:docPr id="61" name="Imagen38" descr="Socios institucionales"/>
+                <wp:docPr id="62" name="Imagen38" descr="Socios institucionales"/>
                 <wp:cNvGraphicFramePr>
                   <a:graphicFrameLocks xmlns:a="http://schemas.openxmlformats.org/drawingml/2006/main" noChangeAspect="1"/>
                 </wp:cNvGraphicFramePr>
@@ -28487,7 +29551,7 @@
                   <a:graphicData uri="http://schemas.openxmlformats.org/drawingml/2006/picture">
                     <pic:pic xmlns:pic="http://schemas.openxmlformats.org/drawingml/2006/picture">
                       <pic:nvPicPr>
-                        <pic:cNvPr id="61" name="Imagen38" descr="Socios institucionales"/>
+                        <pic:cNvPr id="62" name="Imagen38" descr="Socios institucionales"/>
                         <pic:cNvPicPr>
                           <a:picLocks noChangeAspect="1" noChangeArrowheads="1"/>
                         </pic:cNvPicPr>
@@ -28544,7 +29608,7 @@
       </w:tc>
       <w:tc>
         <w:tcPr>
-          <w:tcW w:w="3093" w:type="dxa"/>
+          <w:tcW w:w="3094" w:type="dxa"/>
           <w:gridSpan w:val="2"/>
           <w:tcBorders/>
         </w:tcPr>
@@ -28571,7 +29635,7 @@
       </w:tc>
       <w:tc>
         <w:tcPr>
-          <w:tcW w:w="1562" w:type="dxa"/>
+          <w:tcW w:w="1561" w:type="dxa"/>
           <w:vMerge w:val="restart"/>
           <w:tcBorders/>
         </w:tcPr>
@@ -28733,7 +29797,7 @@
       </w:tc>
       <w:tc>
         <w:tcPr>
-          <w:tcW w:w="1565" w:type="dxa"/>
+          <w:tcW w:w="1566" w:type="dxa"/>
           <w:tcBorders/>
         </w:tcPr>
         <w:p>
@@ -28759,7 +29823,7 @@
       </w:tc>
       <w:tc>
         <w:tcPr>
-          <w:tcW w:w="1562" w:type="dxa"/>
+          <w:tcW w:w="1561" w:type="dxa"/>
           <w:vMerge w:val="continue"/>
           <w:tcBorders/>
         </w:tcPr>
@@ -28894,7 +29958,7 @@
       </w:tc>
       <w:tc>
         <w:tcPr>
-          <w:tcW w:w="1565" w:type="dxa"/>
+          <w:tcW w:w="1566" w:type="dxa"/>
           <w:tcBorders/>
         </w:tcPr>
         <w:p>
@@ -28920,7 +29984,7 @@
       </w:tc>
       <w:tc>
         <w:tcPr>
-          <w:tcW w:w="1562" w:type="dxa"/>
+          <w:tcW w:w="1561" w:type="dxa"/>
           <w:vMerge w:val="continue"/>
           <w:tcBorders/>
         </w:tcPr>
@@ -28977,7 +30041,7 @@
       </w:tc>
       <w:tc>
         <w:tcPr>
-          <w:tcW w:w="6382" w:type="dxa"/>
+          <w:tcW w:w="6383" w:type="dxa"/>
           <w:gridSpan w:val="4"/>
           <w:tcBorders/>
         </w:tcPr>
@@ -29004,7 +30068,7 @@
       </w:tc>
       <w:tc>
         <w:tcPr>
-          <w:tcW w:w="1562" w:type="dxa"/>
+          <w:tcW w:w="1561" w:type="dxa"/>
           <w:vMerge w:val="restart"/>
           <w:tcBorders/>
         </w:tcPr>
@@ -29062,7 +30126,7 @@
       </w:tc>
       <w:tc>
         <w:tcPr>
-          <w:tcW w:w="6382" w:type="dxa"/>
+          <w:tcW w:w="6383" w:type="dxa"/>
           <w:gridSpan w:val="4"/>
           <w:tcBorders/>
         </w:tcPr>
@@ -29089,7 +30153,7 @@
       </w:tc>
       <w:tc>
         <w:tcPr>
-          <w:tcW w:w="1562" w:type="dxa"/>
+          <w:tcW w:w="1561" w:type="dxa"/>
           <w:vMerge w:val="continue"/>
           <w:tcBorders/>
         </w:tcPr>
@@ -29696,7 +30760,7 @@
     <w:lvl w:ilvl="1">
       <w:start w:val="1"/>
       <w:numFmt w:val="decimal"/>
-      <w:lvlText w:val="%1.%2"/>
+      <w:lvlText w:val="%1.%2."/>
       <w:lvlJc w:val="left"/>
       <w:pPr>
         <w:tabs>
@@ -29704,9 +30768,7 @@
         </w:tabs>
         <w:ind w:left="360" w:hanging="360"/>
       </w:pPr>
-      <w:rPr>
-        <w:sz w:val="20"/>
-      </w:rPr>
+      <w:rPr/>
     </w:lvl>
     <w:lvl w:ilvl="2">
       <w:start w:val="1"/>
@@ -38459,6 +39521,125 @@
     </w:lvl>
   </w:abstractNum>
   <w:abstractNum w:abstractNumId="78">
+    <w:lvl w:ilvl="0">
+      <w:start w:val="1"/>
+      <w:numFmt w:val="decimal"/>
+      <w:lvlText w:val="%1."/>
+      <w:lvlJc w:val="left"/>
+      <w:pPr>
+        <w:tabs>
+          <w:tab w:val="num" w:pos="709"/>
+        </w:tabs>
+        <w:ind w:left="709" w:hanging="283"/>
+      </w:pPr>
+      <w:rPr/>
+    </w:lvl>
+    <w:lvl w:ilvl="1">
+      <w:start w:val="1"/>
+      <w:numFmt w:val="decimal"/>
+      <w:lvlText w:val="%2."/>
+      <w:lvlJc w:val="left"/>
+      <w:pPr>
+        <w:tabs>
+          <w:tab w:val="num" w:pos="1418"/>
+        </w:tabs>
+        <w:ind w:left="1418" w:hanging="283"/>
+      </w:pPr>
+      <w:rPr/>
+    </w:lvl>
+    <w:lvl w:ilvl="2">
+      <w:start w:val="1"/>
+      <w:numFmt w:val="decimal"/>
+      <w:lvlText w:val="%3."/>
+      <w:lvlJc w:val="left"/>
+      <w:pPr>
+        <w:tabs>
+          <w:tab w:val="num" w:pos="2127"/>
+        </w:tabs>
+        <w:ind w:left="2127" w:hanging="283"/>
+      </w:pPr>
+      <w:rPr/>
+    </w:lvl>
+    <w:lvl w:ilvl="3">
+      <w:start w:val="1"/>
+      <w:numFmt w:val="decimal"/>
+      <w:lvlText w:val="%4."/>
+      <w:lvlJc w:val="left"/>
+      <w:pPr>
+        <w:tabs>
+          <w:tab w:val="num" w:pos="2836"/>
+        </w:tabs>
+        <w:ind w:left="2836" w:hanging="283"/>
+      </w:pPr>
+      <w:rPr/>
+    </w:lvl>
+    <w:lvl w:ilvl="4">
+      <w:start w:val="1"/>
+      <w:numFmt w:val="decimal"/>
+      <w:lvlText w:val="%5."/>
+      <w:lvlJc w:val="left"/>
+      <w:pPr>
+        <w:tabs>
+          <w:tab w:val="num" w:pos="3545"/>
+        </w:tabs>
+        <w:ind w:left="3545" w:hanging="283"/>
+      </w:pPr>
+      <w:rPr/>
+    </w:lvl>
+    <w:lvl w:ilvl="5">
+      <w:start w:val="1"/>
+      <w:numFmt w:val="decimal"/>
+      <w:lvlText w:val="%6."/>
+      <w:lvlJc w:val="left"/>
+      <w:pPr>
+        <w:tabs>
+          <w:tab w:val="num" w:pos="4254"/>
+        </w:tabs>
+        <w:ind w:left="4254" w:hanging="283"/>
+      </w:pPr>
+      <w:rPr/>
+    </w:lvl>
+    <w:lvl w:ilvl="6">
+      <w:start w:val="1"/>
+      <w:numFmt w:val="decimal"/>
+      <w:lvlText w:val="%7."/>
+      <w:lvlJc w:val="left"/>
+      <w:pPr>
+        <w:tabs>
+          <w:tab w:val="num" w:pos="4963"/>
+        </w:tabs>
+        <w:ind w:left="4963" w:hanging="283"/>
+      </w:pPr>
+      <w:rPr/>
+    </w:lvl>
+    <w:lvl w:ilvl="7">
+      <w:start w:val="1"/>
+      <w:numFmt w:val="decimal"/>
+      <w:lvlText w:val="%8."/>
+      <w:lvlJc w:val="left"/>
+      <w:pPr>
+        <w:tabs>
+          <w:tab w:val="num" w:pos="5672"/>
+        </w:tabs>
+        <w:ind w:left="5672" w:hanging="283"/>
+      </w:pPr>
+      <w:rPr/>
+    </w:lvl>
+    <w:lvl w:ilvl="8">
+      <w:start w:val="1"/>
+      <w:numFmt w:val="decimal"/>
+      <w:lvlText w:val="%9."/>
+      <w:lvlJc w:val="left"/>
+      <w:pPr>
+        <w:tabs>
+          <w:tab w:val="num" w:pos="6381"/>
+        </w:tabs>
+        <w:ind w:left="6381" w:hanging="283"/>
+      </w:pPr>
+      <w:rPr/>
+    </w:lvl>
+  </w:abstractNum>
+  <w:abstractNum w:abstractNumId="79">
     <w:lvl w:ilvl="0">
       <w:start w:val="1"/>
       <w:numFmt w:val="none"/>
@@ -38812,13 +39993,13 @@
     <w:abstractNumId w:val="78"/>
   </w:num>
   <w:num w:numId="79">
+    <w:abstractNumId w:val="79"/>
+  </w:num>
+  <w:num w:numId="80">
     <w:abstractNumId w:val="13"/>
     <w:lvlOverride w:ilvl="0">
       <w:startOverride w:val="1"/>
     </w:lvlOverride>
-  </w:num>
-  <w:num w:numId="80">
-    <w:abstractNumId w:val="13"/>
   </w:num>
   <w:num w:numId="81">
     <w:abstractNumId w:val="13"/>
@@ -38830,13 +40011,13 @@
     <w:abstractNumId w:val="13"/>
   </w:num>
   <w:num w:numId="84">
+    <w:abstractNumId w:val="13"/>
+  </w:num>
+  <w:num w:numId="85">
     <w:abstractNumId w:val="18"/>
     <w:lvlOverride w:ilvl="0">
       <w:startOverride w:val="1"/>
     </w:lvlOverride>
-  </w:num>
-  <w:num w:numId="85">
-    <w:abstractNumId w:val="18"/>
   </w:num>
   <w:num w:numId="86">
     <w:abstractNumId w:val="18"/>
@@ -38845,13 +40026,13 @@
     <w:abstractNumId w:val="18"/>
   </w:num>
   <w:num w:numId="88">
+    <w:abstractNumId w:val="18"/>
+  </w:num>
+  <w:num w:numId="89">
     <w:abstractNumId w:val="22"/>
     <w:lvlOverride w:ilvl="0">
       <w:startOverride w:val="1"/>
     </w:lvlOverride>
-  </w:num>
-  <w:num w:numId="89">
-    <w:abstractNumId w:val="22"/>
   </w:num>
   <w:num w:numId="90">
     <w:abstractNumId w:val="22"/>
@@ -38860,25 +40041,25 @@
     <w:abstractNumId w:val="22"/>
   </w:num>
   <w:num w:numId="92">
+    <w:abstractNumId w:val="22"/>
+  </w:num>
+  <w:num w:numId="93">
     <w:abstractNumId w:val="26"/>
     <w:lvlOverride w:ilvl="0">
       <w:startOverride w:val="1"/>
     </w:lvlOverride>
   </w:num>
-  <w:num w:numId="93">
-    <w:abstractNumId w:val="26"/>
-  </w:num>
   <w:num w:numId="94">
     <w:abstractNumId w:val="26"/>
   </w:num>
   <w:num w:numId="95">
+    <w:abstractNumId w:val="26"/>
+  </w:num>
+  <w:num w:numId="96">
     <w:abstractNumId w:val="29"/>
     <w:lvlOverride w:ilvl="0">
       <w:startOverride w:val="1"/>
     </w:lvlOverride>
-  </w:num>
-  <w:num w:numId="96">
-    <w:abstractNumId w:val="29"/>
   </w:num>
   <w:num w:numId="97">
     <w:abstractNumId w:val="29"/>
@@ -38887,13 +40068,13 @@
     <w:abstractNumId w:val="29"/>
   </w:num>
   <w:num w:numId="99">
+    <w:abstractNumId w:val="29"/>
+  </w:num>
+  <w:num w:numId="100">
     <w:abstractNumId w:val="33"/>
     <w:lvlOverride w:ilvl="0">
       <w:startOverride w:val="1"/>
     </w:lvlOverride>
-  </w:num>
-  <w:num w:numId="100">
-    <w:abstractNumId w:val="33"/>
   </w:num>
   <w:num w:numId="101">
     <w:abstractNumId w:val="33"/>
@@ -38902,13 +40083,13 @@
     <w:abstractNumId w:val="33"/>
   </w:num>
   <w:num w:numId="103">
+    <w:abstractNumId w:val="33"/>
+  </w:num>
+  <w:num w:numId="104">
     <w:abstractNumId w:val="37"/>
     <w:lvlOverride w:ilvl="0">
       <w:startOverride w:val="1"/>
     </w:lvlOverride>
-  </w:num>
-  <w:num w:numId="104">
-    <w:abstractNumId w:val="37"/>
   </w:num>
   <w:num w:numId="105">
     <w:abstractNumId w:val="37"/>
@@ -38917,13 +40098,13 @@
     <w:abstractNumId w:val="37"/>
   </w:num>
   <w:num w:numId="107">
+    <w:abstractNumId w:val="37"/>
+  </w:num>
+  <w:num w:numId="108">
     <w:abstractNumId w:val="41"/>
     <w:lvlOverride w:ilvl="0">
       <w:startOverride w:val="1"/>
     </w:lvlOverride>
-  </w:num>
-  <w:num w:numId="108">
-    <w:abstractNumId w:val="41"/>
   </w:num>
   <w:num w:numId="109">
     <w:abstractNumId w:val="41"/>
@@ -38932,25 +40113,25 @@
     <w:abstractNumId w:val="41"/>
   </w:num>
   <w:num w:numId="111">
+    <w:abstractNumId w:val="41"/>
+  </w:num>
+  <w:num w:numId="112">
     <w:abstractNumId w:val="45"/>
     <w:lvlOverride w:ilvl="0">
       <w:startOverride w:val="1"/>
     </w:lvlOverride>
   </w:num>
-  <w:num w:numId="112">
-    <w:abstractNumId w:val="45"/>
-  </w:num>
   <w:num w:numId="113">
     <w:abstractNumId w:val="45"/>
   </w:num>
   <w:num w:numId="114">
+    <w:abstractNumId w:val="45"/>
+  </w:num>
+  <w:num w:numId="115">
     <w:abstractNumId w:val="48"/>
     <w:lvlOverride w:ilvl="0">
       <w:startOverride w:val="1"/>
     </w:lvlOverride>
-  </w:num>
-  <w:num w:numId="115">
-    <w:abstractNumId w:val="48"/>
   </w:num>
   <w:num w:numId="116">
     <w:abstractNumId w:val="48"/>
@@ -38962,13 +40143,13 @@
     <w:abstractNumId w:val="48"/>
   </w:num>
   <w:num w:numId="119">
+    <w:abstractNumId w:val="48"/>
+  </w:num>
+  <w:num w:numId="120">
     <w:abstractNumId w:val="53"/>
     <w:lvlOverride w:ilvl="0">
       <w:startOverride w:val="1"/>
     </w:lvlOverride>
-  </w:num>
-  <w:num w:numId="120">
-    <w:abstractNumId w:val="53"/>
   </w:num>
   <w:num w:numId="121">
     <w:abstractNumId w:val="53"/>
@@ -38977,13 +40158,13 @@
     <w:abstractNumId w:val="53"/>
   </w:num>
   <w:num w:numId="123">
+    <w:abstractNumId w:val="53"/>
+  </w:num>
+  <w:num w:numId="124">
     <w:abstractNumId w:val="57"/>
     <w:lvlOverride w:ilvl="0">
       <w:startOverride w:val="1"/>
     </w:lvlOverride>
-  </w:num>
-  <w:num w:numId="124">
-    <w:abstractNumId w:val="53"/>
   </w:num>
   <w:num w:numId="125">
     <w:abstractNumId w:val="53"/>
@@ -38992,13 +40173,13 @@
     <w:abstractNumId w:val="53"/>
   </w:num>
   <w:num w:numId="127">
-    <w:abstractNumId w:val="57"/>
+    <w:abstractNumId w:val="53"/>
   </w:num>
   <w:num w:numId="128">
     <w:abstractNumId w:val="57"/>
   </w:num>
   <w:num w:numId="129">
-    <w:abstractNumId w:val="53"/>
+    <w:abstractNumId w:val="57"/>
   </w:num>
   <w:num w:numId="130">
     <w:abstractNumId w:val="53"/>
@@ -39007,10 +40188,10 @@
     <w:abstractNumId w:val="53"/>
   </w:num>
   <w:num w:numId="132">
-    <w:abstractNumId w:val="57"/>
+    <w:abstractNumId w:val="53"/>
   </w:num>
   <w:num w:numId="133">
-    <w:abstractNumId w:val="53"/>
+    <w:abstractNumId w:val="57"/>
   </w:num>
   <w:num w:numId="134">
     <w:abstractNumId w:val="53"/>
@@ -39019,10 +40200,10 @@
     <w:abstractNumId w:val="53"/>
   </w:num>
   <w:num w:numId="136">
-    <w:abstractNumId w:val="57"/>
+    <w:abstractNumId w:val="53"/>
   </w:num>
   <w:num w:numId="137">
-    <w:abstractNumId w:val="53"/>
+    <w:abstractNumId w:val="57"/>
   </w:num>
   <w:num w:numId="138">
     <w:abstractNumId w:val="53"/>
@@ -39031,15 +40212,18 @@
     <w:abstractNumId w:val="53"/>
   </w:num>
   <w:num w:numId="140">
-    <w:abstractNumId w:val="57"/>
+    <w:abstractNumId w:val="53"/>
   </w:num>
   <w:num w:numId="141">
-    <w:abstractNumId w:val="53"/>
+    <w:abstractNumId w:val="57"/>
   </w:num>
   <w:num w:numId="142">
     <w:abstractNumId w:val="53"/>
   </w:num>
   <w:num w:numId="143">
+    <w:abstractNumId w:val="53"/>
+  </w:num>
+  <w:num w:numId="144">
     <w:abstractNumId w:val="53"/>
   </w:num>
 </w:numbering>
@@ -39905,6 +41089,21 @@
     <w:qFormat/>
     <w:rPr/>
   </w:style>
+  <w:style w:type="character" w:styleId="Strong">
+    <w:name w:val="Strong"/>
+    <w:qFormat/>
+    <w:rPr>
+      <w:b/>
+      <w:bCs/>
+    </w:rPr>
+  </w:style>
+  <w:style w:type="character" w:styleId="Textooriginal">
+    <w:name w:val="Texto original"/>
+    <w:qFormat/>
+    <w:rPr>
+      <w:rFonts w:ascii="Liberation Mono" w:hAnsi="Liberation Mono" w:eastAsia="Liberation Mono" w:cs="Liberation Mono"/>
+    </w:rPr>
+  </w:style>
   <w:style w:type="paragraph" w:styleId="Ttulo">
     <w:name w:val="Título"/>
     <w:basedOn w:val="Normal"/>

</xml_diff>